<commit_message>
ADDING TODAY'S WORK - 04.09.2026
</commit_message>
<xml_diff>
--- a/viva/questions/viva_questions_DRAFT_1.docx
+++ b/viva/questions/viva_questions_DRAFT_1.docx
@@ -75,6 +75,31 @@
     </w:p>
     <w:p>
       <w:pPr>
+        <w:pStyle w:val="ListParagraph"/>
+        <w:numPr>
+          <w:ilvl w:val="0"/>
+          <w:numId w:val="1"/>
+        </w:numPr>
+      </w:pPr>
+      <w:r>
+        <w:t xml:space="preserve">Link to flashcards: </w:t>
+      </w:r>
+      <w:hyperlink r:id="rId5" w:history="1">
+        <w:r>
+          <w:rPr>
+            <w:rStyle w:val="Hyperlink"/>
+          </w:rPr>
+          <w:t>https://quizlet.com/gb/1204758854/flash-cards/?funnelUUID=1f42739b-d711-4db8-abe3-6a24cd826999</w:t>
+        </w:r>
+      </w:hyperlink>
+    </w:p>
+    <w:p>
+      <w:pPr>
+        <w:pStyle w:val="ListParagraph"/>
+      </w:pPr>
+    </w:p>
+    <w:p>
+      <w:pPr>
         <w:pStyle w:val="Heading2"/>
       </w:pPr>
     </w:p>
@@ -305,6 +330,38 @@
         <w:t>Primary cells and transcriptomics are very expensive (£12,000), hence why Calu-3 cell line was explored.</w:t>
       </w:r>
     </w:p>
+    <w:p>
+      <w:pPr>
+        <w:pStyle w:val="ListParagraph"/>
+        <w:numPr>
+          <w:ilvl w:val="0"/>
+          <w:numId w:val="4"/>
+        </w:numPr>
+      </w:pPr>
+      <w:r>
+        <w:rPr>
+          <w:b/>
+          <w:bCs/>
+        </w:rPr>
+        <w:t>However, this could not be a direct comparison of cell types due to the different allergens tested.</w:t>
+      </w:r>
+    </w:p>
+    <w:p>
+      <w:pPr>
+        <w:pStyle w:val="ListParagraph"/>
+        <w:numPr>
+          <w:ilvl w:val="0"/>
+          <w:numId w:val="4"/>
+        </w:numPr>
+      </w:pPr>
+      <w:r>
+        <w:rPr>
+          <w:b/>
+          <w:bCs/>
+        </w:rPr>
+        <w:t>There were potentially donor effects by only having 3 primary HBBEC donors.</w:t>
+      </w:r>
+    </w:p>
     <w:p/>
     <w:p>
       <w:pPr>
@@ -389,7 +446,6 @@
         <w:rPr>
           <w:b/>
         </w:rPr>
-        <w:lastRenderedPageBreak/>
         <w:t>Furthermore, as EVs are produced more readily during inflammation, I was concerned that the control samples would not be particularly well representative.</w:t>
       </w:r>
     </w:p>
@@ -614,6 +670,71 @@
       </w:r>
     </w:p>
     <w:p>
+      <w:r>
+        <w:lastRenderedPageBreak/>
+        <w:drawing>
+          <wp:inline distT="0" distB="0" distL="0" distR="0" wp14:anchorId="3531BFC9" wp14:editId="5B5BD14E">
+            <wp:extent cx="5731510" cy="1224915"/>
+            <wp:effectExtent l="0" t="0" r="0" b="0"/>
+            <wp:docPr id="1007359198" name="Picture 1"/>
+            <wp:cNvGraphicFramePr>
+              <a:graphicFrameLocks xmlns:a="http://schemas.openxmlformats.org/drawingml/2006/main" noChangeAspect="1"/>
+            </wp:cNvGraphicFramePr>
+            <a:graphic xmlns:a="http://schemas.openxmlformats.org/drawingml/2006/main">
+              <a:graphicData uri="http://schemas.openxmlformats.org/drawingml/2006/picture">
+                <pic:pic xmlns:pic="http://schemas.openxmlformats.org/drawingml/2006/picture">
+                  <pic:nvPicPr>
+                    <pic:cNvPr id="1007359198" name=""/>
+                    <pic:cNvPicPr/>
+                  </pic:nvPicPr>
+                  <pic:blipFill>
+                    <a:blip r:embed="rId6"/>
+                    <a:stretch>
+                      <a:fillRect/>
+                    </a:stretch>
+                  </pic:blipFill>
+                  <pic:spPr>
+                    <a:xfrm>
+                      <a:off x="0" y="0"/>
+                      <a:ext cx="5731510" cy="1224915"/>
+                    </a:xfrm>
+                    <a:prstGeom prst="rect">
+                      <a:avLst/>
+                    </a:prstGeom>
+                  </pic:spPr>
+                </pic:pic>
+              </a:graphicData>
+            </a:graphic>
+          </wp:inline>
+        </w:drawing>
+      </w:r>
+      <w:r>
+        <w:t xml:space="preserve"> </w:t>
+      </w:r>
+      <w:r>
+        <w:sym w:font="Wingdings" w:char="F0E0"/>
+      </w:r>
+      <w:r>
+        <w:t xml:space="preserve"> results from 17 </w:t>
+      </w:r>
+      <w:proofErr w:type="spellStart"/>
+      <w:r>
+        <w:t>nt</w:t>
+      </w:r>
+      <w:proofErr w:type="spellEnd"/>
+      <w:r>
+        <w:t xml:space="preserve"> vs 18 </w:t>
+      </w:r>
+      <w:proofErr w:type="spellStart"/>
+      <w:r>
+        <w:t>nt</w:t>
+      </w:r>
+      <w:proofErr w:type="spellEnd"/>
+      <w:r>
+        <w:t xml:space="preserve"> </w:t>
+      </w:r>
+    </w:p>
+    <w:p>
       <w:pPr>
         <w:pStyle w:val="ListParagraph"/>
         <w:numPr>
@@ -735,7 +856,6 @@
           <w:b/>
           <w:bCs/>
         </w:rPr>
-        <w:lastRenderedPageBreak/>
         <w:t>Biggest problem for target gene-level enrichment</w:t>
       </w:r>
       <w:r>
@@ -1010,6 +1130,7 @@
         <w:ind w:left="360"/>
       </w:pPr>
       <w:r>
+        <w:lastRenderedPageBreak/>
         <w:t>Question - What your findings were</w:t>
       </w:r>
     </w:p>
@@ -1112,51 +1233,500 @@
         <w:rPr>
           <w:b/>
         </w:rPr>
+        <w:t xml:space="preserve">Low miRNA abundance in the Calu-3 dataset was verified both by </w:t>
+      </w:r>
+      <w:proofErr w:type="spellStart"/>
+      <w:r>
+        <w:rPr>
+          <w:b/>
+        </w:rPr>
+        <w:t>miRTrace</w:t>
+      </w:r>
+      <w:proofErr w:type="spellEnd"/>
+      <w:r>
+        <w:rPr>
+          <w:b/>
+        </w:rPr>
+        <w:t xml:space="preserve"> and by mapping reads to known miRNA sequences using </w:t>
+      </w:r>
+      <w:proofErr w:type="spellStart"/>
+      <w:r>
+        <w:rPr>
+          <w:b/>
+        </w:rPr>
+        <w:t>miRBase</w:t>
+      </w:r>
+      <w:proofErr w:type="spellEnd"/>
+      <w:r>
+        <w:rPr>
+          <w:b/>
+        </w:rPr>
+        <w:t>.</w:t>
+      </w:r>
+    </w:p>
+    <w:p>
+      <w:pPr>
+        <w:pStyle w:val="ListParagraph"/>
+        <w:numPr>
+          <w:ilvl w:val="0"/>
+          <w:numId w:val="8"/>
+        </w:numPr>
+      </w:pPr>
+      <w:r>
+        <w:rPr>
+          <w:b/>
+        </w:rPr>
+        <w:t>The literature search was conducted to exemplify a workaround and not to elucidate biological effect.</w:t>
+      </w:r>
+    </w:p>
+    <w:p/>
+    <w:p>
+      <w:pPr>
+        <w:pStyle w:val="ListParagraph"/>
+        <w:numPr>
+          <w:ilvl w:val="0"/>
+          <w:numId w:val="2"/>
+        </w:numPr>
+        <w:ind w:left="360"/>
+      </w:pPr>
+      <w:r>
+        <w:t>Question - What you think makes your research original</w:t>
+      </w:r>
+    </w:p>
+    <w:p>
+      <w:pPr>
+        <w:pStyle w:val="ListParagraph"/>
+        <w:numPr>
+          <w:ilvl w:val="0"/>
+          <w:numId w:val="9"/>
+        </w:numPr>
+        <w:rPr>
+          <w:b/>
+          <w:bCs/>
+        </w:rPr>
+      </w:pPr>
+      <w:r>
+        <w:rPr>
+          <w:b/>
+          <w:bCs/>
+        </w:rPr>
+        <w:t>Using open-access software</w:t>
+      </w:r>
+      <w:r>
+        <w:rPr>
+          <w:b/>
+          <w:bCs/>
+        </w:rPr>
+        <w:t>. In both the previous studies, a lot of money had been spent on performing transcriptomics therefore I wanted to see whether it could be done for free.</w:t>
+      </w:r>
+    </w:p>
+    <w:p>
+      <w:pPr>
+        <w:pStyle w:val="ListParagraph"/>
+        <w:numPr>
+          <w:ilvl w:val="0"/>
+          <w:numId w:val="9"/>
+        </w:numPr>
+        <w:rPr>
+          <w:b/>
+          <w:bCs/>
+        </w:rPr>
+      </w:pPr>
+      <w:r>
+        <w:rPr>
+          <w:b/>
+          <w:bCs/>
+        </w:rPr>
+        <w:t xml:space="preserve">I found that differential expression analysis </w:t>
+      </w:r>
+      <w:r>
+        <w:rPr>
+          <w:b/>
+          <w:bCs/>
+        </w:rPr>
+        <w:t>can,</w:t>
+      </w:r>
+      <w:r>
+        <w:rPr>
+          <w:b/>
+          <w:bCs/>
+        </w:rPr>
+        <w:t xml:space="preserve"> but pathway analysis is more challenging due to the extensive filtering options commercial platforms have.</w:t>
+      </w:r>
+    </w:p>
+    <w:p>
+      <w:pPr>
+        <w:pStyle w:val="ListParagraph"/>
+        <w:numPr>
+          <w:ilvl w:val="0"/>
+          <w:numId w:val="9"/>
+        </w:numPr>
+        <w:rPr>
+          <w:b/>
+          <w:bCs/>
+        </w:rPr>
+      </w:pPr>
+      <w:r>
+        <w:rPr>
+          <w:b/>
+          <w:bCs/>
+        </w:rPr>
+        <w:t xml:space="preserve">I then wanted to make it </w:t>
+      </w:r>
+      <w:proofErr w:type="gramStart"/>
+      <w:r>
+        <w:rPr>
+          <w:b/>
+          <w:bCs/>
+        </w:rPr>
+        <w:t>really user-friendly</w:t>
+      </w:r>
+      <w:proofErr w:type="gramEnd"/>
+      <w:r>
+        <w:rPr>
+          <w:b/>
+          <w:bCs/>
+        </w:rPr>
+        <w:t xml:space="preserve"> for non-bioinformaticians but did not implement this due to time constraints.</w:t>
+      </w:r>
+    </w:p>
+    <w:p/>
+    <w:p>
+      <w:pPr>
+        <w:pStyle w:val="ListParagraph"/>
+        <w:numPr>
+          <w:ilvl w:val="0"/>
+          <w:numId w:val="2"/>
+        </w:numPr>
+        <w:ind w:left="360"/>
+      </w:pPr>
+      <w:r>
+        <w:t>Question - Whether you have had any issues with your findings</w:t>
+      </w:r>
+    </w:p>
+    <w:p>
+      <w:pPr>
+        <w:pStyle w:val="ListParagraph"/>
+        <w:numPr>
+          <w:ilvl w:val="0"/>
+          <w:numId w:val="10"/>
+        </w:numPr>
+        <w:rPr>
+          <w:b/>
+          <w:bCs/>
+        </w:rPr>
+      </w:pPr>
+      <w:r>
+        <w:rPr>
+          <w:b/>
+          <w:bCs/>
+        </w:rPr>
+        <w:t>Can you please expand on ‘</w:t>
+      </w:r>
+      <w:proofErr w:type="gramStart"/>
+      <w:r>
+        <w:rPr>
+          <w:b/>
+          <w:bCs/>
+        </w:rPr>
+        <w:t>issues’</w:t>
+      </w:r>
+      <w:proofErr w:type="gramEnd"/>
+      <w:r>
+        <w:rPr>
+          <w:b/>
+          <w:bCs/>
+        </w:rPr>
+        <w:t>?</w:t>
+      </w:r>
+    </w:p>
+    <w:p/>
+    <w:p>
+      <w:pPr>
+        <w:pStyle w:val="ListParagraph"/>
+        <w:numPr>
+          <w:ilvl w:val="0"/>
+          <w:numId w:val="2"/>
+        </w:numPr>
+        <w:ind w:left="360"/>
+      </w:pPr>
+      <w:r>
+        <w:t>Question - Ways in which you would like to develop on your research</w:t>
+      </w:r>
+    </w:p>
+    <w:p>
+      <w:pPr>
+        <w:pStyle w:val="ListParagraph"/>
+        <w:numPr>
+          <w:ilvl w:val="0"/>
+          <w:numId w:val="10"/>
+        </w:numPr>
+      </w:pPr>
+      <w:r>
+        <w:rPr>
+          <w:b/>
+          <w:bCs/>
+        </w:rPr>
+        <w:t xml:space="preserve">It would be </w:t>
+      </w:r>
+      <w:proofErr w:type="gramStart"/>
+      <w:r>
+        <w:rPr>
+          <w:b/>
+          <w:bCs/>
+        </w:rPr>
+        <w:t>really good</w:t>
+      </w:r>
+      <w:proofErr w:type="gramEnd"/>
+      <w:r>
+        <w:rPr>
+          <w:b/>
+          <w:bCs/>
+        </w:rPr>
+        <w:t xml:space="preserve"> if I could apply context-specific filtering or matched miRNA-mRNA data to filter target gene lists.</w:t>
+      </w:r>
+    </w:p>
+    <w:p>
+      <w:pPr>
+        <w:pStyle w:val="ListParagraph"/>
+        <w:numPr>
+          <w:ilvl w:val="0"/>
+          <w:numId w:val="10"/>
+        </w:numPr>
+      </w:pPr>
+      <w:r>
+        <w:rPr>
+          <w:b/>
+          <w:bCs/>
+        </w:rPr>
         <w:lastRenderedPageBreak/>
-        <w:t xml:space="preserve">Low miRNA abundance in the Calu-3 dataset was verified both by </w:t>
+        <w:t>It would be good to take a closer look at the pathways that were identified in the primary HBECs.</w:t>
+      </w:r>
+    </w:p>
+    <w:p>
+      <w:pPr>
+        <w:pStyle w:val="ListParagraph"/>
+        <w:numPr>
+          <w:ilvl w:val="0"/>
+          <w:numId w:val="10"/>
+        </w:numPr>
+      </w:pPr>
+      <w:r>
+        <w:rPr>
+          <w:b/>
+          <w:bCs/>
+        </w:rPr>
+        <w:t xml:space="preserve">I want to perform a formal validation, comparing these results to TAmiRNA </w:t>
+      </w:r>
+      <w:proofErr w:type="gramStart"/>
+      <w:r>
+        <w:rPr>
+          <w:b/>
+          <w:bCs/>
+        </w:rPr>
+        <w:t>and also</w:t>
+      </w:r>
+      <w:proofErr w:type="gramEnd"/>
+      <w:r>
+        <w:rPr>
+          <w:b/>
+          <w:bCs/>
+        </w:rPr>
+        <w:t xml:space="preserve"> to compare against other pipelines and datasets.</w:t>
+      </w:r>
+    </w:p>
+    <w:p>
+      <w:pPr>
+        <w:pStyle w:val="ListParagraph"/>
+        <w:numPr>
+          <w:ilvl w:val="0"/>
+          <w:numId w:val="10"/>
+        </w:numPr>
+      </w:pPr>
+      <w:r>
+        <w:rPr>
+          <w:b/>
+          <w:bCs/>
+        </w:rPr>
+        <w:t xml:space="preserve">I wanted to make it very user-friendly for non-bioinformaticians, with help buttons and tutorials, and a very simple GUI. </w:t>
+      </w:r>
+    </w:p>
+    <w:p>
+      <w:pPr>
+        <w:pStyle w:val="ListParagraph"/>
+        <w:numPr>
+          <w:ilvl w:val="0"/>
+          <w:numId w:val="10"/>
+        </w:numPr>
+      </w:pPr>
+      <w:r>
+        <w:rPr>
+          <w:b/>
+          <w:bCs/>
+        </w:rPr>
+        <w:t>I wanted to create a web app that compared the results from all different permutations of parameters and forms of analyses.</w:t>
+      </w:r>
+    </w:p>
+    <w:p/>
+    <w:p>
+      <w:pPr>
+        <w:pStyle w:val="ListParagraph"/>
+        <w:numPr>
+          <w:ilvl w:val="0"/>
+          <w:numId w:val="2"/>
+        </w:numPr>
+        <w:ind w:left="360"/>
+      </w:pPr>
+      <w:r>
+        <w:t>Question - How others might use or develop your research</w:t>
+      </w:r>
+    </w:p>
+    <w:p>
+      <w:pPr>
+        <w:pStyle w:val="ListParagraph"/>
+        <w:numPr>
+          <w:ilvl w:val="0"/>
+          <w:numId w:val="11"/>
+        </w:numPr>
+      </w:pPr>
+      <w:r>
+        <w:rPr>
+          <w:b/>
+        </w:rPr>
+        <w:t>Can be used to encourage the development of an in-house transcriptomic workflow in the lab so they don’t need to rely on outsourcing.</w:t>
+      </w:r>
+    </w:p>
+    <w:p>
+      <w:pPr>
+        <w:pStyle w:val="ListParagraph"/>
+        <w:numPr>
+          <w:ilvl w:val="0"/>
+          <w:numId w:val="11"/>
+        </w:numPr>
+      </w:pPr>
+      <w:r>
+        <w:rPr>
+          <w:b/>
+        </w:rPr>
+        <w:t>It prompts the lab to review the quality control data more thoroughly as this is something that can be easily overlooked. This has already been acknowledged in the Calu-3 study.</w:t>
+      </w:r>
+    </w:p>
+    <w:p>
+      <w:pPr>
+        <w:pStyle w:val="ListParagraph"/>
+        <w:numPr>
+          <w:ilvl w:val="0"/>
+          <w:numId w:val="11"/>
+        </w:numPr>
+      </w:pPr>
+      <w:r>
+        <w:rPr>
+          <w:b/>
+        </w:rPr>
+        <w:t>It is a cautionary tale that reenforces the importance of experimental design and shows that transcriptomics on improper data can be a waste of money and can lead to spurious results.</w:t>
+      </w:r>
+    </w:p>
+    <w:p>
+      <w:pPr>
+        <w:pStyle w:val="ListParagraph"/>
+        <w:numPr>
+          <w:ilvl w:val="0"/>
+          <w:numId w:val="11"/>
+        </w:numPr>
+      </w:pPr>
+      <w:r>
+        <w:rPr>
+          <w:b/>
+        </w:rPr>
+        <w:t xml:space="preserve">The primary HBEC dataset provides more evidence for allergen-exposed effects on EV miRNA cargo, which is relatively </w:t>
       </w:r>
       <w:proofErr w:type="spellStart"/>
       <w:r>
         <w:rPr>
           <w:b/>
         </w:rPr>
-        <w:t>miRTrace</w:t>
+        <w:t>undertstudied</w:t>
       </w:r>
       <w:proofErr w:type="spellEnd"/>
       <w:r>
         <w:rPr>
           <w:b/>
         </w:rPr>
-        <w:t xml:space="preserve"> and by mapping reads to known miRNA sequences using </w:t>
+        <w:t>.</w:t>
+      </w:r>
+    </w:p>
+    <w:p/>
+    <w:p>
+      <w:pPr>
+        <w:pStyle w:val="Heading2"/>
+      </w:pPr>
+      <w:r>
+        <w:t>Anticipated Questions</w:t>
+      </w:r>
+    </w:p>
+    <w:p/>
+    <w:p>
+      <w:pPr>
+        <w:pStyle w:val="Heading3"/>
+      </w:pPr>
+      <w:r>
+        <w:t>Introduction</w:t>
+      </w:r>
+    </w:p>
+    <w:p>
+      <w:pPr>
+        <w:pStyle w:val="ListParagraph"/>
+        <w:numPr>
+          <w:ilvl w:val="0"/>
+          <w:numId w:val="2"/>
+        </w:numPr>
+        <w:ind w:left="360"/>
+      </w:pPr>
+      <w:r>
+        <w:t>Question - What is a miRNA?</w:t>
+      </w:r>
+    </w:p>
+    <w:p>
+      <w:pPr>
+        <w:pStyle w:val="ListParagraph"/>
+        <w:numPr>
+          <w:ilvl w:val="0"/>
+          <w:numId w:val="12"/>
+        </w:numPr>
+      </w:pPr>
+      <w:r>
+        <w:rPr>
+          <w:b/>
+        </w:rPr>
+        <w:t xml:space="preserve">Micro RNAs are short, non-coding RNAs, approximately 18–30 </w:t>
       </w:r>
       <w:proofErr w:type="spellStart"/>
       <w:r>
         <w:rPr>
           <w:b/>
         </w:rPr>
-        <w:t>miRBase</w:t>
+        <w:t>nt</w:t>
       </w:r>
       <w:proofErr w:type="spellEnd"/>
       <w:r>
         <w:rPr>
           <w:b/>
         </w:rPr>
-        <w:t>.</w:t>
-      </w:r>
-    </w:p>
-    <w:p>
-      <w:pPr>
-        <w:pStyle w:val="ListParagraph"/>
-        <w:numPr>
-          <w:ilvl w:val="0"/>
-          <w:numId w:val="8"/>
-        </w:numPr>
-      </w:pPr>
-      <w:r>
-        <w:rPr>
-          <w:b/>
-        </w:rPr>
-        <w:t>The literature search was conducted to exemplify a workaround and not to elucidate biological effect.</w:t>
+        <w:t xml:space="preserve"> long, with a modal length of 21–23 </w:t>
+      </w:r>
+      <w:proofErr w:type="spellStart"/>
+      <w:r>
+        <w:rPr>
+          <w:b/>
+        </w:rPr>
+        <w:t>nt</w:t>
+      </w:r>
+      <w:proofErr w:type="spellEnd"/>
+      <w:r>
+        <w:rPr>
+          <w:b/>
+        </w:rPr>
+        <w:t xml:space="preserve">, which bind to the 3’ UTR region of a messenger RNA and suppress its expression.  </w:t>
       </w:r>
     </w:p>
     <w:p/>
@@ -1170,400 +1740,7 @@
         <w:ind w:left="360"/>
       </w:pPr>
       <w:r>
-        <w:t>Question - What you think makes your research original</w:t>
-      </w:r>
-    </w:p>
-    <w:p>
-      <w:pPr>
-        <w:pStyle w:val="ListParagraph"/>
-        <w:numPr>
-          <w:ilvl w:val="0"/>
-          <w:numId w:val="9"/>
-        </w:numPr>
-        <w:rPr>
-          <w:b/>
-          <w:bCs/>
-        </w:rPr>
-      </w:pPr>
-      <w:r>
-        <w:rPr>
-          <w:b/>
-          <w:bCs/>
-        </w:rPr>
-        <w:t>Using open-access software</w:t>
-      </w:r>
-      <w:r>
-        <w:rPr>
-          <w:b/>
-          <w:bCs/>
-        </w:rPr>
-        <w:t>. In both the previous studies, a lot of money had been spent on performing transcriptomics therefore I wanted to see whether it could be done for free.</w:t>
-      </w:r>
-    </w:p>
-    <w:p>
-      <w:pPr>
-        <w:pStyle w:val="ListParagraph"/>
-        <w:numPr>
-          <w:ilvl w:val="0"/>
-          <w:numId w:val="9"/>
-        </w:numPr>
-        <w:rPr>
-          <w:b/>
-          <w:bCs/>
-        </w:rPr>
-      </w:pPr>
-      <w:r>
-        <w:rPr>
-          <w:b/>
-          <w:bCs/>
-        </w:rPr>
-        <w:t xml:space="preserve">I found that differential expression analysis </w:t>
-      </w:r>
-      <w:r>
-        <w:rPr>
-          <w:b/>
-          <w:bCs/>
-        </w:rPr>
-        <w:t>can,</w:t>
-      </w:r>
-      <w:r>
-        <w:rPr>
-          <w:b/>
-          <w:bCs/>
-        </w:rPr>
-        <w:t xml:space="preserve"> but pathway analysis is more challenging due to the extensive filtering options commercial platforms have.</w:t>
-      </w:r>
-    </w:p>
-    <w:p>
-      <w:pPr>
-        <w:pStyle w:val="ListParagraph"/>
-        <w:numPr>
-          <w:ilvl w:val="0"/>
-          <w:numId w:val="9"/>
-        </w:numPr>
-        <w:rPr>
-          <w:b/>
-          <w:bCs/>
-        </w:rPr>
-      </w:pPr>
-      <w:r>
-        <w:rPr>
-          <w:b/>
-          <w:bCs/>
-        </w:rPr>
-        <w:t xml:space="preserve">I then wanted to make it </w:t>
-      </w:r>
-      <w:proofErr w:type="gramStart"/>
-      <w:r>
-        <w:rPr>
-          <w:b/>
-          <w:bCs/>
-        </w:rPr>
-        <w:t>really user-friendly</w:t>
-      </w:r>
-      <w:proofErr w:type="gramEnd"/>
-      <w:r>
-        <w:rPr>
-          <w:b/>
-          <w:bCs/>
-        </w:rPr>
-        <w:t xml:space="preserve"> for non-bioinformaticians but did not implement this due to time constraints.</w:t>
-      </w:r>
-    </w:p>
-    <w:p/>
-    <w:p>
-      <w:pPr>
-        <w:pStyle w:val="ListParagraph"/>
-        <w:numPr>
-          <w:ilvl w:val="0"/>
-          <w:numId w:val="2"/>
-        </w:numPr>
-        <w:ind w:left="360"/>
-      </w:pPr>
-      <w:r>
-        <w:t>Question - Whether you have had any issues with your findings</w:t>
-      </w:r>
-    </w:p>
-    <w:p>
-      <w:pPr>
-        <w:pStyle w:val="ListParagraph"/>
-        <w:numPr>
-          <w:ilvl w:val="0"/>
-          <w:numId w:val="10"/>
-        </w:numPr>
-        <w:rPr>
-          <w:b/>
-          <w:bCs/>
-        </w:rPr>
-      </w:pPr>
-      <w:r>
-        <w:rPr>
-          <w:b/>
-          <w:bCs/>
-        </w:rPr>
-        <w:t>Can you please expand on ‘</w:t>
-      </w:r>
-      <w:proofErr w:type="gramStart"/>
-      <w:r>
-        <w:rPr>
-          <w:b/>
-          <w:bCs/>
-        </w:rPr>
-        <w:t>issues’</w:t>
-      </w:r>
-      <w:proofErr w:type="gramEnd"/>
-      <w:r>
-        <w:rPr>
-          <w:b/>
-          <w:bCs/>
-        </w:rPr>
-        <w:t>?</w:t>
-      </w:r>
-    </w:p>
-    <w:p/>
-    <w:p>
-      <w:pPr>
-        <w:pStyle w:val="ListParagraph"/>
-        <w:numPr>
-          <w:ilvl w:val="0"/>
-          <w:numId w:val="2"/>
-        </w:numPr>
-        <w:ind w:left="360"/>
-      </w:pPr>
-      <w:r>
-        <w:t>Question - Ways in which you would like to develop on your research</w:t>
-      </w:r>
-    </w:p>
-    <w:p>
-      <w:pPr>
-        <w:pStyle w:val="ListParagraph"/>
-        <w:numPr>
-          <w:ilvl w:val="0"/>
-          <w:numId w:val="10"/>
-        </w:numPr>
-      </w:pPr>
-      <w:r>
-        <w:rPr>
-          <w:b/>
-          <w:bCs/>
-        </w:rPr>
-        <w:t xml:space="preserve">It would be </w:t>
-      </w:r>
-      <w:proofErr w:type="gramStart"/>
-      <w:r>
-        <w:rPr>
-          <w:b/>
-          <w:bCs/>
-        </w:rPr>
-        <w:t>really good</w:t>
-      </w:r>
-      <w:proofErr w:type="gramEnd"/>
-      <w:r>
-        <w:rPr>
-          <w:b/>
-          <w:bCs/>
-        </w:rPr>
-        <w:t xml:space="preserve"> if I could apply context-specific filtering or matched miRNA-mRNA data to filter target gene lists.</w:t>
-      </w:r>
-    </w:p>
-    <w:p>
-      <w:pPr>
-        <w:pStyle w:val="ListParagraph"/>
-        <w:numPr>
-          <w:ilvl w:val="0"/>
-          <w:numId w:val="10"/>
-        </w:numPr>
-      </w:pPr>
-      <w:r>
-        <w:rPr>
-          <w:b/>
-          <w:bCs/>
-        </w:rPr>
-        <w:t>It would be good to take a closer look at the pathways that were identified in the primary HBECs.</w:t>
-      </w:r>
-    </w:p>
-    <w:p>
-      <w:pPr>
-        <w:pStyle w:val="ListParagraph"/>
-        <w:numPr>
-          <w:ilvl w:val="0"/>
-          <w:numId w:val="10"/>
-        </w:numPr>
-      </w:pPr>
-      <w:r>
-        <w:rPr>
-          <w:b/>
-          <w:bCs/>
-        </w:rPr>
-        <w:t xml:space="preserve">I want to perform a formal validation, comparing these results to TAmiRNA </w:t>
-      </w:r>
-      <w:proofErr w:type="gramStart"/>
-      <w:r>
-        <w:rPr>
-          <w:b/>
-          <w:bCs/>
-        </w:rPr>
-        <w:t>and also</w:t>
-      </w:r>
-      <w:proofErr w:type="gramEnd"/>
-      <w:r>
-        <w:rPr>
-          <w:b/>
-          <w:bCs/>
-        </w:rPr>
-        <w:t xml:space="preserve"> to compare against other pipelines and datasets.</w:t>
-      </w:r>
-    </w:p>
-    <w:p>
-      <w:pPr>
-        <w:pStyle w:val="ListParagraph"/>
-        <w:numPr>
-          <w:ilvl w:val="0"/>
-          <w:numId w:val="10"/>
-        </w:numPr>
-      </w:pPr>
-      <w:r>
-        <w:rPr>
-          <w:b/>
-          <w:bCs/>
-        </w:rPr>
-        <w:t xml:space="preserve">I wanted to make it very user-friendly for non-bioinformaticians, with help buttons and tutorials, and a very simple GUI. </w:t>
-      </w:r>
-    </w:p>
-    <w:p>
-      <w:pPr>
-        <w:pStyle w:val="ListParagraph"/>
-        <w:numPr>
-          <w:ilvl w:val="0"/>
-          <w:numId w:val="10"/>
-        </w:numPr>
-      </w:pPr>
-      <w:r>
-        <w:rPr>
-          <w:b/>
-          <w:bCs/>
-        </w:rPr>
-        <w:t>I wanted to create a web app that compared the results from all different permutations of parameters and forms of analyses.</w:t>
-      </w:r>
-    </w:p>
-    <w:p/>
-    <w:p>
-      <w:pPr>
-        <w:pStyle w:val="ListParagraph"/>
-        <w:numPr>
-          <w:ilvl w:val="0"/>
-          <w:numId w:val="2"/>
-        </w:numPr>
-        <w:ind w:left="360"/>
-      </w:pPr>
-      <w:r>
-        <w:t>Question - How others might use or develop your research</w:t>
-      </w:r>
-    </w:p>
-    <w:p>
-      <w:pPr>
-        <w:pStyle w:val="ListParagraph"/>
-        <w:numPr>
-          <w:ilvl w:val="0"/>
-          <w:numId w:val="11"/>
-        </w:numPr>
-      </w:pPr>
-      <w:r>
-        <w:rPr>
-          <w:b/>
-        </w:rPr>
-        <w:t>Can be used to encourage the development of an in-house transcriptomic workflow in the lab so they don’t need to rely on outsourcing.</w:t>
-      </w:r>
-    </w:p>
-    <w:p>
-      <w:pPr>
-        <w:pStyle w:val="ListParagraph"/>
-        <w:numPr>
-          <w:ilvl w:val="0"/>
-          <w:numId w:val="11"/>
-        </w:numPr>
-      </w:pPr>
-      <w:r>
-        <w:rPr>
-          <w:b/>
-        </w:rPr>
-        <w:lastRenderedPageBreak/>
-        <w:t>It prompts the lab to review the quality control data more thoroughly as this is something that can be easily overlooked. This has already been acknowledged in the Calu-3 study.</w:t>
-      </w:r>
-    </w:p>
-    <w:p>
-      <w:pPr>
-        <w:pStyle w:val="ListParagraph"/>
-        <w:numPr>
-          <w:ilvl w:val="0"/>
-          <w:numId w:val="11"/>
-        </w:numPr>
-      </w:pPr>
-      <w:r>
-        <w:rPr>
-          <w:b/>
-        </w:rPr>
-        <w:t>It is a cautionary tale that reenforces the importance of experimental design and shows that transcriptomics on improper data can be a waste of money and can lead to spurious results.</w:t>
-      </w:r>
-    </w:p>
-    <w:p>
-      <w:pPr>
-        <w:pStyle w:val="ListParagraph"/>
-        <w:numPr>
-          <w:ilvl w:val="0"/>
-          <w:numId w:val="11"/>
-        </w:numPr>
-      </w:pPr>
-      <w:r>
-        <w:rPr>
-          <w:b/>
-        </w:rPr>
-        <w:t xml:space="preserve">The primary HBEC dataset provides more evidence for allergen-exposed effects on EV miRNA cargo, which is relatively </w:t>
-      </w:r>
-      <w:proofErr w:type="spellStart"/>
-      <w:r>
-        <w:rPr>
-          <w:b/>
-        </w:rPr>
-        <w:t>undertstudied</w:t>
-      </w:r>
-      <w:proofErr w:type="spellEnd"/>
-      <w:r>
-        <w:rPr>
-          <w:b/>
-        </w:rPr>
-        <w:t>.</w:t>
-      </w:r>
-    </w:p>
-    <w:p/>
-    <w:p>
-      <w:pPr>
-        <w:pStyle w:val="Heading2"/>
-      </w:pPr>
-      <w:r>
-        <w:t>Anticipated Questions</w:t>
-      </w:r>
-    </w:p>
-    <w:p/>
-    <w:p>
-      <w:pPr>
-        <w:pStyle w:val="Heading3"/>
-      </w:pPr>
-      <w:r>
-        <w:t>Introduction</w:t>
-      </w:r>
-    </w:p>
-    <w:p>
-      <w:pPr>
-        <w:pStyle w:val="ListParagraph"/>
-        <w:numPr>
-          <w:ilvl w:val="0"/>
-          <w:numId w:val="2"/>
-        </w:numPr>
-        <w:ind w:left="360"/>
-      </w:pPr>
-      <w:r>
-        <w:t>Question - What is a miRNA?</w:t>
+        <w:t>Question - What is allergic sensitisation?</w:t>
       </w:r>
     </w:p>
     <w:p>
@@ -1577,50 +1754,9 @@
       <w:r>
         <w:rPr>
           <w:b/>
-        </w:rPr>
-        <w:t xml:space="preserve">Micro RNAs are short, non-coding RNAs, approximately 18–30 </w:t>
-      </w:r>
-      <w:proofErr w:type="spellStart"/>
-      <w:r>
-        <w:rPr>
-          <w:b/>
-        </w:rPr>
-        <w:t>nt</w:t>
-      </w:r>
-      <w:proofErr w:type="spellEnd"/>
-      <w:r>
-        <w:rPr>
-          <w:b/>
-        </w:rPr>
-        <w:t xml:space="preserve"> long, with a modal length of 21–23 </w:t>
-      </w:r>
-      <w:proofErr w:type="spellStart"/>
-      <w:r>
-        <w:rPr>
-          <w:b/>
-        </w:rPr>
-        <w:t>nt</w:t>
-      </w:r>
-      <w:proofErr w:type="spellEnd"/>
-      <w:r>
-        <w:rPr>
-          <w:b/>
-        </w:rPr>
-        <w:t xml:space="preserve">, which bind to the 3’ UTR region of a messenger RNA and suppress its expression.  </w:t>
-      </w:r>
-    </w:p>
-    <w:p/>
-    <w:p>
-      <w:pPr>
-        <w:pStyle w:val="ListParagraph"/>
-        <w:numPr>
-          <w:ilvl w:val="0"/>
-          <w:numId w:val="2"/>
-        </w:numPr>
-        <w:ind w:left="360"/>
-      </w:pPr>
-      <w:r>
-        <w:t>Question - What is allergic sensitisation?</w:t>
+          <w:bCs/>
+        </w:rPr>
+        <w:t>Allergic sensitisation is the development of an allergic response to an allergen that did not previously trigger an allergic reaction.</w:t>
       </w:r>
     </w:p>
     <w:p>
@@ -1636,25 +1772,9 @@
           <w:b/>
           <w:bCs/>
         </w:rPr>
-        <w:t>Allergic sensitisation is the development of an allergic response to an allergen that did not previously trigger an allergic reaction.</w:t>
-      </w:r>
-    </w:p>
-    <w:p>
-      <w:pPr>
-        <w:pStyle w:val="ListParagraph"/>
-        <w:numPr>
-          <w:ilvl w:val="0"/>
-          <w:numId w:val="12"/>
-        </w:numPr>
-      </w:pPr>
-      <w:r>
-        <w:rPr>
-          <w:b/>
-          <w:bCs/>
-        </w:rPr>
         <w:t xml:space="preserve">It can be propagated through Fc receptors </w:t>
       </w:r>
-      <w:hyperlink r:id="rId5" w:history="1">
+      <w:hyperlink r:id="rId7" w:history="1">
         <w:r>
           <w:rPr>
             <w:rStyle w:val="Hyperlink"/>
@@ -1674,6 +1794,7 @@
         <w:ind w:left="360"/>
       </w:pPr>
       <w:r>
+        <w:lastRenderedPageBreak/>
         <w:t>Question - What is the difference between immune and inflammatory</w:t>
       </w:r>
     </w:p>
@@ -1765,7 +1886,6 @@
         <w:ind w:left="360"/>
       </w:pPr>
       <w:r>
-        <w:lastRenderedPageBreak/>
         <w:t xml:space="preserve">Question </w:t>
       </w:r>
       <w:r>
@@ -1986,6 +2106,7 @@
         <w:rPr>
           <w:b/>
         </w:rPr>
+        <w:lastRenderedPageBreak/>
         <w:t>miRNA-level:</w:t>
       </w:r>
     </w:p>
@@ -2248,6 +2369,12 @@
         </w:rPr>
         <w:t>Firstly, through PCA analysis separation. This assessed both between conditions and between replicates.</w:t>
       </w:r>
+      <w:r>
+        <w:rPr>
+          <w:b/>
+        </w:rPr>
+        <w:t xml:space="preserve"> However, I only measured PC1 vs PC2 so testing other PCs may have revealed additional insights as PC1 and 2 only explained &lt;50% of variation.</w:t>
+      </w:r>
     </w:p>
     <w:p>
       <w:pPr>
@@ -2312,6 +2439,7 @@
           <w:b/>
           <w:bCs/>
         </w:rPr>
+        <w:lastRenderedPageBreak/>
         <w:t>I looked at</w:t>
       </w:r>
       <w:r>
@@ -2337,7 +2465,7 @@
           <w:numId w:val="19"/>
         </w:numPr>
       </w:pPr>
-      <w:hyperlink r:id="rId6" w:history="1">
+      <w:hyperlink r:id="rId8" w:history="1">
         <w:r>
           <w:rPr>
             <w:rStyle w:val="Hyperlink"/>
@@ -2354,7 +2482,7 @@
           <w:numId w:val="19"/>
         </w:numPr>
       </w:pPr>
-      <w:hyperlink r:id="rId7" w:history="1">
+      <w:hyperlink r:id="rId9" w:history="1">
         <w:r>
           <w:rPr>
             <w:rStyle w:val="Hyperlink"/>
@@ -2371,7 +2499,7 @@
           <w:numId w:val="19"/>
         </w:numPr>
       </w:pPr>
-      <w:hyperlink r:id="rId8" w:history="1">
+      <w:hyperlink r:id="rId10" w:history="1">
         <w:r>
           <w:rPr>
             <w:rStyle w:val="Hyperlink"/>
@@ -2424,7 +2552,7 @@
           <w:numId w:val="19"/>
         </w:numPr>
       </w:pPr>
-      <w:hyperlink r:id="rId9" w:history="1">
+      <w:hyperlink r:id="rId11" w:anchor="Sec39" w:history="1">
         <w:r>
           <w:rPr>
             <w:rStyle w:val="Hyperlink"/>
@@ -2441,7 +2569,7 @@
           <w:numId w:val="19"/>
         </w:numPr>
       </w:pPr>
-      <w:hyperlink r:id="rId10" w:history="1">
+      <w:hyperlink r:id="rId12" w:history="1">
         <w:r>
           <w:rPr>
             <w:rStyle w:val="Hyperlink"/>
@@ -2458,7 +2586,7 @@
           <w:numId w:val="19"/>
         </w:numPr>
       </w:pPr>
-      <w:hyperlink r:id="rId11" w:history="1">
+      <w:hyperlink r:id="rId13" w:history="1">
         <w:r>
           <w:rPr>
             <w:rStyle w:val="Hyperlink"/>
@@ -2475,7 +2603,7 @@
           <w:numId w:val="19"/>
         </w:numPr>
       </w:pPr>
-      <w:hyperlink r:id="rId12" w:history="1">
+      <w:hyperlink r:id="rId14" w:history="1">
         <w:r>
           <w:rPr>
             <w:rStyle w:val="Hyperlink"/>
@@ -2508,7 +2636,7 @@
           <w:numId w:val="19"/>
         </w:numPr>
       </w:pPr>
-      <w:hyperlink r:id="rId13" w:history="1">
+      <w:hyperlink r:id="rId15" w:history="1">
         <w:r>
           <w:rPr>
             <w:rStyle w:val="Hyperlink"/>
@@ -2558,12 +2686,24 @@
         <w:tabs>
           <w:tab w:val="left" w:pos="1053"/>
         </w:tabs>
-      </w:pPr>
-      <w:r>
-        <w:rPr>
-          <w:b/>
-        </w:rPr>
-        <w:t>Because smaller differences in lowly expressed miRNAs appear as larger fold changes.</w:t>
+        <w:rPr>
+          <w:b/>
+          <w:bCs/>
+        </w:rPr>
+      </w:pPr>
+      <w:r>
+        <w:rPr>
+          <w:b/>
+          <w:bCs/>
+        </w:rPr>
+        <w:t xml:space="preserve">Because it may not </w:t>
+      </w:r>
+      <w:r>
+        <w:rPr>
+          <w:b/>
+          <w:bCs/>
+        </w:rPr>
+        <w:t>capture the true transcriptome of the EV.</w:t>
       </w:r>
     </w:p>
     <w:p>
@@ -2581,6 +2721,24 @@
         <w:rPr>
           <w:b/>
         </w:rPr>
+        <w:t>Because smaller differences in lowly expressed miRNAs appear as larger fold changes.</w:t>
+      </w:r>
+    </w:p>
+    <w:p>
+      <w:pPr>
+        <w:pStyle w:val="ListParagraph"/>
+        <w:numPr>
+          <w:ilvl w:val="0"/>
+          <w:numId w:val="20"/>
+        </w:numPr>
+        <w:tabs>
+          <w:tab w:val="left" w:pos="1053"/>
+        </w:tabs>
+      </w:pPr>
+      <w:r>
+        <w:rPr>
+          <w:b/>
+        </w:rPr>
         <w:t>Because filtering removed many miRNAs that it considered to be noise, but these might have been real expressed miRNAs (only 58 out of 263 miRNAs were retained) and this will have altered the statistical model.</w:t>
       </w:r>
     </w:p>
@@ -2678,6 +2836,7 @@
         <w:ind w:left="360"/>
       </w:pPr>
       <w:r>
+        <w:lastRenderedPageBreak/>
         <w:t>Question - How do WNT and NOTCH regulate epithelial barrier integrity in the upregulated target gene pathways and RHO GTPases in the downregulated?</w:t>
       </w:r>
     </w:p>
@@ -2704,7 +2863,7 @@
           <w:numId w:val="22"/>
         </w:numPr>
       </w:pPr>
-      <w:hyperlink r:id="rId14" w:history="1">
+      <w:hyperlink r:id="rId16" w:history="1">
         <w:r>
           <w:rPr>
             <w:rStyle w:val="Hyperlink"/>
@@ -2723,7 +2882,7 @@
           <w:numId w:val="22"/>
         </w:numPr>
       </w:pPr>
-      <w:hyperlink r:id="rId15" w:history="1">
+      <w:hyperlink r:id="rId17" w:history="1">
         <w:r>
           <w:rPr>
             <w:rStyle w:val="Hyperlink"/>
@@ -2742,7 +2901,7 @@
           <w:numId w:val="22"/>
         </w:numPr>
       </w:pPr>
-      <w:hyperlink r:id="rId16" w:history="1">
+      <w:hyperlink r:id="rId18" w:history="1">
         <w:r>
           <w:rPr>
             <w:rStyle w:val="Hyperlink"/>
@@ -2812,7 +2971,7 @@
           <w:numId w:val="22"/>
         </w:numPr>
       </w:pPr>
-      <w:hyperlink r:id="rId17" w:history="1">
+      <w:hyperlink r:id="rId19" w:history="1">
         <w:r>
           <w:rPr>
             <w:rStyle w:val="Hyperlink"/>
@@ -2861,7 +3020,6 @@
         <w:ind w:left="360"/>
       </w:pPr>
       <w:r>
-        <w:lastRenderedPageBreak/>
         <w:t>Question - How does Fc receptor signalling contribute to allergic sensitisation and interleukin signalling in airway inflammation?</w:t>
       </w:r>
     </w:p>
@@ -2884,7 +3042,7 @@
         </w:rPr>
         <w:t xml:space="preserve">Fc receptors are found on immune cells and binding with these receptors can trigger immune cascades and lead to “hypersensitivity reactions”. </w:t>
       </w:r>
-      <w:hyperlink r:id="rId18" w:history="1">
+      <w:hyperlink r:id="rId20" w:history="1">
         <w:r>
           <w:rPr>
             <w:rStyle w:val="Hyperlink"/>
@@ -2917,7 +3075,7 @@
         </w:rPr>
         <w:t xml:space="preserve">Activation of Fc receptors lead to allergic responses </w:t>
       </w:r>
-      <w:hyperlink r:id="rId19" w:history="1">
+      <w:hyperlink r:id="rId21" w:history="1">
         <w:r>
           <w:rPr>
             <w:rStyle w:val="Hyperlink"/>
@@ -2948,7 +3106,7 @@
         </w:rPr>
         <w:t xml:space="preserve">Browne et al., 2025 </w:t>
       </w:r>
-      <w:hyperlink r:id="rId20" w:history="1">
+      <w:hyperlink r:id="rId22" w:history="1">
         <w:r>
           <w:rPr>
             <w:rStyle w:val="Hyperlink"/>
@@ -2999,7 +3157,7 @@
         </w:rPr>
         <w:t xml:space="preserve">Interleukin source that discusses all interleukins: </w:t>
       </w:r>
-      <w:hyperlink r:id="rId21" w:history="1">
+      <w:hyperlink r:id="rId23" w:history="1">
         <w:r>
           <w:rPr>
             <w:rStyle w:val="Hyperlink"/>
@@ -3130,6 +3288,7 @@
           <w:b/>
           <w:bCs/>
         </w:rPr>
+        <w:lastRenderedPageBreak/>
         <w:t>There may have been a mix</w:t>
       </w:r>
       <w:r>
@@ -3158,6 +3317,42 @@
           <w:bCs/>
         </w:rPr>
         <w:t>More research is required to confirm the result: repeat the test on that donor multiple times and test more samples/donors.</w:t>
+      </w:r>
+    </w:p>
+    <w:p>
+      <w:pPr>
+        <w:pStyle w:val="ListParagraph"/>
+        <w:numPr>
+          <w:ilvl w:val="0"/>
+          <w:numId w:val="24"/>
+        </w:numPr>
+        <w:rPr>
+          <w:b/>
+          <w:bCs/>
+        </w:rPr>
+      </w:pPr>
+      <w:r>
+        <w:rPr>
+          <w:b/>
+          <w:bCs/>
+        </w:rPr>
+        <w:t xml:space="preserve">I would like to look at the distribution of reads in this sample to see whether it is only a few miRNAs that have caused the massive increase or </w:t>
+      </w:r>
+      <w:proofErr w:type="gramStart"/>
+      <w:r>
+        <w:rPr>
+          <w:b/>
+          <w:bCs/>
+        </w:rPr>
+        <w:t>it is</w:t>
+      </w:r>
+      <w:proofErr w:type="gramEnd"/>
+      <w:r>
+        <w:rPr>
+          <w:b/>
+          <w:bCs/>
+        </w:rPr>
+        <w:t xml:space="preserve"> a blanket increase of all detected miRNA expression.</w:t>
       </w:r>
     </w:p>
     <w:p/>
@@ -3255,7 +3450,6 @@
         </w:numPr>
       </w:pPr>
       <w:r>
-        <w:lastRenderedPageBreak/>
         <w:t>“</w:t>
       </w:r>
       <w:proofErr w:type="gramStart"/>
@@ -3275,7 +3469,7 @@
       <w:r>
         <w:t xml:space="preserve"> </w:t>
       </w:r>
-      <w:hyperlink r:id="rId22" w:history="1">
+      <w:hyperlink r:id="rId24" w:history="1">
         <w:r>
           <w:rPr>
             <w:rStyle w:val="Hyperlink"/>
@@ -3393,6 +3587,7 @@
         <w:rPr>
           <w:b/>
         </w:rPr>
+        <w:lastRenderedPageBreak/>
         <w:t>I doubt it is a one-size-fits-all answer, but 2,500 and 44,000 average reads seem very low when you compare it to RNA-seq.</w:t>
       </w:r>
     </w:p>
@@ -3426,6 +3621,21 @@
         <w:t>I am aware that EV production varies between cell types, with Calu-3 cells known to release fewer than primary cells, and physiological state.</w:t>
       </w:r>
     </w:p>
+    <w:p>
+      <w:pPr>
+        <w:pStyle w:val="ListParagraph"/>
+        <w:numPr>
+          <w:ilvl w:val="0"/>
+          <w:numId w:val="26"/>
+        </w:numPr>
+      </w:pPr>
+      <w:r>
+        <w:rPr>
+          <w:b/>
+        </w:rPr>
+        <w:t>I would be interested to see what TAmiRNA thought, and what they typically see, because it may be that the lab failed to ask the right question for TAmiRNA to flag it up or that it wasn’t an issue.</w:t>
+      </w:r>
+    </w:p>
     <w:p/>
     <w:p>
       <w:pPr>
@@ -3481,6 +3691,29 @@
         <w:t>For target gene-level enrichment, it potentially matters more how many target genes are identified as some miRNAs have more target genes.</w:t>
       </w:r>
     </w:p>
+    <w:p>
+      <w:pPr>
+        <w:pStyle w:val="ListParagraph"/>
+        <w:numPr>
+          <w:ilvl w:val="1"/>
+          <w:numId w:val="27"/>
+        </w:numPr>
+      </w:pPr>
+      <w:r>
+        <w:t xml:space="preserve">I tested </w:t>
+      </w:r>
+      <w:r>
+        <w:t xml:space="preserve">how many target genes each miRNA </w:t>
+      </w:r>
+      <w:proofErr w:type="gramStart"/>
+      <w:r>
+        <w:t>had</w:t>
+      </w:r>
+      <w:proofErr w:type="gramEnd"/>
+      <w:r>
+        <w:t xml:space="preserve"> and these ranged from a couple hundred to 10k.</w:t>
+      </w:r>
+    </w:p>
     <w:p/>
     <w:p>
       <w:pPr>
@@ -3507,65 +3740,187 @@
         <w:rPr>
           <w:b/>
         </w:rPr>
+        <w:t xml:space="preserve">Because miR-125b-5p was detected in both the dose 24 primary HBEC condition and the Calu-3 Can f 1 condition, it may be a common response </w:t>
+      </w:r>
+      <w:r>
+        <w:rPr>
+          <w:b/>
+        </w:rPr>
+        <w:t>miRNA</w:t>
+      </w:r>
+      <w:r>
+        <w:rPr>
+          <w:b/>
+        </w:rPr>
+        <w:t xml:space="preserve"> between allergens.</w:t>
+      </w:r>
+    </w:p>
+    <w:p>
+      <w:pPr>
+        <w:pStyle w:val="ListParagraph"/>
+        <w:numPr>
+          <w:ilvl w:val="0"/>
+          <w:numId w:val="28"/>
+        </w:numPr>
+      </w:pPr>
+      <w:r>
+        <w:rPr>
+          <w:b/>
+        </w:rPr>
+        <w:t>More research is required to verify this result in the Calu-3 dataset as it was underpowered.</w:t>
+      </w:r>
+    </w:p>
+    <w:p>
+      <w:pPr>
+        <w:pStyle w:val="ListParagraph"/>
+        <w:numPr>
+          <w:ilvl w:val="0"/>
+          <w:numId w:val="28"/>
+        </w:numPr>
+      </w:pPr>
+      <w:r>
+        <w:rPr>
+          <w:b/>
+        </w:rPr>
+        <w:t>This should be tested in more samples / donors and with additional cell types and allergens.</w:t>
+      </w:r>
+    </w:p>
+    <w:p>
+      <w:pPr>
+        <w:pStyle w:val="ListParagraph"/>
+        <w:numPr>
+          <w:ilvl w:val="0"/>
+          <w:numId w:val="28"/>
+        </w:numPr>
+      </w:pPr>
+      <w:r>
+        <w:rPr>
+          <w:b/>
+        </w:rPr>
+        <w:t>Can look for research implicating it in other allergen exposure studies.</w:t>
+      </w:r>
+    </w:p>
+    <w:p/>
+    <w:p>
+      <w:pPr>
+        <w:pStyle w:val="ListParagraph"/>
+        <w:numPr>
+          <w:ilvl w:val="0"/>
+          <w:numId w:val="2"/>
+        </w:numPr>
+        <w:ind w:left="360"/>
+      </w:pPr>
+      <w:r>
+        <w:t>Question - Why was miR-125b classed as a potential candidate for further research?</w:t>
+      </w:r>
+    </w:p>
+    <w:p>
+      <w:pPr>
+        <w:pStyle w:val="ListParagraph"/>
+        <w:numPr>
+          <w:ilvl w:val="0"/>
+          <w:numId w:val="29"/>
+        </w:numPr>
+        <w:rPr>
+          <w:b/>
+          <w:bCs/>
+        </w:rPr>
+      </w:pPr>
+      <w:r>
+        <w:rPr>
+          <w:b/>
+          <w:bCs/>
+        </w:rPr>
+        <w:t xml:space="preserve">Because miR-125b-5p was detected in both the dose 24 primary HBEC condition and the Calu-3 Can f 1 condition, it may be a common response </w:t>
+      </w:r>
+      <w:r>
+        <w:rPr>
+          <w:b/>
+          <w:bCs/>
+        </w:rPr>
+        <w:t>miRNA</w:t>
+      </w:r>
+      <w:r>
+        <w:rPr>
+          <w:b/>
+          <w:bCs/>
+        </w:rPr>
+        <w:t xml:space="preserve"> between allergens.</w:t>
+      </w:r>
+    </w:p>
+    <w:p/>
+    <w:p>
+      <w:pPr>
+        <w:pStyle w:val="ListParagraph"/>
+        <w:numPr>
+          <w:ilvl w:val="0"/>
+          <w:numId w:val="2"/>
+        </w:numPr>
+        <w:ind w:left="360"/>
+      </w:pPr>
+      <w:r>
         <w:lastRenderedPageBreak/>
-        <w:t xml:space="preserve">Because miR-125b-5p was detected in both the dose 24 primary HBEC condition and the Calu-3 Can f 1 condition, it may be a common response </w:t>
-      </w:r>
-      <w:r>
-        <w:rPr>
-          <w:b/>
-        </w:rPr>
-        <w:t>miRNA</w:t>
-      </w:r>
-      <w:r>
-        <w:rPr>
-          <w:b/>
-        </w:rPr>
-        <w:t xml:space="preserve"> between allergens.</w:t>
-      </w:r>
-    </w:p>
-    <w:p>
-      <w:pPr>
-        <w:pStyle w:val="ListParagraph"/>
-        <w:numPr>
-          <w:ilvl w:val="0"/>
-          <w:numId w:val="28"/>
-        </w:numPr>
-      </w:pPr>
-      <w:r>
-        <w:rPr>
-          <w:b/>
-        </w:rPr>
-        <w:t>More research is required to verify this result in the Calu-3 dataset as it was underpowered.</w:t>
-      </w:r>
-    </w:p>
-    <w:p>
-      <w:pPr>
-        <w:pStyle w:val="ListParagraph"/>
-        <w:numPr>
-          <w:ilvl w:val="0"/>
-          <w:numId w:val="28"/>
-        </w:numPr>
-      </w:pPr>
-      <w:r>
-        <w:rPr>
-          <w:b/>
-        </w:rPr>
-        <w:t>This should be tested in more samples / donors and with additional cell types and allergens.</w:t>
-      </w:r>
-    </w:p>
-    <w:p>
-      <w:pPr>
-        <w:pStyle w:val="ListParagraph"/>
-        <w:numPr>
-          <w:ilvl w:val="0"/>
-          <w:numId w:val="28"/>
-        </w:numPr>
-      </w:pPr>
-      <w:r>
-        <w:rPr>
-          <w:b/>
-        </w:rPr>
-        <w:t>Can look for research implicating it in other allergen exposure studies.</w:t>
+        <w:t>Question - What is the significance of being able to handle spike in controls?</w:t>
+      </w:r>
+    </w:p>
+    <w:p>
+      <w:pPr>
+        <w:pStyle w:val="ListParagraph"/>
+        <w:numPr>
+          <w:ilvl w:val="0"/>
+          <w:numId w:val="29"/>
+        </w:numPr>
+      </w:pPr>
+      <w:r>
+        <w:rPr>
+          <w:b/>
+        </w:rPr>
+        <w:t>TAmiRNA used spike-in controls, and this may have accounted for some differences between my results and theirs.</w:t>
+      </w:r>
+    </w:p>
+    <w:p>
+      <w:pPr>
+        <w:pStyle w:val="ListParagraph"/>
+        <w:numPr>
+          <w:ilvl w:val="0"/>
+          <w:numId w:val="29"/>
+        </w:numPr>
+      </w:pPr>
+      <w:r>
+        <w:rPr>
+          <w:b/>
+        </w:rPr>
+        <w:t>It allows the absolute quantification of miRNA abundance therefore it can verify the expression of lowly expressed miRNAs.</w:t>
+      </w:r>
+    </w:p>
+    <w:p>
+      <w:pPr>
+        <w:pStyle w:val="ListParagraph"/>
+        <w:numPr>
+          <w:ilvl w:val="0"/>
+          <w:numId w:val="29"/>
+        </w:numPr>
+      </w:pPr>
+      <w:r>
+        <w:rPr>
+          <w:b/>
+        </w:rPr>
+        <w:t>This is helpful as I found that many of the miRNAs that were classed as most differentially expressed had very low expression levels.</w:t>
+      </w:r>
+    </w:p>
+    <w:p>
+      <w:pPr>
+        <w:pStyle w:val="ListParagraph"/>
+        <w:numPr>
+          <w:ilvl w:val="0"/>
+          <w:numId w:val="29"/>
+        </w:numPr>
+      </w:pPr>
+      <w:r>
+        <w:rPr>
+          <w:b/>
+        </w:rPr>
+        <w:t>These may have then had lots of target genes which could have skewed pathway enrichment analysis</w:t>
       </w:r>
     </w:p>
     <w:p/>
@@ -3579,125 +3934,6 @@
         <w:ind w:left="360"/>
       </w:pPr>
       <w:r>
-        <w:t>Question - Why was miR-125b classed as a potential candidate for further research?</w:t>
-      </w:r>
-    </w:p>
-    <w:p>
-      <w:pPr>
-        <w:pStyle w:val="ListParagraph"/>
-        <w:numPr>
-          <w:ilvl w:val="0"/>
-          <w:numId w:val="29"/>
-        </w:numPr>
-        <w:rPr>
-          <w:b/>
-          <w:bCs/>
-        </w:rPr>
-      </w:pPr>
-      <w:r>
-        <w:rPr>
-          <w:b/>
-          <w:bCs/>
-        </w:rPr>
-        <w:t xml:space="preserve">Because miR-125b-5p was detected in both the dose 24 primary HBEC condition and the Calu-3 Can f 1 condition, it may be a common response </w:t>
-      </w:r>
-      <w:r>
-        <w:rPr>
-          <w:b/>
-          <w:bCs/>
-        </w:rPr>
-        <w:t>miRNA</w:t>
-      </w:r>
-      <w:r>
-        <w:rPr>
-          <w:b/>
-          <w:bCs/>
-        </w:rPr>
-        <w:t xml:space="preserve"> between allergens.</w:t>
-      </w:r>
-    </w:p>
-    <w:p/>
-    <w:p>
-      <w:pPr>
-        <w:pStyle w:val="ListParagraph"/>
-        <w:numPr>
-          <w:ilvl w:val="0"/>
-          <w:numId w:val="2"/>
-        </w:numPr>
-        <w:ind w:left="360"/>
-      </w:pPr>
-      <w:r>
-        <w:t>Question - What is the significance of being able to handle spike in controls?</w:t>
-      </w:r>
-    </w:p>
-    <w:p>
-      <w:pPr>
-        <w:pStyle w:val="ListParagraph"/>
-        <w:numPr>
-          <w:ilvl w:val="0"/>
-          <w:numId w:val="29"/>
-        </w:numPr>
-      </w:pPr>
-      <w:r>
-        <w:rPr>
-          <w:b/>
-        </w:rPr>
-        <w:t>It allows the absolute quantification of miRNA abundance therefore it can verify the expression of lowly expressed miRNAs.</w:t>
-      </w:r>
-    </w:p>
-    <w:p>
-      <w:pPr>
-        <w:pStyle w:val="ListParagraph"/>
-        <w:numPr>
-          <w:ilvl w:val="0"/>
-          <w:numId w:val="29"/>
-        </w:numPr>
-      </w:pPr>
-      <w:r>
-        <w:rPr>
-          <w:b/>
-        </w:rPr>
-        <w:t>This is helpful as I found that many of the miRNAs that were classed as most differentially expressed had very low expression levels.</w:t>
-      </w:r>
-    </w:p>
-    <w:p>
-      <w:pPr>
-        <w:pStyle w:val="ListParagraph"/>
-        <w:numPr>
-          <w:ilvl w:val="0"/>
-          <w:numId w:val="29"/>
-        </w:numPr>
-      </w:pPr>
-      <w:r>
-        <w:rPr>
-          <w:b/>
-        </w:rPr>
-        <w:t>TAmiRNA used spike-in controls</w:t>
-      </w:r>
-      <w:r>
-        <w:rPr>
-          <w:b/>
-        </w:rPr>
-        <w:t>,</w:t>
-      </w:r>
-      <w:r>
-        <w:rPr>
-          <w:b/>
-        </w:rPr>
-        <w:t xml:space="preserve"> and this may have accounted for some differences between my results and theirs.</w:t>
-      </w:r>
-    </w:p>
-    <w:p/>
-    <w:p>
-      <w:pPr>
-        <w:pStyle w:val="ListParagraph"/>
-        <w:numPr>
-          <w:ilvl w:val="0"/>
-          <w:numId w:val="2"/>
-        </w:numPr>
-        <w:ind w:left="360"/>
-      </w:pPr>
-      <w:r>
         <w:t xml:space="preserve">Question - Did you try network-based enrichment? </w:t>
       </w:r>
     </w:p>
@@ -3708,12 +3944,51 @@
           <w:ilvl w:val="0"/>
           <w:numId w:val="30"/>
         </w:numPr>
-      </w:pPr>
-      <w:r>
-        <w:rPr>
-          <w:b/>
-        </w:rPr>
-        <w:t>I did try it, but I found that the pathways it provided were not relevant. This was because there are some pathways that are clearly biased towards (e.g., Alzheimer’s) as they are better researched and it was giving me them.</w:t>
+        <w:rPr>
+          <w:b/>
+          <w:bCs/>
+        </w:rPr>
+      </w:pPr>
+      <w:r>
+        <w:rPr>
+          <w:b/>
+          <w:bCs/>
+        </w:rPr>
+        <w:t xml:space="preserve">Network-based enrichment is where </w:t>
+      </w:r>
+      <w:r>
+        <w:rPr>
+          <w:b/>
+          <w:bCs/>
+        </w:rPr>
+        <w:t>you can look at all the miRNA-target interactions and see how they connect, that is if multiple miRNAs target the same gene, then it is considered a ‘hub’ gene which plays a regulatory role.</w:t>
+      </w:r>
+    </w:p>
+    <w:p>
+      <w:pPr>
+        <w:pStyle w:val="ListParagraph"/>
+        <w:numPr>
+          <w:ilvl w:val="0"/>
+          <w:numId w:val="30"/>
+        </w:numPr>
+      </w:pPr>
+      <w:r>
+        <w:rPr>
+          <w:b/>
+        </w:rPr>
+        <w:t>I did try it, but I found that the pathways it provided were not relevant</w:t>
+      </w:r>
+      <w:r>
+        <w:rPr>
+          <w:b/>
+        </w:rPr>
+        <w:t xml:space="preserve"> when all target genes were included</w:t>
+      </w:r>
+      <w:r>
+        <w:rPr>
+          <w:b/>
+        </w:rPr>
+        <w:t>. This was because there are some pathways that are clearly biased towards (e.g., Alzheimer’s) as they are better researched and it was giving me them.</w:t>
       </w:r>
     </w:p>
     <w:p>
@@ -3787,7 +4062,7 @@
       <w:r>
         <w:t xml:space="preserve">: </w:t>
       </w:r>
-      <w:hyperlink r:id="rId23" w:history="1">
+      <w:hyperlink r:id="rId25" w:history="1">
         <w:r>
           <w:rPr>
             <w:rStyle w:val="Hyperlink"/>
@@ -3804,7 +4079,7 @@
           <w:numId w:val="30"/>
         </w:numPr>
       </w:pPr>
-      <w:hyperlink r:id="rId24" w:history="1">
+      <w:hyperlink r:id="rId26" w:history="1">
         <w:r>
           <w:rPr>
             <w:rStyle w:val="Hyperlink"/>
@@ -3872,6 +4147,7 @@
           <w:b/>
           <w:bCs/>
         </w:rPr>
+        <w:lastRenderedPageBreak/>
         <w:t>Additionally, the pathway analysis method development was robust as there were 27 DE miRNAs in the primary HBEC dataset, with an approximate even split of upregulated and downregulated miRNAs which made it ideal for pathway enrichment techniques.</w:t>
       </w:r>
     </w:p>
@@ -3959,7 +4235,19 @@
         <w:rPr>
           <w:b/>
         </w:rPr>
-        <w:t>Lots more research has been conducted into gene-pathway relationships.</w:t>
+        <w:t>Lots more research has been conducted into gene-pathway relationships</w:t>
+      </w:r>
+      <w:r>
+        <w:rPr>
+          <w:b/>
+        </w:rPr>
+        <w:t xml:space="preserve"> as these are easier to study and a lot of the world’s research funding has gone into researching these relationships</w:t>
+      </w:r>
+      <w:r>
+        <w:rPr>
+          <w:b/>
+        </w:rPr>
+        <w:t xml:space="preserve"> – there is more of a market for these databases.</w:t>
       </w:r>
     </w:p>
     <w:p/>
@@ -4138,43 +4426,43 @@
         <w:rPr>
           <w:b/>
         </w:rPr>
+        <w:t>Because, as mentioned in the presentation, pathway enrichment analysis techniques require sufficient differential expression to be statistically reliable.</w:t>
+      </w:r>
+    </w:p>
+    <w:p>
+      <w:pPr>
+        <w:pStyle w:val="ListParagraph"/>
+        <w:numPr>
+          <w:ilvl w:val="0"/>
+          <w:numId w:val="33"/>
+        </w:numPr>
+      </w:pPr>
+      <w:r>
+        <w:rPr>
+          <w:b/>
+        </w:rPr>
+        <w:t xml:space="preserve">Therefore, it was lucky that the primary HBEC dataset had ~13/14 miRNAs </w:t>
+      </w:r>
+      <w:r>
+        <w:rPr>
+          <w:b/>
+        </w:rPr>
+        <w:t>in each upregulated and downregulated set.</w:t>
+      </w:r>
+    </w:p>
+    <w:p>
+      <w:pPr>
+        <w:pStyle w:val="ListParagraph"/>
+        <w:numPr>
+          <w:ilvl w:val="0"/>
+          <w:numId w:val="33"/>
+        </w:numPr>
+      </w:pPr>
+      <w:r>
+        <w:rPr>
+          <w:b/>
+        </w:rPr>
         <w:lastRenderedPageBreak/>
-        <w:t>Because, as mentioned in the presentation, pathway enrichment analysis techniques require sufficient differential expression to be statistically reliable.</w:t>
-      </w:r>
-    </w:p>
-    <w:p>
-      <w:pPr>
-        <w:pStyle w:val="ListParagraph"/>
-        <w:numPr>
-          <w:ilvl w:val="0"/>
-          <w:numId w:val="33"/>
-        </w:numPr>
-      </w:pPr>
-      <w:r>
-        <w:rPr>
-          <w:b/>
-        </w:rPr>
-        <w:t xml:space="preserve">Therefore, it was lucky that the primary HBEC dataset had ~13/14 miRNAs </w:t>
-      </w:r>
-      <w:r>
-        <w:rPr>
-          <w:b/>
-        </w:rPr>
-        <w:t>in each upregulated and downregulated set.</w:t>
-      </w:r>
-    </w:p>
-    <w:p>
-      <w:pPr>
-        <w:pStyle w:val="ListParagraph"/>
-        <w:numPr>
-          <w:ilvl w:val="0"/>
-          <w:numId w:val="33"/>
-        </w:numPr>
-      </w:pPr>
-      <w:r>
-        <w:rPr>
-          <w:b/>
-        </w:rPr>
         <w:t>The alternative method would have been to use an established dataset from a similar study</w:t>
       </w:r>
       <w:r>
@@ -4396,6 +4684,21 @@
           <w:b/>
         </w:rPr>
         <w:t xml:space="preserve"> be considered in terms of cost.</w:t>
+      </w:r>
+    </w:p>
+    <w:p>
+      <w:pPr>
+        <w:pStyle w:val="ListParagraph"/>
+        <w:numPr>
+          <w:ilvl w:val="0"/>
+          <w:numId w:val="35"/>
+        </w:numPr>
+      </w:pPr>
+      <w:r>
+        <w:rPr>
+          <w:b/>
+        </w:rPr>
+        <w:t>The methods used may introduce variability due to biological differences in allergen responses therefore this may mean that you need more samples.</w:t>
       </w:r>
     </w:p>
     <w:p/>
@@ -4475,8 +4778,38 @@
         <w:rPr>
           <w:b/>
         </w:rPr>
+        <w:t>I did see one paper that had several hundred thousand–2 million miRNA reads.</w:t>
+      </w:r>
+    </w:p>
+    <w:p/>
+    <w:p>
+      <w:pPr>
+        <w:pStyle w:val="ListParagraph"/>
+        <w:numPr>
+          <w:ilvl w:val="0"/>
+          <w:numId w:val="2"/>
+        </w:numPr>
+        <w:ind w:left="360"/>
+      </w:pPr>
+      <w:r>
         <w:lastRenderedPageBreak/>
-        <w:t>I did see one paper that had several hundred thousand–2 million miRNA reads.</w:t>
+        <w:t>Question – Why did using a literature search instead of pathway analysis prevent novel findings in the Calu-3 dataset?</w:t>
+      </w:r>
+    </w:p>
+    <w:p>
+      <w:pPr>
+        <w:pStyle w:val="ListParagraph"/>
+        <w:numPr>
+          <w:ilvl w:val="0"/>
+          <w:numId w:val="37"/>
+        </w:numPr>
+      </w:pPr>
+      <w:r>
+        <w:rPr>
+          <w:b/>
+          <w:bCs/>
+        </w:rPr>
+        <w:t>Because it could only analyse pathways that had already been associated with the miRNA by previous research.</w:t>
       </w:r>
     </w:p>
     <w:p/>
@@ -4490,7 +4823,7 @@
         <w:ind w:left="360"/>
       </w:pPr>
       <w:r>
-        <w:t>Question – Why did using a literature search instead of pathway analysis prevent novel findings in the Calu-3 dataset?</w:t>
+        <w:t xml:space="preserve">Question - Why do pathway databases bias towards well-characterised miRNAs? </w:t>
       </w:r>
     </w:p>
     <w:p>
@@ -4506,21 +4839,7 @@
           <w:b/>
           <w:bCs/>
         </w:rPr>
-        <w:t>Because it could only analyse pathways that had already been associated with the miRNA by previous research.</w:t>
-      </w:r>
-    </w:p>
-    <w:p/>
-    <w:p>
-      <w:pPr>
-        <w:pStyle w:val="ListParagraph"/>
-        <w:numPr>
-          <w:ilvl w:val="0"/>
-          <w:numId w:val="2"/>
-        </w:numPr>
-        <w:ind w:left="360"/>
-      </w:pPr>
-      <w:r>
-        <w:t xml:space="preserve">Question - Why do pathway databases bias towards well-characterised miRNAs? </w:t>
+        <w:t>Because well characterised miRNAs typically have more target genes and pathway analysis methods such as ORA rely on observing whether more target genes appear than a random set of genes of the same size. Therefore, more target genes = more chance of being associated with a pathway.</w:t>
       </w:r>
     </w:p>
     <w:p>
@@ -4536,7 +4855,7 @@
           <w:b/>
           <w:bCs/>
         </w:rPr>
-        <w:t>Because well characterised miRNAs typically have more target genes and pathway analysis methods such as ORA rely on observing whether more target genes appear than a random set of genes of the same size. Therefore, more target genes = more chance of being associated with a pathway.</w:t>
+        <w:t>This also biases towards better researched pathways such as cancer pathways and Alzheimer’s.</w:t>
       </w:r>
     </w:p>
     <w:p>
@@ -4552,27 +4871,14 @@
           <w:b/>
           <w:bCs/>
         </w:rPr>
-        <w:t>This also biases towards better researched pathways such as cancer pathways and Alzheimer’s.</w:t>
-      </w:r>
-    </w:p>
-    <w:p>
-      <w:pPr>
-        <w:pStyle w:val="ListParagraph"/>
-        <w:numPr>
-          <w:ilvl w:val="0"/>
-          <w:numId w:val="37"/>
-        </w:numPr>
-      </w:pPr>
-      <w:r>
-        <w:rPr>
-          <w:b/>
-          <w:bCs/>
-        </w:rPr>
         <w:t>I tested to see how many target genes each DE miRNA had and there was a massive range:</w:t>
       </w:r>
     </w:p>
     <w:p>
       <w:r>
+        <w:rPr>
+          <w:noProof/>
+        </w:rPr>
         <w:drawing>
           <wp:inline distT="0" distB="0" distL="0" distR="0" wp14:anchorId="1D715459" wp14:editId="5D92DA47">
             <wp:extent cx="1041149" cy="2032720"/>
@@ -4589,7 +4895,7 @@
                     <pic:cNvPicPr/>
                   </pic:nvPicPr>
                   <pic:blipFill>
-                    <a:blip r:embed="rId25"/>
+                    <a:blip r:embed="rId27"/>
                     <a:stretch>
                       <a:fillRect/>
                     </a:stretch>
@@ -4690,51 +4996,51 @@
         <w:pStyle w:val="Heading3"/>
       </w:pPr>
       <w:r>
+        <w:t>Future</w:t>
+      </w:r>
+    </w:p>
+    <w:p>
+      <w:pPr>
+        <w:pStyle w:val="ListParagraph"/>
+        <w:numPr>
+          <w:ilvl w:val="0"/>
+          <w:numId w:val="2"/>
+        </w:numPr>
+      </w:pPr>
+      <w:r>
+        <w:t>Question - What would you do in the future, given more time and/or money?</w:t>
+      </w:r>
+    </w:p>
+    <w:p>
+      <w:pPr>
+        <w:pStyle w:val="ListParagraph"/>
+        <w:numPr>
+          <w:ilvl w:val="0"/>
+          <w:numId w:val="39"/>
+        </w:numPr>
+      </w:pPr>
+      <w:r>
+        <w:rPr>
+          <w:b/>
+          <w:bCs/>
+        </w:rPr>
+        <w:t>I would address the points made in the future directions of the slide.</w:t>
+      </w:r>
+    </w:p>
+    <w:p>
+      <w:pPr>
+        <w:pStyle w:val="ListParagraph"/>
+        <w:numPr>
+          <w:ilvl w:val="0"/>
+          <w:numId w:val="39"/>
+        </w:numPr>
+      </w:pPr>
+      <w:r>
+        <w:rPr>
+          <w:b/>
+          <w:bCs/>
+        </w:rPr>
         <w:lastRenderedPageBreak/>
-        <w:t>Future</w:t>
-      </w:r>
-    </w:p>
-    <w:p>
-      <w:pPr>
-        <w:pStyle w:val="ListParagraph"/>
-        <w:numPr>
-          <w:ilvl w:val="0"/>
-          <w:numId w:val="2"/>
-        </w:numPr>
-      </w:pPr>
-      <w:r>
-        <w:t>Question - What would you do in the future, given more time and/or money?</w:t>
-      </w:r>
-    </w:p>
-    <w:p>
-      <w:pPr>
-        <w:pStyle w:val="ListParagraph"/>
-        <w:numPr>
-          <w:ilvl w:val="0"/>
-          <w:numId w:val="39"/>
-        </w:numPr>
-      </w:pPr>
-      <w:r>
-        <w:rPr>
-          <w:b/>
-          <w:bCs/>
-        </w:rPr>
-        <w:t>I would address the points made in the future directions of the slide.</w:t>
-      </w:r>
-    </w:p>
-    <w:p>
-      <w:pPr>
-        <w:pStyle w:val="ListParagraph"/>
-        <w:numPr>
-          <w:ilvl w:val="0"/>
-          <w:numId w:val="39"/>
-        </w:numPr>
-      </w:pPr>
-      <w:r>
-        <w:rPr>
-          <w:b/>
-          <w:bCs/>
-        </w:rPr>
         <w:t>I also had an idea during the method development stage to create a web app/report that would compile the results from each different permutation of parameters I tried so that I could quickly navigate through the results to determine what difference each attempt.</w:t>
       </w:r>
     </w:p>
@@ -4884,6 +5190,54 @@
       <w:pPr>
         <w:pStyle w:val="ListParagraph"/>
         <w:numPr>
+          <w:ilvl w:val="2"/>
+          <w:numId w:val="40"/>
+        </w:numPr>
+      </w:pPr>
+      <w:r>
+        <w:t>Retain only genes co-targeted by miRNAs</w:t>
+      </w:r>
+    </w:p>
+    <w:p>
+      <w:pPr>
+        <w:pStyle w:val="ListParagraph"/>
+        <w:numPr>
+          <w:ilvl w:val="2"/>
+          <w:numId w:val="40"/>
+        </w:numPr>
+      </w:pPr>
+      <w:r>
+        <w:t>Retain only genes from ‘strong’ experiment types</w:t>
+      </w:r>
+    </w:p>
+    <w:p>
+      <w:pPr>
+        <w:pStyle w:val="ListParagraph"/>
+        <w:numPr>
+          <w:ilvl w:val="2"/>
+          <w:numId w:val="40"/>
+        </w:numPr>
+      </w:pPr>
+      <w:r>
+        <w:t>Retain only genes in multiple databases</w:t>
+      </w:r>
+    </w:p>
+    <w:p>
+      <w:pPr>
+        <w:pStyle w:val="ListParagraph"/>
+        <w:numPr>
+          <w:ilvl w:val="2"/>
+          <w:numId w:val="40"/>
+        </w:numPr>
+      </w:pPr>
+      <w:r>
+        <w:t>Retain only genes expressed in airway cells</w:t>
+      </w:r>
+    </w:p>
+    <w:p>
+      <w:pPr>
+        <w:pStyle w:val="ListParagraph"/>
+        <w:numPr>
           <w:ilvl w:val="1"/>
           <w:numId w:val="40"/>
         </w:numPr>
@@ -5078,7 +5432,7 @@
       <w:r>
         <w:t xml:space="preserve">Using miRNAs as biomarkers for allergic rhinitis (nose reacts to allergens) </w:t>
       </w:r>
-      <w:hyperlink r:id="rId26" w:history="1">
+      <w:hyperlink r:id="rId28" w:history="1">
         <w:r>
           <w:rPr>
             <w:rStyle w:val="Hyperlink"/>
@@ -5140,7 +5494,7 @@
       <w:r>
         <w:t xml:space="preserve">More research needs to be done to investigate sex effects. This paper suggests miRNAs may be involved in explaining the “higher susceptibility of females to asthma” </w:t>
       </w:r>
-      <w:hyperlink r:id="rId27" w:history="1">
+      <w:hyperlink r:id="rId29" w:history="1">
         <w:r>
           <w:rPr>
             <w:rStyle w:val="Hyperlink"/>
@@ -5545,7 +5899,7 @@
       <w:r>
         <w:t xml:space="preserve">Mimics and inhibitors were used in previous studies </w:t>
       </w:r>
-      <w:hyperlink r:id="rId28" w:history="1">
+      <w:hyperlink r:id="rId30" w:history="1">
         <w:r>
           <w:rPr>
             <w:rStyle w:val="Hyperlink"/>
@@ -7065,7 +7419,7 @@
         <w:rFonts w:ascii="Symbol" w:hAnsi="Symbol" w:hint="default"/>
       </w:rPr>
     </w:lvl>
-    <w:lvl w:ilvl="1" w:tplc="08090003" w:tentative="1">
+    <w:lvl w:ilvl="1" w:tplc="08090003">
       <w:start w:val="1"/>
       <w:numFmt w:val="bullet"/>
       <w:lvlText w:val="o"/>
@@ -8093,7 +8447,7 @@
         <w:rFonts w:ascii="Courier New" w:hAnsi="Courier New" w:cs="Courier New" w:hint="default"/>
       </w:rPr>
     </w:lvl>
-    <w:lvl w:ilvl="2" w:tplc="08090005" w:tentative="1">
+    <w:lvl w:ilvl="2" w:tplc="08090005">
       <w:start w:val="1"/>
       <w:numFmt w:val="bullet"/>
       <w:lvlText w:val=""/>

</xml_diff>

<commit_message>
ADDING TODAY'S WORK - 07.09.2026
</commit_message>
<xml_diff>
--- a/viva/questions/viva_questions_DRAFT_1.docx
+++ b/viva/questions/viva_questions_DRAFT_1.docx
@@ -56,15 +56,7 @@
         <w:t>.</w:t>
       </w:r>
       <w:r>
-        <w:t xml:space="preserve"> Projects include Seasonal Coronaviruses, Measles, Mumps, Parainfluenza, Adenoviruses, Enteroviruses, </w:t>
-      </w:r>
-      <w:proofErr w:type="spellStart"/>
-      <w:r>
-        <w:t>Sapovirus</w:t>
-      </w:r>
-      <w:proofErr w:type="spellEnd"/>
-      <w:r>
-        <w:t xml:space="preserve"> and Astroviru</w:t>
+        <w:t xml:space="preserve"> Projects include Seasonal Coronaviruses, Measles, Mumps, Parainfluenza, Adenoviruses, Enteroviruses, Sapovirus and Astroviru</w:t>
       </w:r>
       <w:r>
         <w:t>s.</w:t>
@@ -208,23 +200,7 @@
           <w:b/>
           <w:bCs/>
         </w:rPr>
-        <w:t xml:space="preserve">For pathway analysis, I attempted </w:t>
-      </w:r>
-      <w:proofErr w:type="gramStart"/>
-      <w:r>
-        <w:rPr>
-          <w:b/>
-          <w:bCs/>
-        </w:rPr>
-        <w:t>many different ways</w:t>
-      </w:r>
-      <w:proofErr w:type="gramEnd"/>
-      <w:r>
-        <w:rPr>
-          <w:b/>
-          <w:bCs/>
-        </w:rPr>
-        <w:t xml:space="preserve"> to reduce the target gene list and different software to perform the analysis.</w:t>
+        <w:t>For pathway analysis, I attempted many different ways to reduce the target gene list and different software to perform the analysis.</w:t>
       </w:r>
     </w:p>
     <w:p>
@@ -403,35 +379,7 @@
         <w:rPr>
           <w:b/>
         </w:rPr>
-        <w:t xml:space="preserve">miRNA is only one of many different types of RNA in </w:t>
-      </w:r>
-      <w:proofErr w:type="gramStart"/>
-      <w:r>
-        <w:rPr>
-          <w:b/>
-        </w:rPr>
-        <w:t>EVs</w:t>
-      </w:r>
-      <w:proofErr w:type="gramEnd"/>
-      <w:r>
-        <w:rPr>
-          <w:b/>
-        </w:rPr>
-        <w:t xml:space="preserve"> and a lot of the RNA-</w:t>
-      </w:r>
-      <w:proofErr w:type="spellStart"/>
-      <w:r>
-        <w:rPr>
-          <w:b/>
-        </w:rPr>
-        <w:t>seq</w:t>
-      </w:r>
-      <w:proofErr w:type="spellEnd"/>
-      <w:r>
-        <w:rPr>
-          <w:b/>
-        </w:rPr>
-        <w:t xml:space="preserve"> data was unknown.</w:t>
+        <w:t>miRNA is only one of many different types of RNA in EVs and a lot of the RNA-seq data was unknown.</w:t>
       </w:r>
     </w:p>
     <w:p>
@@ -638,39 +586,14 @@
         <w:rPr>
           <w:b/>
         </w:rPr>
-        <w:t xml:space="preserve">had to decide between 17 </w:t>
-      </w:r>
-      <w:proofErr w:type="spellStart"/>
-      <w:r>
-        <w:rPr>
-          <w:b/>
-        </w:rPr>
-        <w:t>nt</w:t>
-      </w:r>
-      <w:proofErr w:type="spellEnd"/>
-      <w:r>
-        <w:rPr>
-          <w:b/>
-        </w:rPr>
-        <w:t xml:space="preserve">, 18 </w:t>
-      </w:r>
-      <w:proofErr w:type="spellStart"/>
-      <w:r>
-        <w:rPr>
-          <w:b/>
-        </w:rPr>
-        <w:t>nt</w:t>
-      </w:r>
-      <w:proofErr w:type="spellEnd"/>
-      <w:r>
-        <w:rPr>
-          <w:b/>
-        </w:rPr>
-        <w:t xml:space="preserve"> and no max length.</w:t>
-      </w:r>
-    </w:p>
-    <w:p>
-      <w:r>
+        <w:t>had to decide between 17 nt, 18 nt and no max length.</w:t>
+      </w:r>
+    </w:p>
+    <w:p>
+      <w:r>
+        <w:rPr>
+          <w:noProof/>
+        </w:rPr>
         <w:lastRenderedPageBreak/>
         <w:drawing>
           <wp:inline distT="0" distB="0" distL="0" distR="0" wp14:anchorId="3531BFC9" wp14:editId="5B5BD14E">
@@ -715,23 +638,7 @@
         <w:sym w:font="Wingdings" w:char="F0E0"/>
       </w:r>
       <w:r>
-        <w:t xml:space="preserve"> results from 17 </w:t>
-      </w:r>
-      <w:proofErr w:type="spellStart"/>
-      <w:r>
-        <w:t>nt</w:t>
-      </w:r>
-      <w:proofErr w:type="spellEnd"/>
-      <w:r>
-        <w:t xml:space="preserve"> vs 18 </w:t>
-      </w:r>
-      <w:proofErr w:type="spellStart"/>
-      <w:r>
-        <w:t>nt</w:t>
-      </w:r>
-      <w:proofErr w:type="spellEnd"/>
-      <w:r>
-        <w:t xml:space="preserve"> </w:t>
+        <w:t xml:space="preserve"> results from 17 nt vs 18 nt </w:t>
       </w:r>
     </w:p>
     <w:p>
@@ -979,23 +886,7 @@
           <w:b/>
           <w:bCs/>
         </w:rPr>
-        <w:t xml:space="preserve">Some common websites that other people had used (e.g., DIANA) were unavailable during the study, and </w:t>
-      </w:r>
-      <w:proofErr w:type="spellStart"/>
-      <w:r>
-        <w:rPr>
-          <w:b/>
-          <w:bCs/>
-        </w:rPr>
-        <w:t>miEAA</w:t>
-      </w:r>
-      <w:proofErr w:type="spellEnd"/>
-      <w:r>
-        <w:rPr>
-          <w:b/>
-          <w:bCs/>
-        </w:rPr>
-        <w:t xml:space="preserve"> servers were down for approx. 1 month as well as the HPC problems.</w:t>
+        <w:t>Some common websites that other people had used (e.g., DIANA) were unavailable during the study, and miEAA servers were down for approx. 1 month as well as the HPC problems.</w:t>
       </w:r>
     </w:p>
     <w:p>
@@ -1233,35 +1124,7 @@
         <w:rPr>
           <w:b/>
         </w:rPr>
-        <w:t xml:space="preserve">Low miRNA abundance in the Calu-3 dataset was verified both by </w:t>
-      </w:r>
-      <w:proofErr w:type="spellStart"/>
-      <w:r>
-        <w:rPr>
-          <w:b/>
-        </w:rPr>
-        <w:t>miRTrace</w:t>
-      </w:r>
-      <w:proofErr w:type="spellEnd"/>
-      <w:r>
-        <w:rPr>
-          <w:b/>
-        </w:rPr>
-        <w:t xml:space="preserve"> and by mapping reads to known miRNA sequences using </w:t>
-      </w:r>
-      <w:proofErr w:type="spellStart"/>
-      <w:r>
-        <w:rPr>
-          <w:b/>
-        </w:rPr>
-        <w:t>miRBase</w:t>
-      </w:r>
-      <w:proofErr w:type="spellEnd"/>
-      <w:r>
-        <w:rPr>
-          <w:b/>
-        </w:rPr>
-        <w:t>.</w:t>
+        <w:t>Low miRNA abundance in the Calu-3 dataset was verified both by miRTrace and by mapping reads to known miRNA sequences using miRBase.</w:t>
       </w:r>
     </w:p>
     <w:p>
@@ -1337,6 +1200,26 @@
           <w:b/>
           <w:bCs/>
         </w:rPr>
+        <w:t>However, it wasn’t until halfway through the project when the pathway analysis method was revealed that I realised what the aim should be.</w:t>
+      </w:r>
+    </w:p>
+    <w:p>
+      <w:pPr>
+        <w:pStyle w:val="ListParagraph"/>
+        <w:numPr>
+          <w:ilvl w:val="0"/>
+          <w:numId w:val="9"/>
+        </w:numPr>
+        <w:rPr>
+          <w:b/>
+          <w:bCs/>
+        </w:rPr>
+      </w:pPr>
+      <w:r>
+        <w:rPr>
+          <w:b/>
+          <w:bCs/>
+        </w:rPr>
         <w:t xml:space="preserve">I found that differential expression analysis </w:t>
       </w:r>
       <w:r>
@@ -1371,23 +1254,7 @@
           <w:b/>
           <w:bCs/>
         </w:rPr>
-        <w:t xml:space="preserve">I then wanted to make it </w:t>
-      </w:r>
-      <w:proofErr w:type="gramStart"/>
-      <w:r>
-        <w:rPr>
-          <w:b/>
-          <w:bCs/>
-        </w:rPr>
-        <w:t>really user-friendly</w:t>
-      </w:r>
-      <w:proofErr w:type="gramEnd"/>
-      <w:r>
-        <w:rPr>
-          <w:b/>
-          <w:bCs/>
-        </w:rPr>
-        <w:t xml:space="preserve"> for non-bioinformaticians but did not implement this due to time constraints.</w:t>
+        <w:t>I then wanted to make it really user-friendly for non-bioinformaticians but did not implement this due to time constraints.</w:t>
       </w:r>
     </w:p>
     <w:p/>
@@ -1421,23 +1288,7 @@
           <w:b/>
           <w:bCs/>
         </w:rPr>
-        <w:t>Can you please expand on ‘</w:t>
-      </w:r>
-      <w:proofErr w:type="gramStart"/>
-      <w:r>
-        <w:rPr>
-          <w:b/>
-          <w:bCs/>
-        </w:rPr>
-        <w:t>issues’</w:t>
-      </w:r>
-      <w:proofErr w:type="gramEnd"/>
-      <w:r>
-        <w:rPr>
-          <w:b/>
-          <w:bCs/>
-        </w:rPr>
-        <w:t>?</w:t>
+        <w:t>Can you please expand on ‘issues’?</w:t>
       </w:r>
     </w:p>
     <w:p/>
@@ -1467,23 +1318,8 @@
           <w:b/>
           <w:bCs/>
         </w:rPr>
-        <w:t xml:space="preserve">It would be </w:t>
-      </w:r>
-      <w:proofErr w:type="gramStart"/>
-      <w:r>
-        <w:rPr>
-          <w:b/>
-          <w:bCs/>
-        </w:rPr>
-        <w:t>really good</w:t>
-      </w:r>
-      <w:proofErr w:type="gramEnd"/>
-      <w:r>
-        <w:rPr>
-          <w:b/>
-          <w:bCs/>
-        </w:rPr>
-        <w:t xml:space="preserve"> if I could apply context-specific filtering or matched miRNA-mRNA data to filter target gene lists.</w:t>
+        <w:lastRenderedPageBreak/>
+        <w:t>It would be really good if I could apply context-specific filtering or matched miRNA-mRNA data to filter target gene lists.</w:t>
       </w:r>
     </w:p>
     <w:p>
@@ -1499,263 +1335,221 @@
           <w:b/>
           <w:bCs/>
         </w:rPr>
+        <w:t>It would be good to take a closer look at the pathways that were identified in the primary HBECs.</w:t>
+      </w:r>
+    </w:p>
+    <w:p>
+      <w:pPr>
+        <w:pStyle w:val="ListParagraph"/>
+        <w:numPr>
+          <w:ilvl w:val="0"/>
+          <w:numId w:val="10"/>
+        </w:numPr>
+      </w:pPr>
+      <w:r>
+        <w:rPr>
+          <w:b/>
+          <w:bCs/>
+        </w:rPr>
+        <w:t>I want to perform a formal validation, comparing these results to TAmiRNA and also to compare against other pipelines and datasets.</w:t>
+      </w:r>
+    </w:p>
+    <w:p>
+      <w:pPr>
+        <w:pStyle w:val="ListParagraph"/>
+        <w:numPr>
+          <w:ilvl w:val="0"/>
+          <w:numId w:val="10"/>
+        </w:numPr>
+      </w:pPr>
+      <w:r>
+        <w:rPr>
+          <w:b/>
+          <w:bCs/>
+        </w:rPr>
+        <w:t xml:space="preserve">I wanted to make it very user-friendly for non-bioinformaticians, with help buttons and tutorials, and a very simple GUI. </w:t>
+      </w:r>
+    </w:p>
+    <w:p>
+      <w:pPr>
+        <w:pStyle w:val="ListParagraph"/>
+        <w:numPr>
+          <w:ilvl w:val="0"/>
+          <w:numId w:val="10"/>
+        </w:numPr>
+      </w:pPr>
+      <w:r>
+        <w:rPr>
+          <w:b/>
+          <w:bCs/>
+        </w:rPr>
+        <w:t>I wanted to create a web app that compared the results from all different permutations of parameters and forms of analyses.</w:t>
+      </w:r>
+    </w:p>
+    <w:p>
+      <w:pPr>
+        <w:pStyle w:val="ListParagraph"/>
+        <w:numPr>
+          <w:ilvl w:val="0"/>
+          <w:numId w:val="10"/>
+        </w:numPr>
+      </w:pPr>
+      <w:r>
+        <w:rPr>
+          <w:b/>
+          <w:bCs/>
+        </w:rPr>
+        <w:t>Wanted to make a single output report that would include all the main figures and findings and with interactive plots to allow easy navigation through the results.</w:t>
+      </w:r>
+    </w:p>
+    <w:p/>
+    <w:p>
+      <w:pPr>
+        <w:pStyle w:val="ListParagraph"/>
+        <w:numPr>
+          <w:ilvl w:val="0"/>
+          <w:numId w:val="2"/>
+        </w:numPr>
+        <w:ind w:left="360"/>
+      </w:pPr>
+      <w:r>
+        <w:t>Question - How others might use or develop your research</w:t>
+      </w:r>
+    </w:p>
+    <w:p>
+      <w:pPr>
+        <w:pStyle w:val="ListParagraph"/>
+        <w:numPr>
+          <w:ilvl w:val="0"/>
+          <w:numId w:val="11"/>
+        </w:numPr>
+      </w:pPr>
+      <w:r>
+        <w:rPr>
+          <w:b/>
+        </w:rPr>
+        <w:t>Can be used to encourage the development of an in-house transcriptomic workflow in the lab so they don’t need to rely on outsourcing.</w:t>
+      </w:r>
+    </w:p>
+    <w:p>
+      <w:pPr>
+        <w:pStyle w:val="ListParagraph"/>
+        <w:numPr>
+          <w:ilvl w:val="0"/>
+          <w:numId w:val="11"/>
+        </w:numPr>
+      </w:pPr>
+      <w:r>
+        <w:rPr>
+          <w:b/>
+        </w:rPr>
+        <w:t>It prompts the lab to review the quality control data more thoroughly as this is something that can be easily overlooked. This has already been acknowledged in the Calu-3 study.</w:t>
+      </w:r>
+    </w:p>
+    <w:p>
+      <w:pPr>
+        <w:pStyle w:val="ListParagraph"/>
+        <w:numPr>
+          <w:ilvl w:val="0"/>
+          <w:numId w:val="11"/>
+        </w:numPr>
+      </w:pPr>
+      <w:r>
+        <w:rPr>
+          <w:b/>
+        </w:rPr>
+        <w:t>It is a cautionary tale that reenforces the importance of experimental design and shows that transcriptomics on improper data can be a waste of money and can lead to spurious results.</w:t>
+      </w:r>
+    </w:p>
+    <w:p>
+      <w:pPr>
+        <w:pStyle w:val="ListParagraph"/>
+        <w:numPr>
+          <w:ilvl w:val="0"/>
+          <w:numId w:val="11"/>
+        </w:numPr>
+      </w:pPr>
+      <w:r>
+        <w:rPr>
+          <w:b/>
+        </w:rPr>
+        <w:t>The primary HBEC dataset provides more evidence for allergen-exposed effects on EV miRNA cargo, which is relatively undertstudied.</w:t>
+      </w:r>
+    </w:p>
+    <w:p/>
+    <w:p>
+      <w:pPr>
+        <w:pStyle w:val="Heading2"/>
+      </w:pPr>
+      <w:r>
+        <w:t>Anticipated Questions</w:t>
+      </w:r>
+    </w:p>
+    <w:p/>
+    <w:p>
+      <w:pPr>
+        <w:pStyle w:val="Heading3"/>
+      </w:pPr>
+      <w:r>
+        <w:t>Introduction</w:t>
+      </w:r>
+    </w:p>
+    <w:p>
+      <w:pPr>
+        <w:pStyle w:val="ListParagraph"/>
+        <w:numPr>
+          <w:ilvl w:val="0"/>
+          <w:numId w:val="2"/>
+        </w:numPr>
+        <w:ind w:left="360"/>
+      </w:pPr>
+      <w:r>
+        <w:t>Question - What is a miRNA?</w:t>
+      </w:r>
+    </w:p>
+    <w:p>
+      <w:pPr>
+        <w:pStyle w:val="ListParagraph"/>
+        <w:numPr>
+          <w:ilvl w:val="0"/>
+          <w:numId w:val="12"/>
+        </w:numPr>
+      </w:pPr>
+      <w:r>
+        <w:rPr>
+          <w:b/>
+        </w:rPr>
+        <w:t xml:space="preserve">Micro RNAs are short, non-coding RNAs, approximately 18–30 nt long, with a modal length of 21–23 nt, which bind to the 3’ UTR region of a messenger RNA and suppress its expression.  </w:t>
+      </w:r>
+    </w:p>
+    <w:p/>
+    <w:p>
+      <w:pPr>
+        <w:pStyle w:val="ListParagraph"/>
+        <w:numPr>
+          <w:ilvl w:val="0"/>
+          <w:numId w:val="2"/>
+        </w:numPr>
+        <w:ind w:left="360"/>
+      </w:pPr>
+      <w:r>
+        <w:t>Question - What is allergic sensitisation?</w:t>
+      </w:r>
+    </w:p>
+    <w:p>
+      <w:pPr>
+        <w:pStyle w:val="ListParagraph"/>
+        <w:numPr>
+          <w:ilvl w:val="0"/>
+          <w:numId w:val="12"/>
+        </w:numPr>
+      </w:pPr>
+      <w:r>
+        <w:rPr>
+          <w:b/>
+          <w:bCs/>
+        </w:rPr>
         <w:lastRenderedPageBreak/>
-        <w:t>It would be good to take a closer look at the pathways that were identified in the primary HBECs.</w:t>
-      </w:r>
-    </w:p>
-    <w:p>
-      <w:pPr>
-        <w:pStyle w:val="ListParagraph"/>
-        <w:numPr>
-          <w:ilvl w:val="0"/>
-          <w:numId w:val="10"/>
-        </w:numPr>
-      </w:pPr>
-      <w:r>
-        <w:rPr>
-          <w:b/>
-          <w:bCs/>
-        </w:rPr>
-        <w:t xml:space="preserve">I want to perform a formal validation, comparing these results to TAmiRNA </w:t>
-      </w:r>
-      <w:proofErr w:type="gramStart"/>
-      <w:r>
-        <w:rPr>
-          <w:b/>
-          <w:bCs/>
-        </w:rPr>
-        <w:t>and also</w:t>
-      </w:r>
-      <w:proofErr w:type="gramEnd"/>
-      <w:r>
-        <w:rPr>
-          <w:b/>
-          <w:bCs/>
-        </w:rPr>
-        <w:t xml:space="preserve"> to compare against other pipelines and datasets.</w:t>
-      </w:r>
-    </w:p>
-    <w:p>
-      <w:pPr>
-        <w:pStyle w:val="ListParagraph"/>
-        <w:numPr>
-          <w:ilvl w:val="0"/>
-          <w:numId w:val="10"/>
-        </w:numPr>
-      </w:pPr>
-      <w:r>
-        <w:rPr>
-          <w:b/>
-          <w:bCs/>
-        </w:rPr>
-        <w:t xml:space="preserve">I wanted to make it very user-friendly for non-bioinformaticians, with help buttons and tutorials, and a very simple GUI. </w:t>
-      </w:r>
-    </w:p>
-    <w:p>
-      <w:pPr>
-        <w:pStyle w:val="ListParagraph"/>
-        <w:numPr>
-          <w:ilvl w:val="0"/>
-          <w:numId w:val="10"/>
-        </w:numPr>
-      </w:pPr>
-      <w:r>
-        <w:rPr>
-          <w:b/>
-          <w:bCs/>
-        </w:rPr>
-        <w:t>I wanted to create a web app that compared the results from all different permutations of parameters and forms of analyses.</w:t>
-      </w:r>
-    </w:p>
-    <w:p/>
-    <w:p>
-      <w:pPr>
-        <w:pStyle w:val="ListParagraph"/>
-        <w:numPr>
-          <w:ilvl w:val="0"/>
-          <w:numId w:val="2"/>
-        </w:numPr>
-        <w:ind w:left="360"/>
-      </w:pPr>
-      <w:r>
-        <w:t>Question - How others might use or develop your research</w:t>
-      </w:r>
-    </w:p>
-    <w:p>
-      <w:pPr>
-        <w:pStyle w:val="ListParagraph"/>
-        <w:numPr>
-          <w:ilvl w:val="0"/>
-          <w:numId w:val="11"/>
-        </w:numPr>
-      </w:pPr>
-      <w:r>
-        <w:rPr>
-          <w:b/>
-        </w:rPr>
-        <w:t>Can be used to encourage the development of an in-house transcriptomic workflow in the lab so they don’t need to rely on outsourcing.</w:t>
-      </w:r>
-    </w:p>
-    <w:p>
-      <w:pPr>
-        <w:pStyle w:val="ListParagraph"/>
-        <w:numPr>
-          <w:ilvl w:val="0"/>
-          <w:numId w:val="11"/>
-        </w:numPr>
-      </w:pPr>
-      <w:r>
-        <w:rPr>
-          <w:b/>
-        </w:rPr>
-        <w:t>It prompts the lab to review the quality control data more thoroughly as this is something that can be easily overlooked. This has already been acknowledged in the Calu-3 study.</w:t>
-      </w:r>
-    </w:p>
-    <w:p>
-      <w:pPr>
-        <w:pStyle w:val="ListParagraph"/>
-        <w:numPr>
-          <w:ilvl w:val="0"/>
-          <w:numId w:val="11"/>
-        </w:numPr>
-      </w:pPr>
-      <w:r>
-        <w:rPr>
-          <w:b/>
-        </w:rPr>
-        <w:t>It is a cautionary tale that reenforces the importance of experimental design and shows that transcriptomics on improper data can be a waste of money and can lead to spurious results.</w:t>
-      </w:r>
-    </w:p>
-    <w:p>
-      <w:pPr>
-        <w:pStyle w:val="ListParagraph"/>
-        <w:numPr>
-          <w:ilvl w:val="0"/>
-          <w:numId w:val="11"/>
-        </w:numPr>
-      </w:pPr>
-      <w:r>
-        <w:rPr>
-          <w:b/>
-        </w:rPr>
-        <w:t xml:space="preserve">The primary HBEC dataset provides more evidence for allergen-exposed effects on EV miRNA cargo, which is relatively </w:t>
-      </w:r>
-      <w:proofErr w:type="spellStart"/>
-      <w:r>
-        <w:rPr>
-          <w:b/>
-        </w:rPr>
-        <w:t>undertstudied</w:t>
-      </w:r>
-      <w:proofErr w:type="spellEnd"/>
-      <w:r>
-        <w:rPr>
-          <w:b/>
-        </w:rPr>
-        <w:t>.</w:t>
-      </w:r>
-    </w:p>
-    <w:p/>
-    <w:p>
-      <w:pPr>
-        <w:pStyle w:val="Heading2"/>
-      </w:pPr>
-      <w:r>
-        <w:t>Anticipated Questions</w:t>
-      </w:r>
-    </w:p>
-    <w:p/>
-    <w:p>
-      <w:pPr>
-        <w:pStyle w:val="Heading3"/>
-      </w:pPr>
-      <w:r>
-        <w:t>Introduction</w:t>
-      </w:r>
-    </w:p>
-    <w:p>
-      <w:pPr>
-        <w:pStyle w:val="ListParagraph"/>
-        <w:numPr>
-          <w:ilvl w:val="0"/>
-          <w:numId w:val="2"/>
-        </w:numPr>
-        <w:ind w:left="360"/>
-      </w:pPr>
-      <w:r>
-        <w:t>Question - What is a miRNA?</w:t>
-      </w:r>
-    </w:p>
-    <w:p>
-      <w:pPr>
-        <w:pStyle w:val="ListParagraph"/>
-        <w:numPr>
-          <w:ilvl w:val="0"/>
-          <w:numId w:val="12"/>
-        </w:numPr>
-      </w:pPr>
-      <w:r>
-        <w:rPr>
-          <w:b/>
-        </w:rPr>
-        <w:t xml:space="preserve">Micro RNAs are short, non-coding RNAs, approximately 18–30 </w:t>
-      </w:r>
-      <w:proofErr w:type="spellStart"/>
-      <w:r>
-        <w:rPr>
-          <w:b/>
-        </w:rPr>
-        <w:t>nt</w:t>
-      </w:r>
-      <w:proofErr w:type="spellEnd"/>
-      <w:r>
-        <w:rPr>
-          <w:b/>
-        </w:rPr>
-        <w:t xml:space="preserve"> long, with a modal length of 21–23 </w:t>
-      </w:r>
-      <w:proofErr w:type="spellStart"/>
-      <w:r>
-        <w:rPr>
-          <w:b/>
-        </w:rPr>
-        <w:t>nt</w:t>
-      </w:r>
-      <w:proofErr w:type="spellEnd"/>
-      <w:r>
-        <w:rPr>
-          <w:b/>
-        </w:rPr>
-        <w:t xml:space="preserve">, which bind to the 3’ UTR region of a messenger RNA and suppress its expression.  </w:t>
-      </w:r>
-    </w:p>
-    <w:p/>
-    <w:p>
-      <w:pPr>
-        <w:pStyle w:val="ListParagraph"/>
-        <w:numPr>
-          <w:ilvl w:val="0"/>
-          <w:numId w:val="2"/>
-        </w:numPr>
-        <w:ind w:left="360"/>
-      </w:pPr>
-      <w:r>
-        <w:t>Question - What is allergic sensitisation?</w:t>
-      </w:r>
-    </w:p>
-    <w:p>
-      <w:pPr>
-        <w:pStyle w:val="ListParagraph"/>
-        <w:numPr>
-          <w:ilvl w:val="0"/>
-          <w:numId w:val="12"/>
-        </w:numPr>
-      </w:pPr>
-      <w:r>
-        <w:rPr>
-          <w:b/>
-          <w:bCs/>
-        </w:rPr>
         <w:t>Allergic sensitisation is the development of an allergic response to an allergen that did not previously trigger an allergic reaction.</w:t>
       </w:r>
     </w:p>
@@ -1794,7 +1588,6 @@
         <w:ind w:left="360"/>
       </w:pPr>
       <w:r>
-        <w:lastRenderedPageBreak/>
         <w:t>Question - What is the difference between immune and inflammatory</w:t>
       </w:r>
     </w:p>
@@ -1843,15 +1636,7 @@
         <w:ind w:left="360"/>
       </w:pPr>
       <w:r>
-        <w:t xml:space="preserve">Question - How many different types of </w:t>
-      </w:r>
-      <w:proofErr w:type="gramStart"/>
-      <w:r>
-        <w:t>miRNA</w:t>
-      </w:r>
-      <w:proofErr w:type="gramEnd"/>
-      <w:r>
-        <w:t xml:space="preserve"> are there? </w:t>
+        <w:t xml:space="preserve">Question - How many different types of miRNA are there? </w:t>
       </w:r>
     </w:p>
     <w:p>
@@ -2054,6 +1839,7 @@
           <w:b/>
           <w:bCs/>
         </w:rPr>
+        <w:lastRenderedPageBreak/>
         <w:t xml:space="preserve">I found that </w:t>
       </w:r>
       <w:r>
@@ -2106,7 +1892,6 @@
         <w:rPr>
           <w:b/>
         </w:rPr>
-        <w:lastRenderedPageBreak/>
         <w:t>miRNA-level:</w:t>
       </w:r>
     </w:p>
@@ -2151,15 +1936,7 @@
         <w:ind w:left="360"/>
       </w:pPr>
       <w:r>
-        <w:t>Question - Why did you use a higher significance threshold for miRNA-level enrichment (</w:t>
-      </w:r>
-      <w:proofErr w:type="spellStart"/>
-      <w:r>
-        <w:t>Padj</w:t>
-      </w:r>
-      <w:proofErr w:type="spellEnd"/>
-      <w:r>
-        <w:t xml:space="preserve"> &lt; 0</w:t>
+        <w:t>Question - Why did you use a higher significance threshold for miRNA-level enrichment (Padj &lt; 0</w:t>
       </w:r>
       <w:r>
         <w:rPr>
@@ -2168,15 +1945,7 @@
         <w:t>.</w:t>
       </w:r>
       <w:r>
-        <w:t>05) over target gene (</w:t>
-      </w:r>
-      <w:proofErr w:type="spellStart"/>
-      <w:r>
-        <w:t>Padj</w:t>
-      </w:r>
-      <w:proofErr w:type="spellEnd"/>
-      <w:r>
-        <w:t xml:space="preserve"> &lt; 0</w:t>
+        <w:t>05) over target gene (Padj &lt; 0</w:t>
       </w:r>
       <w:r>
         <w:rPr>
@@ -2280,31 +2049,7 @@
           <w:szCs w:val="21"/>
           <w:shd w:val="clear" w:color="auto" w:fill="FFFFFF"/>
         </w:rPr>
-        <w:t>“TMM is recommended for most RNA-</w:t>
-      </w:r>
-      <w:proofErr w:type="spellStart"/>
-      <w:r>
-        <w:rPr>
-          <w:rFonts w:ascii="Segoe UI" w:hAnsi="Segoe UI" w:cs="Segoe UI"/>
-          <w:b/>
-          <w:bCs/>
-          <w:sz w:val="21"/>
-          <w:szCs w:val="21"/>
-          <w:shd w:val="clear" w:color="auto" w:fill="FFFFFF"/>
-        </w:rPr>
-        <w:t>Seq</w:t>
-      </w:r>
-      <w:proofErr w:type="spellEnd"/>
-      <w:r>
-        <w:rPr>
-          <w:rFonts w:ascii="Segoe UI" w:hAnsi="Segoe UI" w:cs="Segoe UI"/>
-          <w:b/>
-          <w:bCs/>
-          <w:sz w:val="21"/>
-          <w:szCs w:val="21"/>
-          <w:shd w:val="clear" w:color="auto" w:fill="FFFFFF"/>
-        </w:rPr>
-        <w:t xml:space="preserve"> data where the majority (more than half) of the genes are believed not differentially expressed between any pair of the samples” </w:t>
+        <w:t xml:space="preserve">“TMM is recommended for most RNA-Seq data where the majority (more than half) of the genes are believed not differentially expressed between any pair of the samples” </w:t>
       </w:r>
       <w:r>
         <w:rPr>
@@ -2409,9 +2154,22 @@
         <w:rPr>
           <w:b/>
         </w:rPr>
+        <w:lastRenderedPageBreak/>
         <w:t>This was performed because I noticed that some DE miRNAs were driven by a single control replicate that had different expression to the remaining replicates.</w:t>
       </w:r>
     </w:p>
+    <w:p>
+      <w:pPr>
+        <w:pStyle w:val="ListParagraph"/>
+        <w:numPr>
+          <w:ilvl w:val="1"/>
+          <w:numId w:val="18"/>
+        </w:numPr>
+      </w:pPr>
+      <w:r>
+        <w:t>However, I only really checked the expression levels of untreated and dose 24 samples therefore other conditions may have been likewise disparate between replicates and the dose 24 condition may have been concordant as the cells were all dying due to the high exposure.</w:t>
+      </w:r>
+    </w:p>
     <w:p/>
     <w:p>
       <w:pPr>
@@ -2439,7 +2197,6 @@
           <w:b/>
           <w:bCs/>
         </w:rPr>
-        <w:lastRenderedPageBreak/>
         <w:t>I looked at</w:t>
       </w:r>
       <w:r>
@@ -2753,6 +2510,7 @@
         <w:ind w:left="360"/>
       </w:pPr>
       <w:r>
+        <w:lastRenderedPageBreak/>
         <w:t>Question - Why do the same pathways appear in both upregulated and downregulated DE miRNAs for target gene-level enrichment?</w:t>
       </w:r>
     </w:p>
@@ -2836,7 +2594,6 @@
         <w:ind w:left="360"/>
       </w:pPr>
       <w:r>
-        <w:lastRenderedPageBreak/>
         <w:t>Question - How do WNT and NOTCH regulate epithelial barrier integrity in the upregulated target gene pathways and RHO GTPases in the downregulated?</w:t>
       </w:r>
     </w:p>
@@ -3130,17 +2887,8 @@
           <w:b/>
           <w:bCs/>
         </w:rPr>
-        <w:t xml:space="preserve">IL-4 and IL-13 are the same pathway annotation in </w:t>
-      </w:r>
-      <w:proofErr w:type="spellStart"/>
-      <w:r>
-        <w:rPr>
-          <w:b/>
-          <w:bCs/>
-        </w:rPr>
-        <w:t>Reactome</w:t>
-      </w:r>
-      <w:proofErr w:type="spellEnd"/>
+        <w:t>IL-4 and IL-13 are the same pathway annotation in Reactome</w:t>
+      </w:r>
     </w:p>
     <w:p>
       <w:pPr>
@@ -3252,23 +3000,7 @@
           <w:b/>
           <w:bCs/>
         </w:rPr>
-        <w:t xml:space="preserve">The pattern I observed of high doses having more </w:t>
-      </w:r>
-      <w:proofErr w:type="gramStart"/>
-      <w:r>
-        <w:rPr>
-          <w:b/>
-          <w:bCs/>
-        </w:rPr>
-        <w:t>miRNA</w:t>
-      </w:r>
-      <w:proofErr w:type="gramEnd"/>
-      <w:r>
-        <w:rPr>
-          <w:b/>
-          <w:bCs/>
-        </w:rPr>
-        <w:t xml:space="preserve"> may be a technical artefact, not representative of the population. Therefore, there wasn’t a trend to begin with.</w:t>
+        <w:t>The pattern I observed of high doses having more miRNA may be a technical artefact, not representative of the population. Therefore, there wasn’t a trend to begin with.</w:t>
       </w:r>
     </w:p>
     <w:p>
@@ -3288,7 +3020,6 @@
           <w:b/>
           <w:bCs/>
         </w:rPr>
-        <w:lastRenderedPageBreak/>
         <w:t>There may have been a mix</w:t>
       </w:r>
       <w:r>
@@ -3336,23 +3067,27 @@
           <w:b/>
           <w:bCs/>
         </w:rPr>
-        <w:t xml:space="preserve">I would like to look at the distribution of reads in this sample to see whether it is only a few miRNAs that have caused the massive increase or </w:t>
-      </w:r>
-      <w:proofErr w:type="gramStart"/>
-      <w:r>
-        <w:rPr>
-          <w:b/>
-          <w:bCs/>
-        </w:rPr>
-        <w:t>it is</w:t>
-      </w:r>
-      <w:proofErr w:type="gramEnd"/>
-      <w:r>
-        <w:rPr>
-          <w:b/>
-          <w:bCs/>
-        </w:rPr>
-        <w:t xml:space="preserve"> a blanket increase of all detected miRNA expression.</w:t>
+        <w:t>I would like to look at the distribution of reads in this sample to see whether it is only a few miRNAs that have caused the massive increase or it is a blanket increase of all detected miRNA expression.</w:t>
+      </w:r>
+    </w:p>
+    <w:p>
+      <w:pPr>
+        <w:pStyle w:val="ListParagraph"/>
+        <w:numPr>
+          <w:ilvl w:val="0"/>
+          <w:numId w:val="24"/>
+        </w:numPr>
+        <w:rPr>
+          <w:b/>
+          <w:bCs/>
+        </w:rPr>
+      </w:pPr>
+      <w:r>
+        <w:rPr>
+          <w:b/>
+          <w:bCs/>
+        </w:rPr>
+        <w:t>Would also be good to look at other RNA species to see if they were affected since there wasn’t much effect on the rRNA or tRNA.</w:t>
       </w:r>
     </w:p>
     <w:p/>
@@ -3379,15 +3114,7 @@
         <w:ind w:left="360"/>
       </w:pPr>
       <w:r>
-        <w:t>Question - Why is RT-qPCR necessary if you already have small RNA-</w:t>
-      </w:r>
-      <w:proofErr w:type="spellStart"/>
-      <w:r>
-        <w:t>seq</w:t>
-      </w:r>
-      <w:proofErr w:type="spellEnd"/>
-      <w:r>
-        <w:t xml:space="preserve"> data?</w:t>
+        <w:t>Question - Why is RT-qPCR necessary if you already have small RNA-seq data?</w:t>
       </w:r>
     </w:p>
     <w:p>
@@ -3422,17 +3149,8 @@
           <w:b/>
           <w:bCs/>
         </w:rPr>
-        <w:t>RNA-</w:t>
-      </w:r>
-      <w:proofErr w:type="spellStart"/>
-      <w:r>
-        <w:rPr>
-          <w:b/>
-          <w:bCs/>
-        </w:rPr>
-        <w:t>seq</w:t>
-      </w:r>
-      <w:proofErr w:type="spellEnd"/>
+        <w:t>RNA-seq</w:t>
+      </w:r>
       <w:r>
         <w:rPr>
           <w:b/>
@@ -3452,13 +3170,8 @@
       <w:r>
         <w:t>“</w:t>
       </w:r>
-      <w:proofErr w:type="gramStart"/>
-      <w:r>
-        <w:t>specificity</w:t>
-      </w:r>
-      <w:proofErr w:type="gramEnd"/>
-      <w:r>
-        <w:t xml:space="preserve"> is still a major issue because miRNA molecules are very short and many miRNAs differ by only one or a few bases</w:t>
+      <w:r>
+        <w:t>specificity is still a major issue because miRNA molecules are very short and many miRNAs differ by only one or a few bases</w:t>
       </w:r>
       <w:r>
         <w:t xml:space="preserve">” </w:t>
@@ -3513,6 +3226,7 @@
         <w:rPr>
           <w:b/>
         </w:rPr>
+        <w:lastRenderedPageBreak/>
         <w:t>More samples / donors to verify that the results didn’t occur due to technical artefacts.</w:t>
       </w:r>
     </w:p>
@@ -3587,7 +3301,6 @@
         <w:rPr>
           <w:b/>
         </w:rPr>
-        <w:lastRenderedPageBreak/>
         <w:t>I doubt it is a one-size-fits-all answer, but 2,500 and 44,000 average reads seem very low when you compare it to RNA-seq.</w:t>
       </w:r>
     </w:p>
@@ -3703,15 +3416,7 @@
         <w:t xml:space="preserve">I tested </w:t>
       </w:r>
       <w:r>
-        <w:t xml:space="preserve">how many target genes each miRNA </w:t>
-      </w:r>
-      <w:proofErr w:type="gramStart"/>
-      <w:r>
-        <w:t>had</w:t>
-      </w:r>
-      <w:proofErr w:type="gramEnd"/>
-      <w:r>
-        <w:t xml:space="preserve"> and these ranged from a couple hundred to 10k.</w:t>
+        <w:t>how many target genes each miRNA had and these ranged from a couple hundred to 10k.</w:t>
       </w:r>
     </w:p>
     <w:p/>
@@ -3767,6 +3472,7 @@
         <w:rPr>
           <w:b/>
         </w:rPr>
+        <w:lastRenderedPageBreak/>
         <w:t>More research is required to verify this result in the Calu-3 dataset as it was underpowered.</w:t>
       </w:r>
     </w:p>
@@ -3859,7 +3565,6 @@
         <w:ind w:left="360"/>
       </w:pPr>
       <w:r>
-        <w:lastRenderedPageBreak/>
         <w:t>Question - What is the significance of being able to handle spike in controls?</w:t>
       </w:r>
     </w:p>
@@ -4057,6 +3762,7 @@
           <w:b/>
           <w:bCs/>
         </w:rPr>
+        <w:lastRenderedPageBreak/>
         <w:t>The pathways were also very complex</w:t>
       </w:r>
       <w:r>
@@ -4088,6 +3794,26 @@
         </w:r>
       </w:hyperlink>
     </w:p>
+    <w:p>
+      <w:pPr>
+        <w:pStyle w:val="ListParagraph"/>
+        <w:numPr>
+          <w:ilvl w:val="0"/>
+          <w:numId w:val="30"/>
+        </w:numPr>
+        <w:rPr>
+          <w:b/>
+          <w:bCs/>
+        </w:rPr>
+      </w:pPr>
+      <w:r>
+        <w:rPr>
+          <w:b/>
+          <w:bCs/>
+        </w:rPr>
+        <w:t>Because I couldn’t justify the thresholds, I didn’t include it in the analysis.</w:t>
+      </w:r>
+    </w:p>
     <w:p/>
     <w:p>
       <w:pPr>
@@ -4147,14 +3873,250 @@
           <w:b/>
           <w:bCs/>
         </w:rPr>
+        <w:t>Additionally, the pathway analysis method development was robust as there were 27 DE miRNAs in the primary HBEC dataset, with an approximate even split of upregulated and downregulated miRNAs which made it ideal for pathway enrichment techniques.</w:t>
+      </w:r>
+    </w:p>
+    <w:p>
+      <w:pPr>
+        <w:pStyle w:val="ListParagraph"/>
+      </w:pPr>
+    </w:p>
+    <w:p/>
+    <w:p>
+      <w:pPr>
+        <w:pStyle w:val="ListParagraph"/>
+        <w:numPr>
+          <w:ilvl w:val="0"/>
+          <w:numId w:val="2"/>
+        </w:numPr>
+        <w:ind w:left="360"/>
+      </w:pPr>
+      <w:r>
+        <w:t>Question – Have rRNA and tRNA been implicated in allergic responses?</w:t>
+      </w:r>
+    </w:p>
+    <w:p>
+      <w:pPr>
+        <w:pStyle w:val="ListParagraph"/>
+        <w:numPr>
+          <w:ilvl w:val="0"/>
+          <w:numId w:val="32"/>
+        </w:numPr>
+      </w:pPr>
+      <w:r>
+        <w:rPr>
+          <w:b/>
+        </w:rPr>
+        <w:t xml:space="preserve">[not seen much about ribosomal </w:t>
+      </w:r>
+      <w:r>
+        <w:rPr>
+          <w:b/>
+        </w:rPr>
+        <w:t xml:space="preserve">or transfer </w:t>
+      </w:r>
+      <w:r>
+        <w:rPr>
+          <w:b/>
+        </w:rPr>
+        <w:t>RNA</w:t>
+      </w:r>
+      <w:r>
+        <w:rPr>
+          <w:b/>
+        </w:rPr>
+        <w:t xml:space="preserve"> specifically</w:t>
+      </w:r>
+      <w:r>
+        <w:rPr>
+          <w:b/>
+        </w:rPr>
+        <w:t>]</w:t>
+      </w:r>
+    </w:p>
+    <w:p/>
+    <w:p>
+      <w:pPr>
+        <w:pStyle w:val="ListParagraph"/>
+        <w:numPr>
+          <w:ilvl w:val="0"/>
+          <w:numId w:val="2"/>
+        </w:numPr>
+        <w:ind w:left="360"/>
+      </w:pPr>
+      <w:r>
+        <w:t xml:space="preserve">Question – Why are target gene databases are more extensive than miRNA-level databases? </w:t>
+      </w:r>
+    </w:p>
+    <w:p>
+      <w:pPr>
+        <w:pStyle w:val="ListParagraph"/>
+        <w:numPr>
+          <w:ilvl w:val="0"/>
+          <w:numId w:val="32"/>
+        </w:numPr>
+      </w:pPr>
+      <w:r>
+        <w:rPr>
+          <w:b/>
+        </w:rPr>
+        <w:t>Lots more research has been conducted into gene-pathway relationships</w:t>
+      </w:r>
+      <w:r>
+        <w:rPr>
+          <w:b/>
+        </w:rPr>
+        <w:t xml:space="preserve"> as these are easier to study and a lot of the world’s research funding has gone into researching these relationships</w:t>
+      </w:r>
+      <w:r>
+        <w:rPr>
+          <w:b/>
+        </w:rPr>
+        <w:t xml:space="preserve"> – there is more of a market for these databases.</w:t>
+      </w:r>
+    </w:p>
+    <w:p/>
+    <w:p>
+      <w:pPr>
+        <w:pStyle w:val="ListParagraph"/>
+        <w:numPr>
+          <w:ilvl w:val="0"/>
+          <w:numId w:val="2"/>
+        </w:numPr>
+        <w:ind w:left="360"/>
+      </w:pPr>
+      <w:r>
+        <w:t>Question – Why did you struggle to incorporate context-specific filtering into the workflow?</w:t>
+      </w:r>
+    </w:p>
+    <w:p>
+      <w:pPr>
+        <w:pStyle w:val="ListParagraph"/>
+        <w:numPr>
+          <w:ilvl w:val="0"/>
+          <w:numId w:val="32"/>
+        </w:numPr>
+        <w:rPr>
+          <w:b/>
+          <w:bCs/>
+        </w:rPr>
+      </w:pPr>
+      <w:r>
+        <w:rPr>
+          <w:b/>
+          <w:bCs/>
+        </w:rPr>
+        <w:t>L</w:t>
+      </w:r>
+      <w:r>
+        <w:rPr>
+          <w:b/>
+          <w:bCs/>
+        </w:rPr>
+        <w:t xml:space="preserve">ots of potential targets - </w:t>
+      </w:r>
+      <w:r>
+        <w:t>Cell-specific targeting was difficult to establish as EVs target many different epithelial and immune cells in the airway</w:t>
+      </w:r>
+    </w:p>
+    <w:p>
+      <w:pPr>
+        <w:pStyle w:val="ListParagraph"/>
+        <w:numPr>
+          <w:ilvl w:val="0"/>
+          <w:numId w:val="32"/>
+        </w:numPr>
+        <w:rPr>
+          <w:b/>
+          <w:bCs/>
+        </w:rPr>
+      </w:pPr>
+      <w:r>
+        <w:rPr>
+          <w:b/>
+          <w:bCs/>
+        </w:rPr>
+        <w:t xml:space="preserve">Lots of expressed genes – </w:t>
+      </w:r>
+      <w:r>
+        <w:t>The airway cells expressed &gt;12k genes each anyway so it was the majority of the genome.</w:t>
+      </w:r>
+    </w:p>
+    <w:p>
+      <w:pPr>
+        <w:pStyle w:val="ListParagraph"/>
+        <w:numPr>
+          <w:ilvl w:val="0"/>
+          <w:numId w:val="32"/>
+        </w:numPr>
+        <w:rPr>
+          <w:b/>
+          <w:bCs/>
+        </w:rPr>
+      </w:pPr>
+      <w:r>
+        <w:rPr>
+          <w:b/>
+          <w:bCs/>
+        </w:rPr>
+        <w:t xml:space="preserve">Difficult to acquire transcriptome – </w:t>
+      </w:r>
+      <w:r>
+        <w:t>I found datasets from the Tissue Atlas, but it took a lot of searching to find the correct one.</w:t>
+      </w:r>
+    </w:p>
+    <w:p>
+      <w:pPr>
+        <w:pStyle w:val="ListParagraph"/>
+        <w:numPr>
+          <w:ilvl w:val="0"/>
+          <w:numId w:val="32"/>
+        </w:numPr>
+        <w:rPr>
+          <w:b/>
+          <w:bCs/>
+        </w:rPr>
+      </w:pPr>
+      <w:r>
+        <w:rPr>
+          <w:b/>
+          <w:bCs/>
+        </w:rPr>
         <w:lastRenderedPageBreak/>
-        <w:t>Additionally, the pathway analysis method development was robust as there were 27 DE miRNAs in the primary HBEC dataset, with an approximate even split of upregulated and downregulated miRNAs which made it ideal for pathway enrichment techniques.</w:t>
-      </w:r>
-    </w:p>
-    <w:p>
-      <w:pPr>
-        <w:pStyle w:val="ListParagraph"/>
-      </w:pPr>
+        <w:t xml:space="preserve">Difficult to find disease states – </w:t>
+      </w:r>
+      <w:r>
+        <w:t xml:space="preserve">QIAGEN IPA have disease </w:t>
+      </w:r>
+      <w:r>
+        <w:t>filters,</w:t>
+      </w:r>
+      <w:r>
+        <w:t xml:space="preserve"> but it was difficult to establish and acquire these datasets.</w:t>
+      </w:r>
+    </w:p>
+    <w:p>
+      <w:pPr>
+        <w:pStyle w:val="ListParagraph"/>
+        <w:numPr>
+          <w:ilvl w:val="0"/>
+          <w:numId w:val="32"/>
+        </w:numPr>
+        <w:rPr>
+          <w:b/>
+          <w:bCs/>
+        </w:rPr>
+      </w:pPr>
+      <w:r>
+        <w:rPr>
+          <w:b/>
+          <w:bCs/>
+        </w:rPr>
+        <w:t xml:space="preserve">Manual curation – </w:t>
+      </w:r>
+      <w:r>
+        <w:t>A distinct property of commercial platforms is that they provide manually curated databases by experts.</w:t>
+      </w:r>
     </w:p>
     <w:p/>
     <w:p>
@@ -4167,46 +4129,70 @@
         <w:ind w:left="360"/>
       </w:pPr>
       <w:r>
-        <w:t>Question – Have rRNA and tRNA been implicated in allergic responses?</w:t>
-      </w:r>
-    </w:p>
-    <w:p>
-      <w:pPr>
-        <w:pStyle w:val="ListParagraph"/>
-        <w:numPr>
-          <w:ilvl w:val="0"/>
-          <w:numId w:val="32"/>
-        </w:numPr>
-      </w:pPr>
-      <w:r>
-        <w:rPr>
-          <w:b/>
-        </w:rPr>
-        <w:t xml:space="preserve">[not seen much about ribosomal </w:t>
-      </w:r>
-      <w:r>
-        <w:rPr>
-          <w:b/>
-        </w:rPr>
-        <w:t xml:space="preserve">or transfer </w:t>
-      </w:r>
-      <w:r>
-        <w:rPr>
-          <w:b/>
-        </w:rPr>
-        <w:t>RNA</w:t>
-      </w:r>
-      <w:r>
-        <w:rPr>
-          <w:b/>
-        </w:rPr>
-        <w:t xml:space="preserve"> specifically</w:t>
-      </w:r>
-      <w:r>
-        <w:rPr>
-          <w:b/>
-        </w:rPr>
-        <w:t>]</w:t>
+        <w:t xml:space="preserve">Question – Why was it a strength to develop the workflow using a dataset with sufficient differential expression? </w:t>
+      </w:r>
+    </w:p>
+    <w:p>
+      <w:pPr>
+        <w:pStyle w:val="ListParagraph"/>
+        <w:numPr>
+          <w:ilvl w:val="0"/>
+          <w:numId w:val="33"/>
+        </w:numPr>
+      </w:pPr>
+      <w:r>
+        <w:rPr>
+          <w:b/>
+        </w:rPr>
+        <w:t>Because, as mentioned in the presentation, pathway enrichment analysis techniques require sufficient differential expression to be statistically reliable.</w:t>
+      </w:r>
+    </w:p>
+    <w:p>
+      <w:pPr>
+        <w:pStyle w:val="ListParagraph"/>
+        <w:numPr>
+          <w:ilvl w:val="0"/>
+          <w:numId w:val="33"/>
+        </w:numPr>
+      </w:pPr>
+      <w:r>
+        <w:rPr>
+          <w:b/>
+        </w:rPr>
+        <w:t xml:space="preserve">Therefore, it was lucky that the primary HBEC dataset had ~13/14 miRNAs </w:t>
+      </w:r>
+      <w:r>
+        <w:rPr>
+          <w:b/>
+        </w:rPr>
+        <w:t>in each upregulated and downregulated set.</w:t>
+      </w:r>
+    </w:p>
+    <w:p>
+      <w:pPr>
+        <w:pStyle w:val="ListParagraph"/>
+        <w:numPr>
+          <w:ilvl w:val="0"/>
+          <w:numId w:val="33"/>
+        </w:numPr>
+      </w:pPr>
+      <w:r>
+        <w:rPr>
+          <w:b/>
+        </w:rPr>
+        <w:t>The alternative method would have been to use an established dataset from a similar study</w:t>
+      </w:r>
+      <w:r>
+        <w:rPr>
+          <w:b/>
+        </w:rPr>
+        <w:t>,</w:t>
+      </w:r>
+      <w:r>
+        <w:rPr>
+          <w:b/>
+        </w:rPr>
+        <w:t xml:space="preserve"> but this is always more difficult because you can’t really ask the authors questions, whereas I could talk to the author of the primary HBEC study about their experiment and process.</w:t>
       </w:r>
     </w:p>
     <w:p/>
@@ -4220,34 +4206,101 @@
         <w:ind w:left="360"/>
       </w:pPr>
       <w:r>
-        <w:t xml:space="preserve">Question – Why are target gene databases are more extensive than miRNA-level databases? </w:t>
-      </w:r>
-    </w:p>
-    <w:p>
-      <w:pPr>
-        <w:pStyle w:val="ListParagraph"/>
-        <w:numPr>
-          <w:ilvl w:val="0"/>
-          <w:numId w:val="32"/>
-        </w:numPr>
-      </w:pPr>
-      <w:r>
-        <w:rPr>
-          <w:b/>
-        </w:rPr>
-        <w:t>Lots more research has been conducted into gene-pathway relationships</w:t>
-      </w:r>
-      <w:r>
-        <w:rPr>
-          <w:b/>
-        </w:rPr>
-        <w:t xml:space="preserve"> as these are easier to study and a lot of the world’s research funding has gone into researching these relationships</w:t>
-      </w:r>
-      <w:r>
-        <w:rPr>
-          <w:b/>
-        </w:rPr>
-        <w:t xml:space="preserve"> – there is more of a market for these databases.</w:t>
+        <w:t>Question – Why was it a strength to use experimentally validated target interactions?</w:t>
+      </w:r>
+    </w:p>
+    <w:p>
+      <w:pPr>
+        <w:pStyle w:val="ListParagraph"/>
+        <w:numPr>
+          <w:ilvl w:val="0"/>
+          <w:numId w:val="34"/>
+        </w:numPr>
+        <w:rPr>
+          <w:b/>
+          <w:bCs/>
+        </w:rPr>
+      </w:pPr>
+      <w:r>
+        <w:rPr>
+          <w:b/>
+          <w:bCs/>
+        </w:rPr>
+        <w:t>A lot of other studies use pred</w:t>
+      </w:r>
+      <w:r>
+        <w:rPr>
+          <w:b/>
+          <w:bCs/>
+        </w:rPr>
+        <w:t xml:space="preserve">icted targets which are less reliable and can lead to false positive associations. </w:t>
+      </w:r>
+    </w:p>
+    <w:p>
+      <w:pPr>
+        <w:pStyle w:val="ListParagraph"/>
+        <w:numPr>
+          <w:ilvl w:val="0"/>
+          <w:numId w:val="34"/>
+        </w:numPr>
+        <w:rPr>
+          <w:b/>
+          <w:bCs/>
+        </w:rPr>
+      </w:pPr>
+      <w:r>
+        <w:rPr>
+          <w:b/>
+          <w:bCs/>
+        </w:rPr>
+        <w:t xml:space="preserve">I found that I had too many target genes anyway therefore to use predicted targets as well would have </w:t>
+      </w:r>
+      <w:r>
+        <w:rPr>
+          <w:b/>
+          <w:bCs/>
+        </w:rPr>
+        <w:t>an even more complex pathway analysis.</w:t>
+      </w:r>
+    </w:p>
+    <w:p>
+      <w:pPr>
+        <w:pStyle w:val="ListParagraph"/>
+        <w:numPr>
+          <w:ilvl w:val="0"/>
+          <w:numId w:val="34"/>
+        </w:numPr>
+        <w:rPr>
+          <w:b/>
+          <w:bCs/>
+        </w:rPr>
+      </w:pPr>
+      <w:r>
+        <w:rPr>
+          <w:b/>
+          <w:bCs/>
+        </w:rPr>
+        <w:t>However, there are lots of real associations that have not yet been demonstrated experimentally therefore to exclude predicted targets can lead to missing real results. This is the trade-off.</w:t>
+      </w:r>
+    </w:p>
+    <w:p>
+      <w:pPr>
+        <w:pStyle w:val="ListParagraph"/>
+        <w:numPr>
+          <w:ilvl w:val="0"/>
+          <w:numId w:val="34"/>
+        </w:numPr>
+        <w:rPr>
+          <w:b/>
+          <w:bCs/>
+        </w:rPr>
+      </w:pPr>
+      <w:r>
+        <w:rPr>
+          <w:b/>
+          <w:bCs/>
+        </w:rPr>
+        <w:t>Some people use predicted targets that have a high confidence score or the overlap of multiple target prediction databases.</w:t>
       </w:r>
     </w:p>
     <w:p/>
@@ -4261,342 +4314,6 @@
         <w:ind w:left="360"/>
       </w:pPr>
       <w:r>
-        <w:t>Question – Why did you struggle to incorporate context-specific filtering into the workflow?</w:t>
-      </w:r>
-    </w:p>
-    <w:p>
-      <w:pPr>
-        <w:pStyle w:val="ListParagraph"/>
-        <w:numPr>
-          <w:ilvl w:val="0"/>
-          <w:numId w:val="32"/>
-        </w:numPr>
-        <w:rPr>
-          <w:b/>
-          <w:bCs/>
-        </w:rPr>
-      </w:pPr>
-      <w:r>
-        <w:rPr>
-          <w:b/>
-          <w:bCs/>
-        </w:rPr>
-        <w:t>L</w:t>
-      </w:r>
-      <w:r>
-        <w:rPr>
-          <w:b/>
-          <w:bCs/>
-        </w:rPr>
-        <w:t xml:space="preserve">ots of potential targets - </w:t>
-      </w:r>
-      <w:r>
-        <w:t>Cell-specific targeting was difficult to establish as EVs target many different epithelial and immune cells in the airway</w:t>
-      </w:r>
-    </w:p>
-    <w:p>
-      <w:pPr>
-        <w:pStyle w:val="ListParagraph"/>
-        <w:numPr>
-          <w:ilvl w:val="0"/>
-          <w:numId w:val="32"/>
-        </w:numPr>
-        <w:rPr>
-          <w:b/>
-          <w:bCs/>
-        </w:rPr>
-      </w:pPr>
-      <w:r>
-        <w:rPr>
-          <w:b/>
-          <w:bCs/>
-        </w:rPr>
-        <w:t xml:space="preserve">Lots of expressed genes – </w:t>
-      </w:r>
-      <w:r>
-        <w:t xml:space="preserve">The airway cells expressed &gt;12k genes each anyway so it was </w:t>
-      </w:r>
-      <w:proofErr w:type="gramStart"/>
-      <w:r>
-        <w:t>the majority of</w:t>
-      </w:r>
-      <w:proofErr w:type="gramEnd"/>
-      <w:r>
-        <w:t xml:space="preserve"> the genome.</w:t>
-      </w:r>
-    </w:p>
-    <w:p>
-      <w:pPr>
-        <w:pStyle w:val="ListParagraph"/>
-        <w:numPr>
-          <w:ilvl w:val="0"/>
-          <w:numId w:val="32"/>
-        </w:numPr>
-        <w:rPr>
-          <w:b/>
-          <w:bCs/>
-        </w:rPr>
-      </w:pPr>
-      <w:r>
-        <w:rPr>
-          <w:b/>
-          <w:bCs/>
-        </w:rPr>
-        <w:t xml:space="preserve">Difficult to acquire transcriptome – </w:t>
-      </w:r>
-      <w:r>
-        <w:t>I found datasets from the Tissue Atlas, but it took a lot of searching to find the correct one.</w:t>
-      </w:r>
-    </w:p>
-    <w:p>
-      <w:pPr>
-        <w:pStyle w:val="ListParagraph"/>
-        <w:numPr>
-          <w:ilvl w:val="0"/>
-          <w:numId w:val="32"/>
-        </w:numPr>
-        <w:rPr>
-          <w:b/>
-          <w:bCs/>
-        </w:rPr>
-      </w:pPr>
-      <w:r>
-        <w:rPr>
-          <w:b/>
-          <w:bCs/>
-        </w:rPr>
-        <w:t xml:space="preserve">Difficult to find disease states – </w:t>
-      </w:r>
-      <w:r>
-        <w:t xml:space="preserve">QIAGEN IPA have disease </w:t>
-      </w:r>
-      <w:r>
-        <w:t>filters,</w:t>
-      </w:r>
-      <w:r>
-        <w:t xml:space="preserve"> but it was difficult to establish and acquire these datasets.</w:t>
-      </w:r>
-    </w:p>
-    <w:p>
-      <w:pPr>
-        <w:pStyle w:val="ListParagraph"/>
-        <w:numPr>
-          <w:ilvl w:val="0"/>
-          <w:numId w:val="32"/>
-        </w:numPr>
-        <w:rPr>
-          <w:b/>
-          <w:bCs/>
-        </w:rPr>
-      </w:pPr>
-      <w:r>
-        <w:rPr>
-          <w:b/>
-          <w:bCs/>
-        </w:rPr>
-        <w:t xml:space="preserve">Manual curation – </w:t>
-      </w:r>
-      <w:r>
-        <w:t>A distinct property of commercial platforms is that they provide manually curated databases by experts.</w:t>
-      </w:r>
-    </w:p>
-    <w:p/>
-    <w:p>
-      <w:pPr>
-        <w:pStyle w:val="ListParagraph"/>
-        <w:numPr>
-          <w:ilvl w:val="0"/>
-          <w:numId w:val="2"/>
-        </w:numPr>
-        <w:ind w:left="360"/>
-      </w:pPr>
-      <w:r>
-        <w:t xml:space="preserve">Question – Why was it a strength to develop the workflow using a dataset with sufficient differential expression? </w:t>
-      </w:r>
-    </w:p>
-    <w:p>
-      <w:pPr>
-        <w:pStyle w:val="ListParagraph"/>
-        <w:numPr>
-          <w:ilvl w:val="0"/>
-          <w:numId w:val="33"/>
-        </w:numPr>
-      </w:pPr>
-      <w:r>
-        <w:rPr>
-          <w:b/>
-        </w:rPr>
-        <w:t>Because, as mentioned in the presentation, pathway enrichment analysis techniques require sufficient differential expression to be statistically reliable.</w:t>
-      </w:r>
-    </w:p>
-    <w:p>
-      <w:pPr>
-        <w:pStyle w:val="ListParagraph"/>
-        <w:numPr>
-          <w:ilvl w:val="0"/>
-          <w:numId w:val="33"/>
-        </w:numPr>
-      </w:pPr>
-      <w:r>
-        <w:rPr>
-          <w:b/>
-        </w:rPr>
-        <w:t xml:space="preserve">Therefore, it was lucky that the primary HBEC dataset had ~13/14 miRNAs </w:t>
-      </w:r>
-      <w:r>
-        <w:rPr>
-          <w:b/>
-        </w:rPr>
-        <w:t>in each upregulated and downregulated set.</w:t>
-      </w:r>
-    </w:p>
-    <w:p>
-      <w:pPr>
-        <w:pStyle w:val="ListParagraph"/>
-        <w:numPr>
-          <w:ilvl w:val="0"/>
-          <w:numId w:val="33"/>
-        </w:numPr>
-      </w:pPr>
-      <w:r>
-        <w:rPr>
-          <w:b/>
-        </w:rPr>
-        <w:lastRenderedPageBreak/>
-        <w:t>The alternative method would have been to use an established dataset from a similar study</w:t>
-      </w:r>
-      <w:r>
-        <w:rPr>
-          <w:b/>
-        </w:rPr>
-        <w:t>,</w:t>
-      </w:r>
-      <w:r>
-        <w:rPr>
-          <w:b/>
-        </w:rPr>
-        <w:t xml:space="preserve"> but this is always more difficult because you can’t really ask the authors questions, whereas I could talk to the author of the primary HBEC study about their experiment and process.</w:t>
-      </w:r>
-    </w:p>
-    <w:p/>
-    <w:p>
-      <w:pPr>
-        <w:pStyle w:val="ListParagraph"/>
-        <w:numPr>
-          <w:ilvl w:val="0"/>
-          <w:numId w:val="2"/>
-        </w:numPr>
-        <w:ind w:left="360"/>
-      </w:pPr>
-      <w:r>
-        <w:t>Question – Why was it a strength to use experimentally validated target interactions?</w:t>
-      </w:r>
-    </w:p>
-    <w:p>
-      <w:pPr>
-        <w:pStyle w:val="ListParagraph"/>
-        <w:numPr>
-          <w:ilvl w:val="0"/>
-          <w:numId w:val="34"/>
-        </w:numPr>
-        <w:rPr>
-          <w:b/>
-          <w:bCs/>
-        </w:rPr>
-      </w:pPr>
-      <w:r>
-        <w:rPr>
-          <w:b/>
-          <w:bCs/>
-        </w:rPr>
-        <w:t>A lot of other studies use pred</w:t>
-      </w:r>
-      <w:r>
-        <w:rPr>
-          <w:b/>
-          <w:bCs/>
-        </w:rPr>
-        <w:t xml:space="preserve">icted targets which are less reliable and can lead to false positive associations. </w:t>
-      </w:r>
-    </w:p>
-    <w:p>
-      <w:pPr>
-        <w:pStyle w:val="ListParagraph"/>
-        <w:numPr>
-          <w:ilvl w:val="0"/>
-          <w:numId w:val="34"/>
-        </w:numPr>
-        <w:rPr>
-          <w:b/>
-          <w:bCs/>
-        </w:rPr>
-      </w:pPr>
-      <w:r>
-        <w:rPr>
-          <w:b/>
-          <w:bCs/>
-        </w:rPr>
-        <w:t xml:space="preserve">I found that I had too many target genes anyway therefore to use predicted targets as well would have </w:t>
-      </w:r>
-      <w:r>
-        <w:rPr>
-          <w:b/>
-          <w:bCs/>
-        </w:rPr>
-        <w:t>an even more complex pathway analysis.</w:t>
-      </w:r>
-    </w:p>
-    <w:p>
-      <w:pPr>
-        <w:pStyle w:val="ListParagraph"/>
-        <w:numPr>
-          <w:ilvl w:val="0"/>
-          <w:numId w:val="34"/>
-        </w:numPr>
-        <w:rPr>
-          <w:b/>
-          <w:bCs/>
-        </w:rPr>
-      </w:pPr>
-      <w:r>
-        <w:rPr>
-          <w:b/>
-          <w:bCs/>
-        </w:rPr>
-        <w:t>However, there are lots of real associations that have not yet been demonstrated experimentally therefore to exclude predicted targets can lead to missing real results. This is the trade-off.</w:t>
-      </w:r>
-    </w:p>
-    <w:p>
-      <w:pPr>
-        <w:pStyle w:val="ListParagraph"/>
-        <w:numPr>
-          <w:ilvl w:val="0"/>
-          <w:numId w:val="34"/>
-        </w:numPr>
-        <w:rPr>
-          <w:b/>
-          <w:bCs/>
-        </w:rPr>
-      </w:pPr>
-      <w:r>
-        <w:rPr>
-          <w:b/>
-          <w:bCs/>
-        </w:rPr>
-        <w:t>Some people use predicted targets that have a high confidence score or the overlap of multiple target prediction databases.</w:t>
-      </w:r>
-    </w:p>
-    <w:p/>
-    <w:p>
-      <w:pPr>
-        <w:pStyle w:val="ListParagraph"/>
-        <w:numPr>
-          <w:ilvl w:val="0"/>
-          <w:numId w:val="2"/>
-        </w:numPr>
-        <w:ind w:left="360"/>
-      </w:pPr>
-      <w:r>
         <w:t>Question - You say there were too few replicates to remove outliers</w:t>
       </w:r>
       <w:r>
@@ -4669,21 +4386,7 @@
         <w:rPr>
           <w:b/>
         </w:rPr>
-        <w:t xml:space="preserve">Replicate number is something that </w:t>
-      </w:r>
-      <w:proofErr w:type="gramStart"/>
-      <w:r>
-        <w:rPr>
-          <w:b/>
-        </w:rPr>
-        <w:t>has to</w:t>
-      </w:r>
-      <w:proofErr w:type="gramEnd"/>
-      <w:r>
-        <w:rPr>
-          <w:b/>
-        </w:rPr>
-        <w:t xml:space="preserve"> be considered in terms of cost.</w:t>
+        <w:t>Replicate number is something that has to be considered in terms of cost.</w:t>
       </w:r>
     </w:p>
     <w:p>
@@ -4781,6 +4484,21 @@
         <w:t>I did see one paper that had several hundred thousand–2 million miRNA reads.</w:t>
       </w:r>
     </w:p>
+    <w:p>
+      <w:pPr>
+        <w:pStyle w:val="ListParagraph"/>
+        <w:numPr>
+          <w:ilvl w:val="0"/>
+          <w:numId w:val="36"/>
+        </w:numPr>
+      </w:pPr>
+      <w:r>
+        <w:rPr>
+          <w:b/>
+        </w:rPr>
+        <w:t>It likely also depends on the number of samples, where if there are more samples then you wouldn’t need as much miRNA.</w:t>
+      </w:r>
+    </w:p>
     <w:p/>
     <w:p>
       <w:pPr>
@@ -4792,7 +4510,6 @@
         <w:ind w:left="360"/>
       </w:pPr>
       <w:r>
-        <w:lastRenderedPageBreak/>
         <w:t>Question – Why did using a literature search instead of pathway analysis prevent novel findings in the Calu-3 dataset?</w:t>
       </w:r>
     </w:p>
@@ -4927,6 +4644,7 @@
         <w:ind w:left="360"/>
       </w:pPr>
       <w:r>
+        <w:lastRenderedPageBreak/>
         <w:t xml:space="preserve">Question </w:t>
       </w:r>
       <w:r>
@@ -5040,7 +4758,6 @@
           <w:b/>
           <w:bCs/>
         </w:rPr>
-        <w:lastRenderedPageBreak/>
         <w:t>I also had an idea during the method development stage to create a web app/report that would compile the results from each different permutation of parameters I tried so that I could quickly navigate through the results to determine what difference each attempt.</w:t>
       </w:r>
     </w:p>
@@ -5167,23 +4884,7 @@
           <w:b/>
           <w:bCs/>
         </w:rPr>
-        <w:t xml:space="preserve">The target gene list I initially got was ~15k genes therefore the associated pathways were not specific at all. I then tested many ways to reduce the size of the </w:t>
-      </w:r>
-      <w:proofErr w:type="gramStart"/>
-      <w:r>
-        <w:rPr>
-          <w:b/>
-          <w:bCs/>
-        </w:rPr>
-        <w:t>list</w:t>
-      </w:r>
-      <w:proofErr w:type="gramEnd"/>
-      <w:r>
-        <w:rPr>
-          <w:b/>
-          <w:bCs/>
-        </w:rPr>
-        <w:t xml:space="preserve"> but each method had a disadvantage.</w:t>
+        <w:t>The target gene list I initially got was ~15k genes therefore the associated pathways were not specific at all. I then tested many ways to reduce the size of the list but each method had a disadvantage.</w:t>
       </w:r>
     </w:p>
     <w:p>
@@ -5231,6 +4932,7 @@
         </w:numPr>
       </w:pPr>
       <w:r>
+        <w:lastRenderedPageBreak/>
         <w:t>Retain only genes expressed in airway cells</w:t>
       </w:r>
     </w:p>
@@ -5524,6 +5226,26 @@
     <w:p>
       <w:pPr>
         <w:pStyle w:val="ListParagraph"/>
+        <w:numPr>
+          <w:ilvl w:val="0"/>
+          <w:numId w:val="42"/>
+        </w:numPr>
+      </w:pPr>
+      <w:r>
+        <w:t xml:space="preserve">WB’s literature review: </w:t>
+      </w:r>
+      <w:hyperlink r:id="rId30" w:history="1">
+        <w:r>
+          <w:rPr>
+            <w:rStyle w:val="Hyperlink"/>
+          </w:rPr>
+          <w:t>https://pmc.ncbi.nlm.nih.gov/articles/PMC12193434/</w:t>
+        </w:r>
+      </w:hyperlink>
+    </w:p>
+    <w:p>
+      <w:pPr>
+        <w:pStyle w:val="ListParagraph"/>
         <w:ind w:left="1440"/>
         <w:rPr>
           <w:b/>
@@ -5537,6 +5259,7 @@
         <w:pStyle w:val="Heading2"/>
       </w:pPr>
       <w:r>
+        <w:lastRenderedPageBreak/>
         <w:t>Mistakes in manuscript</w:t>
       </w:r>
     </w:p>
@@ -5549,15 +5272,7 @@
         </w:numPr>
       </w:pPr>
       <w:r>
-        <w:t xml:space="preserve">Supplementary table 2 listing all the DE miRNAs </w:t>
-      </w:r>
-      <w:proofErr w:type="gramStart"/>
-      <w:r>
-        <w:t>is</w:t>
-      </w:r>
-      <w:proofErr w:type="gramEnd"/>
-      <w:r>
-        <w:t xml:space="preserve"> wrong for all the protease samples – it just shows the der p 1 inactive results for each of the protease conditions</w:t>
+        <w:t>Supplementary table 2 listing all the DE miRNAs is wrong for all the protease samples – it just shows the der p 1 inactive results for each of the protease conditions</w:t>
       </w:r>
       <w:r>
         <w:rPr>
@@ -5788,7 +5503,6 @@
           <w:b/>
           <w:bCs/>
         </w:rPr>
-        <w:lastRenderedPageBreak/>
         <w:t>Browne et al</w:t>
       </w:r>
       <w:r>
@@ -5899,7 +5613,7 @@
       <w:r>
         <w:t xml:space="preserve">Mimics and inhibitors were used in previous studies </w:t>
       </w:r>
-      <w:hyperlink r:id="rId30" w:history="1">
+      <w:hyperlink r:id="rId31" w:history="1">
         <w:r>
           <w:rPr>
             <w:rStyle w:val="Hyperlink"/>
@@ -6414,7 +6128,7 @@
         <w:rFonts w:ascii="Courier New" w:hAnsi="Courier New" w:cs="Courier New" w:hint="default"/>
       </w:rPr>
     </w:lvl>
-    <w:lvl w:ilvl="2" w:tplc="08090005" w:tentative="1">
+    <w:lvl w:ilvl="2" w:tplc="08090005">
       <w:start w:val="1"/>
       <w:numFmt w:val="bullet"/>
       <w:lvlText w:val=""/>

</xml_diff>

<commit_message>
ADDING TODAY'S WORK - 09.09.2026
</commit_message>
<xml_diff>
--- a/viva/questions/viva_questions_DRAFT_1.docx
+++ b/viva/questions/viva_questions_DRAFT_1.docx
@@ -56,7 +56,15 @@
         <w:t>.</w:t>
       </w:r>
       <w:r>
-        <w:t xml:space="preserve"> Projects include Seasonal Coronaviruses, Measles, Mumps, Parainfluenza, Adenoviruses, Enteroviruses, Sapovirus and Astroviru</w:t>
+        <w:t xml:space="preserve"> Projects include Seasonal Coronaviruses, Measles, Mumps, Parainfluenza, Adenoviruses, Enteroviruses, </w:t>
+      </w:r>
+      <w:proofErr w:type="spellStart"/>
+      <w:r>
+        <w:t>Sapovirus</w:t>
+      </w:r>
+      <w:proofErr w:type="spellEnd"/>
+      <w:r>
+        <w:t xml:space="preserve"> and Astroviru</w:t>
       </w:r>
       <w:r>
         <w:t>s.</w:t>
@@ -200,7 +208,23 @@
           <w:b/>
           <w:bCs/>
         </w:rPr>
-        <w:t>For pathway analysis, I attempted many different ways to reduce the target gene list and different software to perform the analysis.</w:t>
+        <w:t xml:space="preserve">For pathway analysis, I attempted </w:t>
+      </w:r>
+      <w:proofErr w:type="gramStart"/>
+      <w:r>
+        <w:rPr>
+          <w:b/>
+          <w:bCs/>
+        </w:rPr>
+        <w:t>many different ways</w:t>
+      </w:r>
+      <w:proofErr w:type="gramEnd"/>
+      <w:r>
+        <w:rPr>
+          <w:b/>
+          <w:bCs/>
+        </w:rPr>
+        <w:t xml:space="preserve"> to reduce the target gene list and different software to perform the analysis.</w:t>
       </w:r>
     </w:p>
     <w:p>
@@ -335,7 +359,7 @@
           <w:b/>
           <w:bCs/>
         </w:rPr>
-        <w:t>There were potentially donor effects by only having 3 primary HBBEC donors.</w:t>
+        <w:t>There were potentially donor effects by only having 3 primary HBEC donors.</w:t>
       </w:r>
     </w:p>
     <w:p/>
@@ -379,7 +403,35 @@
         <w:rPr>
           <w:b/>
         </w:rPr>
-        <w:t>miRNA is only one of many different types of RNA in EVs and a lot of the RNA-seq data was unknown.</w:t>
+        <w:t xml:space="preserve">miRNA is only one of many different types of RNA in </w:t>
+      </w:r>
+      <w:proofErr w:type="gramStart"/>
+      <w:r>
+        <w:rPr>
+          <w:b/>
+        </w:rPr>
+        <w:t>EVs</w:t>
+      </w:r>
+      <w:proofErr w:type="gramEnd"/>
+      <w:r>
+        <w:rPr>
+          <w:b/>
+        </w:rPr>
+        <w:t xml:space="preserve"> and a lot of the RNA-</w:t>
+      </w:r>
+      <w:proofErr w:type="spellStart"/>
+      <w:r>
+        <w:rPr>
+          <w:b/>
+        </w:rPr>
+        <w:t>seq</w:t>
+      </w:r>
+      <w:proofErr w:type="spellEnd"/>
+      <w:r>
+        <w:rPr>
+          <w:b/>
+        </w:rPr>
+        <w:t xml:space="preserve"> data was unknown.</w:t>
       </w:r>
     </w:p>
     <w:p>
@@ -586,7 +638,35 @@
         <w:rPr>
           <w:b/>
         </w:rPr>
-        <w:t>had to decide between 17 nt, 18 nt and no max length.</w:t>
+        <w:t xml:space="preserve">had to decide between 17 </w:t>
+      </w:r>
+      <w:proofErr w:type="spellStart"/>
+      <w:r>
+        <w:rPr>
+          <w:b/>
+        </w:rPr>
+        <w:t>nt</w:t>
+      </w:r>
+      <w:proofErr w:type="spellEnd"/>
+      <w:r>
+        <w:rPr>
+          <w:b/>
+        </w:rPr>
+        <w:t xml:space="preserve">, 18 </w:t>
+      </w:r>
+      <w:proofErr w:type="spellStart"/>
+      <w:r>
+        <w:rPr>
+          <w:b/>
+        </w:rPr>
+        <w:t>nt</w:t>
+      </w:r>
+      <w:proofErr w:type="spellEnd"/>
+      <w:r>
+        <w:rPr>
+          <w:b/>
+        </w:rPr>
+        <w:t xml:space="preserve"> and no max length.</w:t>
       </w:r>
     </w:p>
     <w:p>
@@ -638,7 +718,23 @@
         <w:sym w:font="Wingdings" w:char="F0E0"/>
       </w:r>
       <w:r>
-        <w:t xml:space="preserve"> results from 17 nt vs 18 nt </w:t>
+        <w:t xml:space="preserve"> results from 17 </w:t>
+      </w:r>
+      <w:proofErr w:type="spellStart"/>
+      <w:r>
+        <w:t>nt</w:t>
+      </w:r>
+      <w:proofErr w:type="spellEnd"/>
+      <w:r>
+        <w:t xml:space="preserve"> vs 18 </w:t>
+      </w:r>
+      <w:proofErr w:type="spellStart"/>
+      <w:r>
+        <w:t>nt</w:t>
+      </w:r>
+      <w:proofErr w:type="spellEnd"/>
+      <w:r>
+        <w:t xml:space="preserve"> </w:t>
       </w:r>
     </w:p>
     <w:p>
@@ -886,7 +982,23 @@
           <w:b/>
           <w:bCs/>
         </w:rPr>
-        <w:t>Some common websites that other people had used (e.g., DIANA) were unavailable during the study, and miEAA servers were down for approx. 1 month as well as the HPC problems.</w:t>
+        <w:t xml:space="preserve">Some common websites that other people had used (e.g., DIANA) were unavailable during the study, and </w:t>
+      </w:r>
+      <w:proofErr w:type="spellStart"/>
+      <w:r>
+        <w:rPr>
+          <w:b/>
+          <w:bCs/>
+        </w:rPr>
+        <w:t>miEAA</w:t>
+      </w:r>
+      <w:proofErr w:type="spellEnd"/>
+      <w:r>
+        <w:rPr>
+          <w:b/>
+          <w:bCs/>
+        </w:rPr>
+        <w:t xml:space="preserve"> servers were down for approx. 1 month as well as the HPC problems.</w:t>
       </w:r>
     </w:p>
     <w:p>
@@ -1124,7 +1236,35 @@
         <w:rPr>
           <w:b/>
         </w:rPr>
-        <w:t>Low miRNA abundance in the Calu-3 dataset was verified both by miRTrace and by mapping reads to known miRNA sequences using miRBase.</w:t>
+        <w:t xml:space="preserve">Low miRNA abundance in the Calu-3 dataset was verified both by </w:t>
+      </w:r>
+      <w:proofErr w:type="spellStart"/>
+      <w:r>
+        <w:rPr>
+          <w:b/>
+        </w:rPr>
+        <w:t>miRTrace</w:t>
+      </w:r>
+      <w:proofErr w:type="spellEnd"/>
+      <w:r>
+        <w:rPr>
+          <w:b/>
+        </w:rPr>
+        <w:t xml:space="preserve"> and by mapping reads to known miRNA sequences using </w:t>
+      </w:r>
+      <w:proofErr w:type="spellStart"/>
+      <w:r>
+        <w:rPr>
+          <w:b/>
+        </w:rPr>
+        <w:t>miRBase</w:t>
+      </w:r>
+      <w:proofErr w:type="spellEnd"/>
+      <w:r>
+        <w:rPr>
+          <w:b/>
+        </w:rPr>
+        <w:t>.</w:t>
       </w:r>
     </w:p>
     <w:p>
@@ -1254,7 +1394,23 @@
           <w:b/>
           <w:bCs/>
         </w:rPr>
-        <w:t>I then wanted to make it really user-friendly for non-bioinformaticians but did not implement this due to time constraints.</w:t>
+        <w:t xml:space="preserve">I then wanted to make it </w:t>
+      </w:r>
+      <w:proofErr w:type="gramStart"/>
+      <w:r>
+        <w:rPr>
+          <w:b/>
+          <w:bCs/>
+        </w:rPr>
+        <w:t>really user-friendly</w:t>
+      </w:r>
+      <w:proofErr w:type="gramEnd"/>
+      <w:r>
+        <w:rPr>
+          <w:b/>
+          <w:bCs/>
+        </w:rPr>
+        <w:t xml:space="preserve"> for non-bioinformaticians but did not implement this due to time constraints.</w:t>
       </w:r>
     </w:p>
     <w:p/>
@@ -1288,7 +1444,23 @@
           <w:b/>
           <w:bCs/>
         </w:rPr>
-        <w:t>Can you please expand on ‘issues’?</w:t>
+        <w:t>Can you please expand on ‘</w:t>
+      </w:r>
+      <w:proofErr w:type="gramStart"/>
+      <w:r>
+        <w:rPr>
+          <w:b/>
+          <w:bCs/>
+        </w:rPr>
+        <w:t>issues’</w:t>
+      </w:r>
+      <w:proofErr w:type="gramEnd"/>
+      <w:r>
+        <w:rPr>
+          <w:b/>
+          <w:bCs/>
+        </w:rPr>
+        <w:t>?</w:t>
       </w:r>
     </w:p>
     <w:p/>
@@ -1319,7 +1491,23 @@
           <w:bCs/>
         </w:rPr>
         <w:lastRenderedPageBreak/>
-        <w:t>It would be really good if I could apply context-specific filtering or matched miRNA-mRNA data to filter target gene lists.</w:t>
+        <w:t xml:space="preserve">It would be </w:t>
+      </w:r>
+      <w:proofErr w:type="gramStart"/>
+      <w:r>
+        <w:rPr>
+          <w:b/>
+          <w:bCs/>
+        </w:rPr>
+        <w:t>really good</w:t>
+      </w:r>
+      <w:proofErr w:type="gramEnd"/>
+      <w:r>
+        <w:rPr>
+          <w:b/>
+          <w:bCs/>
+        </w:rPr>
+        <w:t xml:space="preserve"> if I could apply context-specific filtering or matched miRNA-mRNA data to filter target gene lists.</w:t>
       </w:r>
     </w:p>
     <w:p>
@@ -1351,7 +1539,23 @@
           <w:b/>
           <w:bCs/>
         </w:rPr>
-        <w:t>I want to perform a formal validation, comparing these results to TAmiRNA and also to compare against other pipelines and datasets.</w:t>
+        <w:t xml:space="preserve">I want to perform a formal validation, comparing these results to TAmiRNA </w:t>
+      </w:r>
+      <w:proofErr w:type="gramStart"/>
+      <w:r>
+        <w:rPr>
+          <w:b/>
+          <w:bCs/>
+        </w:rPr>
+        <w:t>and also</w:t>
+      </w:r>
+      <w:proofErr w:type="gramEnd"/>
+      <w:r>
+        <w:rPr>
+          <w:b/>
+          <w:bCs/>
+        </w:rPr>
+        <w:t xml:space="preserve"> to compare against other pipelines and datasets.</w:t>
       </w:r>
     </w:p>
     <w:p>
@@ -1473,7 +1677,21 @@
         <w:rPr>
           <w:b/>
         </w:rPr>
-        <w:t>The primary HBEC dataset provides more evidence for allergen-exposed effects on EV miRNA cargo, which is relatively undertstudied.</w:t>
+        <w:t xml:space="preserve">The primary HBEC dataset provides more evidence for allergen-exposed effects on EV miRNA cargo, which is relatively </w:t>
+      </w:r>
+      <w:proofErr w:type="spellStart"/>
+      <w:r>
+        <w:rPr>
+          <w:b/>
+        </w:rPr>
+        <w:t>undertstudied</w:t>
+      </w:r>
+      <w:proofErr w:type="spellEnd"/>
+      <w:r>
+        <w:rPr>
+          <w:b/>
+        </w:rPr>
+        <w:t>.</w:t>
       </w:r>
     </w:p>
     <w:p/>
@@ -1519,7 +1737,35 @@
         <w:rPr>
           <w:b/>
         </w:rPr>
-        <w:t xml:space="preserve">Micro RNAs are short, non-coding RNAs, approximately 18–30 nt long, with a modal length of 21–23 nt, which bind to the 3’ UTR region of a messenger RNA and suppress its expression.  </w:t>
+        <w:t xml:space="preserve">Micro RNAs are short, non-coding RNAs, approximately 18–30 </w:t>
+      </w:r>
+      <w:proofErr w:type="spellStart"/>
+      <w:r>
+        <w:rPr>
+          <w:b/>
+        </w:rPr>
+        <w:t>nt</w:t>
+      </w:r>
+      <w:proofErr w:type="spellEnd"/>
+      <w:r>
+        <w:rPr>
+          <w:b/>
+        </w:rPr>
+        <w:t xml:space="preserve"> long, with a modal length of 21–23 </w:t>
+      </w:r>
+      <w:proofErr w:type="spellStart"/>
+      <w:r>
+        <w:rPr>
+          <w:b/>
+        </w:rPr>
+        <w:t>nt</w:t>
+      </w:r>
+      <w:proofErr w:type="spellEnd"/>
+      <w:r>
+        <w:rPr>
+          <w:b/>
+        </w:rPr>
+        <w:t xml:space="preserve">, which bind to the 3’ UTR region of a messenger RNA and suppress its expression.  </w:t>
       </w:r>
     </w:p>
     <w:p/>
@@ -1636,7 +1882,15 @@
         <w:ind w:left="360"/>
       </w:pPr>
       <w:r>
-        <w:t xml:space="preserve">Question - How many different types of miRNA are there? </w:t>
+        <w:t xml:space="preserve">Question - How many different types of </w:t>
+      </w:r>
+      <w:proofErr w:type="gramStart"/>
+      <w:r>
+        <w:t>miRNA</w:t>
+      </w:r>
+      <w:proofErr w:type="gramEnd"/>
+      <w:r>
+        <w:t xml:space="preserve"> are there? </w:t>
       </w:r>
     </w:p>
     <w:p>
@@ -1925,6 +2179,126 @@
         <w:t xml:space="preserve"> that said it should be all the miRNAs retained after filtering as the other miRNAs are likely erroneous and unreliable.</w:t>
       </w:r>
     </w:p>
+    <w:p>
+      <w:pPr>
+        <w:pStyle w:val="ListParagraph"/>
+        <w:numPr>
+          <w:ilvl w:val="0"/>
+          <w:numId w:val="15"/>
+        </w:numPr>
+      </w:pPr>
+      <w:r>
+        <w:rPr>
+          <w:b/>
+          <w:bCs/>
+        </w:rPr>
+        <w:t>“</w:t>
+      </w:r>
+      <w:proofErr w:type="gramStart"/>
+      <w:r>
+        <w:rPr>
+          <w:rFonts w:ascii="Roboto" w:hAnsi="Roboto"/>
+          <w:b/>
+          <w:bCs/>
+          <w:sz w:val="26"/>
+          <w:szCs w:val="26"/>
+          <w:shd w:val="clear" w:color="auto" w:fill="FFFFFF"/>
+        </w:rPr>
+        <w:t>all</w:t>
+      </w:r>
+      <w:proofErr w:type="gramEnd"/>
+      <w:r>
+        <w:rPr>
+          <w:rFonts w:ascii="Roboto" w:hAnsi="Roboto"/>
+          <w:b/>
+          <w:bCs/>
+          <w:sz w:val="26"/>
+          <w:szCs w:val="26"/>
+          <w:shd w:val="clear" w:color="auto" w:fill="FFFFFF"/>
+        </w:rPr>
+        <w:t xml:space="preserve"> genes remaining after</w:t>
+      </w:r>
+      <w:r>
+        <w:rPr>
+          <w:rStyle w:val="apple-converted-space"/>
+          <w:rFonts w:ascii="Roboto" w:hAnsi="Roboto"/>
+          <w:b/>
+          <w:bCs/>
+          <w:sz w:val="26"/>
+          <w:szCs w:val="26"/>
+          <w:shd w:val="clear" w:color="auto" w:fill="FFFFFF"/>
+        </w:rPr>
+        <w:t> </w:t>
+      </w:r>
+      <w:proofErr w:type="spellStart"/>
+      <w:r>
+        <w:rPr>
+          <w:rStyle w:val="HTMLCode"/>
+          <w:rFonts w:ascii="var(--md-code-font-family)" w:eastAsiaTheme="minorHAnsi" w:hAnsi="var(--md-code-font-family)"/>
+          <w:b/>
+          <w:bCs/>
+        </w:rPr>
+        <w:t>filterByExpr</w:t>
+      </w:r>
+      <w:proofErr w:type="spellEnd"/>
+      <w:r>
+        <w:rPr>
+          <w:rFonts w:ascii="Roboto" w:hAnsi="Roboto"/>
+          <w:b/>
+          <w:bCs/>
+          <w:sz w:val="26"/>
+          <w:szCs w:val="26"/>
+          <w:shd w:val="clear" w:color="auto" w:fill="FFFFFF"/>
+        </w:rPr>
+        <w:t>, not just the significant ones.</w:t>
+      </w:r>
+      <w:r>
+        <w:rPr>
+          <w:rFonts w:ascii="Roboto" w:hAnsi="Roboto"/>
+          <w:b/>
+          <w:bCs/>
+          <w:sz w:val="26"/>
+          <w:szCs w:val="26"/>
+          <w:shd w:val="clear" w:color="auto" w:fill="FFFFFF"/>
+        </w:rPr>
+        <w:t>”</w:t>
+      </w:r>
+      <w:r>
+        <w:rPr>
+          <w:rFonts w:ascii="Roboto" w:hAnsi="Roboto"/>
+          <w:sz w:val="26"/>
+          <w:szCs w:val="26"/>
+          <w:shd w:val="clear" w:color="auto" w:fill="FFFFFF"/>
+        </w:rPr>
+        <w:t xml:space="preserve"> </w:t>
+      </w:r>
+      <w:r>
+        <w:rPr>
+          <w:rFonts w:ascii="Roboto" w:hAnsi="Roboto"/>
+          <w:sz w:val="26"/>
+          <w:szCs w:val="26"/>
+          <w:shd w:val="clear" w:color="auto" w:fill="FFFFFF"/>
+        </w:rPr>
+        <w:sym w:font="Wingdings" w:char="F0E0"/>
+      </w:r>
+      <w:r>
+        <w:rPr>
+          <w:rFonts w:ascii="Roboto" w:hAnsi="Roboto"/>
+          <w:sz w:val="26"/>
+          <w:szCs w:val="26"/>
+          <w:shd w:val="clear" w:color="auto" w:fill="FFFFFF"/>
+        </w:rPr>
+        <w:t xml:space="preserve"> </w:t>
+      </w:r>
+      <w:hyperlink r:id="rId8" w:history="1">
+        <w:r>
+          <w:rPr>
+            <w:rStyle w:val="Hyperlink"/>
+          </w:rPr>
+          <w:t>https://ufhcc-bcbsr.github.io/res-bioinfo-rnaseq-workshop/04_differential-expression/pathway-analysis/</w:t>
+        </w:r>
+      </w:hyperlink>
+    </w:p>
     <w:p/>
     <w:p>
       <w:pPr>
@@ -1936,7 +2310,15 @@
         <w:ind w:left="360"/>
       </w:pPr>
       <w:r>
-        <w:t>Question - Why did you use a higher significance threshold for miRNA-level enrichment (Padj &lt; 0</w:t>
+        <w:t>Question - Why did you use a higher significance threshold for miRNA-level enrichment (</w:t>
+      </w:r>
+      <w:proofErr w:type="spellStart"/>
+      <w:r>
+        <w:t>Padj</w:t>
+      </w:r>
+      <w:proofErr w:type="spellEnd"/>
+      <w:r>
+        <w:t xml:space="preserve"> &lt; 0</w:t>
       </w:r>
       <w:r>
         <w:rPr>
@@ -1945,7 +2327,15 @@
         <w:t>.</w:t>
       </w:r>
       <w:r>
-        <w:t>05) over target gene (Padj &lt; 0</w:t>
+        <w:t>05) over target gene (</w:t>
+      </w:r>
+      <w:proofErr w:type="spellStart"/>
+      <w:r>
+        <w:t>Padj</w:t>
+      </w:r>
+      <w:proofErr w:type="spellEnd"/>
+      <w:r>
+        <w:t xml:space="preserve"> &lt; 0</w:t>
       </w:r>
       <w:r>
         <w:rPr>
@@ -2049,7 +2439,31 @@
           <w:szCs w:val="21"/>
           <w:shd w:val="clear" w:color="auto" w:fill="FFFFFF"/>
         </w:rPr>
-        <w:t xml:space="preserve">“TMM is recommended for most RNA-Seq data where the majority (more than half) of the genes are believed not differentially expressed between any pair of the samples” </w:t>
+        <w:t>“TMM is recommended for most RNA-</w:t>
+      </w:r>
+      <w:proofErr w:type="spellStart"/>
+      <w:r>
+        <w:rPr>
+          <w:rFonts w:ascii="Segoe UI" w:hAnsi="Segoe UI" w:cs="Segoe UI"/>
+          <w:b/>
+          <w:bCs/>
+          <w:sz w:val="21"/>
+          <w:szCs w:val="21"/>
+          <w:shd w:val="clear" w:color="auto" w:fill="FFFFFF"/>
+        </w:rPr>
+        <w:t>Seq</w:t>
+      </w:r>
+      <w:proofErr w:type="spellEnd"/>
+      <w:r>
+        <w:rPr>
+          <w:rFonts w:ascii="Segoe UI" w:hAnsi="Segoe UI" w:cs="Segoe UI"/>
+          <w:b/>
+          <w:bCs/>
+          <w:sz w:val="21"/>
+          <w:szCs w:val="21"/>
+          <w:shd w:val="clear" w:color="auto" w:fill="FFFFFF"/>
+        </w:rPr>
+        <w:t xml:space="preserve"> data where the majority (more than half) of the genes are believed not differentially expressed between any pair of the samples” </w:t>
       </w:r>
       <w:r>
         <w:rPr>
@@ -2133,6 +2547,7 @@
         <w:rPr>
           <w:b/>
         </w:rPr>
+        <w:lastRenderedPageBreak/>
         <w:t>Secondly, through miRNA expression between replicates for the 27 DE miRNAs in the primary HBEC dataset.</w:t>
       </w:r>
       <w:r>
@@ -2154,7 +2569,6 @@
         <w:rPr>
           <w:b/>
         </w:rPr>
-        <w:lastRenderedPageBreak/>
         <w:t>This was performed because I noticed that some DE miRNAs were driven by a single control replicate that had different expression to the remaining replicates.</w:t>
       </w:r>
     </w:p>
@@ -2222,7 +2636,7 @@
           <w:numId w:val="19"/>
         </w:numPr>
       </w:pPr>
-      <w:hyperlink r:id="rId8" w:history="1">
+      <w:hyperlink r:id="rId9" w:history="1">
         <w:r>
           <w:rPr>
             <w:rStyle w:val="Hyperlink"/>
@@ -2239,7 +2653,7 @@
           <w:numId w:val="19"/>
         </w:numPr>
       </w:pPr>
-      <w:hyperlink r:id="rId9" w:history="1">
+      <w:hyperlink r:id="rId10" w:history="1">
         <w:r>
           <w:rPr>
             <w:rStyle w:val="Hyperlink"/>
@@ -2256,7 +2670,7 @@
           <w:numId w:val="19"/>
         </w:numPr>
       </w:pPr>
-      <w:hyperlink r:id="rId10" w:history="1">
+      <w:hyperlink r:id="rId11" w:history="1">
         <w:r>
           <w:rPr>
             <w:rStyle w:val="Hyperlink"/>
@@ -2309,7 +2723,7 @@
           <w:numId w:val="19"/>
         </w:numPr>
       </w:pPr>
-      <w:hyperlink r:id="rId11" w:anchor="Sec39" w:history="1">
+      <w:hyperlink r:id="rId12" w:anchor="Sec39" w:history="1">
         <w:r>
           <w:rPr>
             <w:rStyle w:val="Hyperlink"/>
@@ -2326,7 +2740,7 @@
           <w:numId w:val="19"/>
         </w:numPr>
       </w:pPr>
-      <w:hyperlink r:id="rId12" w:history="1">
+      <w:hyperlink r:id="rId13" w:history="1">
         <w:r>
           <w:rPr>
             <w:rStyle w:val="Hyperlink"/>
@@ -2343,7 +2757,7 @@
           <w:numId w:val="19"/>
         </w:numPr>
       </w:pPr>
-      <w:hyperlink r:id="rId13" w:history="1">
+      <w:hyperlink r:id="rId14" w:history="1">
         <w:r>
           <w:rPr>
             <w:rStyle w:val="Hyperlink"/>
@@ -2360,7 +2774,7 @@
           <w:numId w:val="19"/>
         </w:numPr>
       </w:pPr>
-      <w:hyperlink r:id="rId14" w:history="1">
+      <w:hyperlink r:id="rId15" w:history="1">
         <w:r>
           <w:rPr>
             <w:rStyle w:val="Hyperlink"/>
@@ -2393,7 +2807,7 @@
           <w:numId w:val="19"/>
         </w:numPr>
       </w:pPr>
-      <w:hyperlink r:id="rId15" w:history="1">
+      <w:hyperlink r:id="rId16" w:history="1">
         <w:r>
           <w:rPr>
             <w:rStyle w:val="Hyperlink"/>
@@ -2620,7 +3034,7 @@
           <w:numId w:val="22"/>
         </w:numPr>
       </w:pPr>
-      <w:hyperlink r:id="rId16" w:history="1">
+      <w:hyperlink r:id="rId17" w:history="1">
         <w:r>
           <w:rPr>
             <w:rStyle w:val="Hyperlink"/>
@@ -2639,7 +3053,7 @@
           <w:numId w:val="22"/>
         </w:numPr>
       </w:pPr>
-      <w:hyperlink r:id="rId17" w:history="1">
+      <w:hyperlink r:id="rId18" w:history="1">
         <w:r>
           <w:rPr>
             <w:rStyle w:val="Hyperlink"/>
@@ -2658,7 +3072,7 @@
           <w:numId w:val="22"/>
         </w:numPr>
       </w:pPr>
-      <w:hyperlink r:id="rId18" w:history="1">
+      <w:hyperlink r:id="rId19" w:history="1">
         <w:r>
           <w:rPr>
             <w:rStyle w:val="Hyperlink"/>
@@ -2728,7 +3142,7 @@
           <w:numId w:val="22"/>
         </w:numPr>
       </w:pPr>
-      <w:hyperlink r:id="rId19" w:history="1">
+      <w:hyperlink r:id="rId20" w:history="1">
         <w:r>
           <w:rPr>
             <w:rStyle w:val="Hyperlink"/>
@@ -2799,7 +3213,7 @@
         </w:rPr>
         <w:t xml:space="preserve">Fc receptors are found on immune cells and binding with these receptors can trigger immune cascades and lead to “hypersensitivity reactions”. </w:t>
       </w:r>
-      <w:hyperlink r:id="rId20" w:history="1">
+      <w:hyperlink r:id="rId21" w:history="1">
         <w:r>
           <w:rPr>
             <w:rStyle w:val="Hyperlink"/>
@@ -2832,7 +3246,7 @@
         </w:rPr>
         <w:t xml:space="preserve">Activation of Fc receptors lead to allergic responses </w:t>
       </w:r>
-      <w:hyperlink r:id="rId21" w:history="1">
+      <w:hyperlink r:id="rId22" w:history="1">
         <w:r>
           <w:rPr>
             <w:rStyle w:val="Hyperlink"/>
@@ -2863,7 +3277,7 @@
         </w:rPr>
         <w:t xml:space="preserve">Browne et al., 2025 </w:t>
       </w:r>
-      <w:hyperlink r:id="rId22" w:history="1">
+      <w:hyperlink r:id="rId23" w:history="1">
         <w:r>
           <w:rPr>
             <w:rStyle w:val="Hyperlink"/>
@@ -2887,8 +3301,17 @@
           <w:b/>
           <w:bCs/>
         </w:rPr>
-        <w:t>IL-4 and IL-13 are the same pathway annotation in Reactome</w:t>
-      </w:r>
+        <w:t xml:space="preserve">IL-4 and IL-13 are the same pathway annotation in </w:t>
+      </w:r>
+      <w:proofErr w:type="spellStart"/>
+      <w:r>
+        <w:rPr>
+          <w:b/>
+          <w:bCs/>
+        </w:rPr>
+        <w:t>Reactome</w:t>
+      </w:r>
+      <w:proofErr w:type="spellEnd"/>
     </w:p>
     <w:p>
       <w:pPr>
@@ -2905,7 +3328,7 @@
         </w:rPr>
         <w:t xml:space="preserve">Interleukin source that discusses all interleukins: </w:t>
       </w:r>
-      <w:hyperlink r:id="rId23" w:history="1">
+      <w:hyperlink r:id="rId24" w:history="1">
         <w:r>
           <w:rPr>
             <w:rStyle w:val="Hyperlink"/>
@@ -3000,7 +3423,23 @@
           <w:b/>
           <w:bCs/>
         </w:rPr>
-        <w:t>The pattern I observed of high doses having more miRNA may be a technical artefact, not representative of the population. Therefore, there wasn’t a trend to begin with.</w:t>
+        <w:t xml:space="preserve">The pattern I observed of high doses having more </w:t>
+      </w:r>
+      <w:proofErr w:type="gramStart"/>
+      <w:r>
+        <w:rPr>
+          <w:b/>
+          <w:bCs/>
+        </w:rPr>
+        <w:t>miRNA</w:t>
+      </w:r>
+      <w:proofErr w:type="gramEnd"/>
+      <w:r>
+        <w:rPr>
+          <w:b/>
+          <w:bCs/>
+        </w:rPr>
+        <w:t xml:space="preserve"> may be a technical artefact, not representative of the population. Therefore, there wasn’t a trend to begin with.</w:t>
       </w:r>
     </w:p>
     <w:p>
@@ -3067,7 +3506,23 @@
           <w:b/>
           <w:bCs/>
         </w:rPr>
-        <w:t>I would like to look at the distribution of reads in this sample to see whether it is only a few miRNAs that have caused the massive increase or it is a blanket increase of all detected miRNA expression.</w:t>
+        <w:t xml:space="preserve">I would like to look at the distribution of reads in this sample to see whether it is only a few miRNAs that have caused the massive increase or </w:t>
+      </w:r>
+      <w:proofErr w:type="gramStart"/>
+      <w:r>
+        <w:rPr>
+          <w:b/>
+          <w:bCs/>
+        </w:rPr>
+        <w:t>it is</w:t>
+      </w:r>
+      <w:proofErr w:type="gramEnd"/>
+      <w:r>
+        <w:rPr>
+          <w:b/>
+          <w:bCs/>
+        </w:rPr>
+        <w:t xml:space="preserve"> a blanket increase of all detected miRNA expression.</w:t>
       </w:r>
     </w:p>
     <w:p>
@@ -3114,7 +3569,15 @@
         <w:ind w:left="360"/>
       </w:pPr>
       <w:r>
-        <w:t>Question - Why is RT-qPCR necessary if you already have small RNA-seq data?</w:t>
+        <w:t>Question - Why is RT-qPCR necessary if you already have small RNA-</w:t>
+      </w:r>
+      <w:proofErr w:type="spellStart"/>
+      <w:r>
+        <w:t>seq</w:t>
+      </w:r>
+      <w:proofErr w:type="spellEnd"/>
+      <w:r>
+        <w:t xml:space="preserve"> data?</w:t>
       </w:r>
     </w:p>
     <w:p>
@@ -3149,8 +3612,17 @@
           <w:b/>
           <w:bCs/>
         </w:rPr>
-        <w:t>RNA-seq</w:t>
-      </w:r>
+        <w:t>RNA-</w:t>
+      </w:r>
+      <w:proofErr w:type="spellStart"/>
+      <w:r>
+        <w:rPr>
+          <w:b/>
+          <w:bCs/>
+        </w:rPr>
+        <w:t>seq</w:t>
+      </w:r>
+      <w:proofErr w:type="spellEnd"/>
       <w:r>
         <w:rPr>
           <w:b/>
@@ -3170,8 +3642,13 @@
       <w:r>
         <w:t>“</w:t>
       </w:r>
-      <w:r>
-        <w:t>specificity is still a major issue because miRNA molecules are very short and many miRNAs differ by only one or a few bases</w:t>
+      <w:proofErr w:type="gramStart"/>
+      <w:r>
+        <w:t>specificity</w:t>
+      </w:r>
+      <w:proofErr w:type="gramEnd"/>
+      <w:r>
+        <w:t xml:space="preserve"> is still a major issue because miRNA molecules are very short and many miRNAs differ by only one or a few bases</w:t>
       </w:r>
       <w:r>
         <w:t xml:space="preserve">” </w:t>
@@ -3182,7 +3659,7 @@
       <w:r>
         <w:t xml:space="preserve"> </w:t>
       </w:r>
-      <w:hyperlink r:id="rId24" w:history="1">
+      <w:hyperlink r:id="rId25" w:history="1">
         <w:r>
           <w:rPr>
             <w:rStyle w:val="Hyperlink"/>
@@ -3416,7 +3893,15 @@
         <w:t xml:space="preserve">I tested </w:t>
       </w:r>
       <w:r>
-        <w:t>how many target genes each miRNA had and these ranged from a couple hundred to 10k.</w:t>
+        <w:t xml:space="preserve">how many target genes each miRNA </w:t>
+      </w:r>
+      <w:proofErr w:type="gramStart"/>
+      <w:r>
+        <w:t>had</w:t>
+      </w:r>
+      <w:proofErr w:type="gramEnd"/>
+      <w:r>
+        <w:t xml:space="preserve"> and these ranged from a couple hundred to 10k.</w:t>
       </w:r>
     </w:p>
     <w:p/>
@@ -3768,7 +4253,7 @@
       <w:r>
         <w:t xml:space="preserve">: </w:t>
       </w:r>
-      <w:hyperlink r:id="rId25" w:history="1">
+      <w:hyperlink r:id="rId26" w:history="1">
         <w:r>
           <w:rPr>
             <w:rStyle w:val="Hyperlink"/>
@@ -3785,7 +4270,7 @@
           <w:numId w:val="30"/>
         </w:numPr>
       </w:pPr>
-      <w:hyperlink r:id="rId26" w:history="1">
+      <w:hyperlink r:id="rId27" w:history="1">
         <w:r>
           <w:rPr>
             <w:rStyle w:val="Hyperlink"/>
@@ -4039,7 +4524,15 @@
         <w:t xml:space="preserve">Lots of expressed genes – </w:t>
       </w:r>
       <w:r>
-        <w:t>The airway cells expressed &gt;12k genes each anyway so it was the majority of the genome.</w:t>
+        <w:t xml:space="preserve">The airway cells expressed &gt;12k genes each anyway so it was </w:t>
+      </w:r>
+      <w:proofErr w:type="gramStart"/>
+      <w:r>
+        <w:t>the majority of</w:t>
+      </w:r>
+      <w:proofErr w:type="gramEnd"/>
+      <w:r>
+        <w:t xml:space="preserve"> the genome.</w:t>
       </w:r>
     </w:p>
     <w:p>
@@ -4386,7 +4879,21 @@
         <w:rPr>
           <w:b/>
         </w:rPr>
-        <w:t>Replicate number is something that has to be considered in terms of cost.</w:t>
+        <w:t xml:space="preserve">Replicate number is something that </w:t>
+      </w:r>
+      <w:proofErr w:type="gramStart"/>
+      <w:r>
+        <w:rPr>
+          <w:b/>
+        </w:rPr>
+        <w:t>has to</w:t>
+      </w:r>
+      <w:proofErr w:type="gramEnd"/>
+      <w:r>
+        <w:rPr>
+          <w:b/>
+        </w:rPr>
+        <w:t xml:space="preserve"> be considered in terms of cost.</w:t>
       </w:r>
     </w:p>
     <w:p>
@@ -4612,7 +5119,7 @@
                     <pic:cNvPicPr/>
                   </pic:nvPicPr>
                   <pic:blipFill>
-                    <a:blip r:embed="rId27"/>
+                    <a:blip r:embed="rId28"/>
                     <a:stretch>
                       <a:fillRect/>
                     </a:stretch>
@@ -4884,7 +5391,23 @@
           <w:b/>
           <w:bCs/>
         </w:rPr>
-        <w:t>The target gene list I initially got was ~15k genes therefore the associated pathways were not specific at all. I then tested many ways to reduce the size of the list but each method had a disadvantage.</w:t>
+        <w:t xml:space="preserve">The target gene list I initially got was ~15k genes therefore the associated pathways were not specific at all. I then tested many ways to reduce the size of the </w:t>
+      </w:r>
+      <w:proofErr w:type="gramStart"/>
+      <w:r>
+        <w:rPr>
+          <w:b/>
+          <w:bCs/>
+        </w:rPr>
+        <w:t>list</w:t>
+      </w:r>
+      <w:proofErr w:type="gramEnd"/>
+      <w:r>
+        <w:rPr>
+          <w:b/>
+          <w:bCs/>
+        </w:rPr>
+        <w:t xml:space="preserve"> but each method had a disadvantage.</w:t>
       </w:r>
     </w:p>
     <w:p>
@@ -5134,7 +5657,7 @@
       <w:r>
         <w:t xml:space="preserve">Using miRNAs as biomarkers for allergic rhinitis (nose reacts to allergens) </w:t>
       </w:r>
-      <w:hyperlink r:id="rId28" w:history="1">
+      <w:hyperlink r:id="rId29" w:history="1">
         <w:r>
           <w:rPr>
             <w:rStyle w:val="Hyperlink"/>
@@ -5196,7 +5719,7 @@
       <w:r>
         <w:t xml:space="preserve">More research needs to be done to investigate sex effects. This paper suggests miRNAs may be involved in explaining the “higher susceptibility of females to asthma” </w:t>
       </w:r>
-      <w:hyperlink r:id="rId29" w:history="1">
+      <w:hyperlink r:id="rId30" w:history="1">
         <w:r>
           <w:rPr>
             <w:rStyle w:val="Hyperlink"/>
@@ -5234,7 +5757,7 @@
       <w:r>
         <w:t xml:space="preserve">WB’s literature review: </w:t>
       </w:r>
-      <w:hyperlink r:id="rId30" w:history="1">
+      <w:hyperlink r:id="rId31" w:history="1">
         <w:r>
           <w:rPr>
             <w:rStyle w:val="Hyperlink"/>
@@ -5272,7 +5795,15 @@
         </w:numPr>
       </w:pPr>
       <w:r>
-        <w:t>Supplementary table 2 listing all the DE miRNAs is wrong for all the protease samples – it just shows the der p 1 inactive results for each of the protease conditions</w:t>
+        <w:t xml:space="preserve">Supplementary table 2 listing all the DE miRNAs </w:t>
+      </w:r>
+      <w:proofErr w:type="gramStart"/>
+      <w:r>
+        <w:t>is</w:t>
+      </w:r>
+      <w:proofErr w:type="gramEnd"/>
+      <w:r>
+        <w:t xml:space="preserve"> wrong for all the protease samples – it just shows the der p 1 inactive results for each of the protease conditions</w:t>
       </w:r>
       <w:r>
         <w:rPr>
@@ -5601,6 +6132,9 @@
       <w:r>
         <w:t>Additional references</w:t>
       </w:r>
+      <w:r>
+        <w:t xml:space="preserve"> / notes</w:t>
+      </w:r>
     </w:p>
     <w:p>
       <w:pPr>
@@ -5613,7 +6147,7 @@
       <w:r>
         <w:t xml:space="preserve">Mimics and inhibitors were used in previous studies </w:t>
       </w:r>
-      <w:hyperlink r:id="rId31" w:history="1">
+      <w:hyperlink r:id="rId32" w:history="1">
         <w:r>
           <w:rPr>
             <w:rStyle w:val="Hyperlink"/>
@@ -5656,6 +6190,337 @@
           <w:numId w:val="3"/>
         </w:numPr>
       </w:pPr>
+      <w:r>
+        <w:t xml:space="preserve">Anticorrelated, integrated matched miRNA-mRNA data </w:t>
+      </w:r>
+      <w:hyperlink r:id="rId33" w:history="1">
+        <w:r>
+          <w:rPr>
+            <w:rStyle w:val="Hyperlink"/>
+          </w:rPr>
+          <w:t>https://isevjournals.onlinelibrary.wiley.com/doi/full/10.1002/jex2.134</w:t>
+        </w:r>
+      </w:hyperlink>
+    </w:p>
+    <w:p>
+      <w:pPr>
+        <w:pStyle w:val="ListParagraph"/>
+        <w:numPr>
+          <w:ilvl w:val="0"/>
+          <w:numId w:val="3"/>
+        </w:numPr>
+      </w:pPr>
+      <w:r>
+        <w:t xml:space="preserve">Raw sequencing data was </w:t>
+      </w:r>
+      <w:r>
+        <w:t>single end</w:t>
+      </w:r>
+      <w:r>
+        <w:t xml:space="preserve"> reads.</w:t>
+      </w:r>
+    </w:p>
+    <w:p>
+      <w:pPr>
+        <w:pStyle w:val="ListParagraph"/>
+        <w:numPr>
+          <w:ilvl w:val="0"/>
+          <w:numId w:val="3"/>
+        </w:numPr>
+      </w:pPr>
+      <w:r>
+        <w:t>Other methods to check for outlier samples:</w:t>
+      </w:r>
+    </w:p>
+    <w:p>
+      <w:pPr>
+        <w:pStyle w:val="ListParagraph"/>
+        <w:numPr>
+          <w:ilvl w:val="1"/>
+          <w:numId w:val="3"/>
+        </w:numPr>
+      </w:pPr>
+      <w:proofErr w:type="spellStart"/>
+      <w:proofErr w:type="gramStart"/>
+      <w:r>
+        <w:t>PlotMDS</w:t>
+      </w:r>
+      <w:proofErr w:type="spellEnd"/>
+      <w:r>
+        <w:t>(</w:t>
+      </w:r>
+      <w:proofErr w:type="gramEnd"/>
+      <w:r>
+        <w:t>) in edgeR</w:t>
+      </w:r>
+    </w:p>
+    <w:p>
+      <w:pPr>
+        <w:ind w:left="720"/>
+      </w:pPr>
+      <w:r>
+        <w:lastRenderedPageBreak/>
+        <w:drawing>
+          <wp:inline distT="0" distB="0" distL="0" distR="0" wp14:anchorId="7830F8BA" wp14:editId="09C2FAA0">
+            <wp:extent cx="2444435" cy="2061493"/>
+            <wp:effectExtent l="0" t="0" r="0" b="0"/>
+            <wp:docPr id="1891268113" name="Picture 1"/>
+            <wp:cNvGraphicFramePr>
+              <a:graphicFrameLocks xmlns:a="http://schemas.openxmlformats.org/drawingml/2006/main" noChangeAspect="1"/>
+            </wp:cNvGraphicFramePr>
+            <a:graphic xmlns:a="http://schemas.openxmlformats.org/drawingml/2006/main">
+              <a:graphicData uri="http://schemas.openxmlformats.org/drawingml/2006/picture">
+                <pic:pic xmlns:pic="http://schemas.openxmlformats.org/drawingml/2006/picture">
+                  <pic:nvPicPr>
+                    <pic:cNvPr id="1891268113" name=""/>
+                    <pic:cNvPicPr/>
+                  </pic:nvPicPr>
+                  <pic:blipFill>
+                    <a:blip r:embed="rId34"/>
+                    <a:stretch>
+                      <a:fillRect/>
+                    </a:stretch>
+                  </pic:blipFill>
+                  <pic:spPr>
+                    <a:xfrm>
+                      <a:off x="0" y="0"/>
+                      <a:ext cx="2458703" cy="2073526"/>
+                    </a:xfrm>
+                    <a:prstGeom prst="rect">
+                      <a:avLst/>
+                    </a:prstGeom>
+                  </pic:spPr>
+                </pic:pic>
+              </a:graphicData>
+            </a:graphic>
+          </wp:inline>
+        </w:drawing>
+      </w:r>
+    </w:p>
+    <w:p>
+      <w:pPr>
+        <w:pStyle w:val="ListParagraph"/>
+        <w:numPr>
+          <w:ilvl w:val="1"/>
+          <w:numId w:val="3"/>
+        </w:numPr>
+      </w:pPr>
+      <w:proofErr w:type="spellStart"/>
+      <w:proofErr w:type="gramStart"/>
+      <w:r>
+        <w:t>plotMDS</w:t>
+      </w:r>
+      <w:proofErr w:type="spellEnd"/>
+      <w:r>
+        <w:t>(</w:t>
+      </w:r>
+      <w:proofErr w:type="gramEnd"/>
+      <w:r>
+        <w:t>), method = BCV (biological coefficient of variation) in edgeR</w:t>
+      </w:r>
+    </w:p>
+    <w:p>
+      <w:pPr>
+        <w:ind w:left="1080"/>
+      </w:pPr>
+      <w:r>
+        <w:drawing>
+          <wp:inline distT="0" distB="0" distL="0" distR="0" wp14:anchorId="181573C4" wp14:editId="3F01C9F5">
+            <wp:extent cx="2217779" cy="1870346"/>
+            <wp:effectExtent l="0" t="0" r="5080" b="0"/>
+            <wp:docPr id="36230374" name="Picture 1"/>
+            <wp:cNvGraphicFramePr>
+              <a:graphicFrameLocks xmlns:a="http://schemas.openxmlformats.org/drawingml/2006/main" noChangeAspect="1"/>
+            </wp:cNvGraphicFramePr>
+            <a:graphic xmlns:a="http://schemas.openxmlformats.org/drawingml/2006/main">
+              <a:graphicData uri="http://schemas.openxmlformats.org/drawingml/2006/picture">
+                <pic:pic xmlns:pic="http://schemas.openxmlformats.org/drawingml/2006/picture">
+                  <pic:nvPicPr>
+                    <pic:cNvPr id="36230374" name=""/>
+                    <pic:cNvPicPr/>
+                  </pic:nvPicPr>
+                  <pic:blipFill>
+                    <a:blip r:embed="rId35"/>
+                    <a:stretch>
+                      <a:fillRect/>
+                    </a:stretch>
+                  </pic:blipFill>
+                  <pic:spPr>
+                    <a:xfrm>
+                      <a:off x="0" y="0"/>
+                      <a:ext cx="2266760" cy="1911654"/>
+                    </a:xfrm>
+                    <a:prstGeom prst="rect">
+                      <a:avLst/>
+                    </a:prstGeom>
+                  </pic:spPr>
+                </pic:pic>
+              </a:graphicData>
+            </a:graphic>
+          </wp:inline>
+        </w:drawing>
+      </w:r>
+    </w:p>
+    <w:p>
+      <w:pPr>
+        <w:pStyle w:val="ListParagraph"/>
+        <w:numPr>
+          <w:ilvl w:val="0"/>
+          <w:numId w:val="3"/>
+        </w:numPr>
+      </w:pPr>
+      <w:r>
+        <w:t xml:space="preserve">Just checked the </w:t>
+      </w:r>
+      <w:proofErr w:type="spellStart"/>
+      <w:r>
+        <w:t>tarbase</w:t>
+      </w:r>
+      <w:proofErr w:type="spellEnd"/>
+      <w:r>
+        <w:t xml:space="preserve"> website (previously I’d only checked the </w:t>
+      </w:r>
+      <w:proofErr w:type="spellStart"/>
+      <w:r>
+        <w:t>mirtarbase</w:t>
+      </w:r>
+      <w:proofErr w:type="spellEnd"/>
+      <w:r>
+        <w:t xml:space="preserve"> website where it gave ‘weak’ and ‘strong’ evidence) and it allows filtering based on ‘tissue’</w:t>
+      </w:r>
+    </w:p>
+    <w:p>
+      <w:pPr>
+        <w:pStyle w:val="ListParagraph"/>
+        <w:numPr>
+          <w:ilvl w:val="1"/>
+          <w:numId w:val="3"/>
+        </w:numPr>
+      </w:pPr>
+      <w:r>
+        <w:t xml:space="preserve">This reduced one miRNA (has-miR-16-5p) target interactions from </w:t>
+      </w:r>
+      <w:r>
+        <w:rPr>
+          <w:b/>
+          <w:bCs/>
+        </w:rPr>
+        <w:t>67,363</w:t>
+      </w:r>
+      <w:r>
+        <w:t xml:space="preserve"> to </w:t>
+      </w:r>
+      <w:r>
+        <w:rPr>
+          <w:b/>
+          <w:bCs/>
+        </w:rPr>
+        <w:t>56</w:t>
+      </w:r>
+      <w:r>
+        <w:t xml:space="preserve"> interactions.</w:t>
+      </w:r>
+    </w:p>
+    <w:p>
+      <w:r>
+        <w:drawing>
+          <wp:inline distT="0" distB="0" distL="0" distR="0" wp14:anchorId="04F8DAAD" wp14:editId="51F928E5">
+            <wp:extent cx="5731510" cy="813435"/>
+            <wp:effectExtent l="0" t="0" r="0" b="0"/>
+            <wp:docPr id="572577123" name="Picture 1"/>
+            <wp:cNvGraphicFramePr>
+              <a:graphicFrameLocks xmlns:a="http://schemas.openxmlformats.org/drawingml/2006/main" noChangeAspect="1"/>
+            </wp:cNvGraphicFramePr>
+            <a:graphic xmlns:a="http://schemas.openxmlformats.org/drawingml/2006/main">
+              <a:graphicData uri="http://schemas.openxmlformats.org/drawingml/2006/picture">
+                <pic:pic xmlns:pic="http://schemas.openxmlformats.org/drawingml/2006/picture">
+                  <pic:nvPicPr>
+                    <pic:cNvPr id="572577123" name=""/>
+                    <pic:cNvPicPr/>
+                  </pic:nvPicPr>
+                  <pic:blipFill>
+                    <a:blip r:embed="rId36"/>
+                    <a:stretch>
+                      <a:fillRect/>
+                    </a:stretch>
+                  </pic:blipFill>
+                  <pic:spPr>
+                    <a:xfrm>
+                      <a:off x="0" y="0"/>
+                      <a:ext cx="5731510" cy="813435"/>
+                    </a:xfrm>
+                    <a:prstGeom prst="rect">
+                      <a:avLst/>
+                    </a:prstGeom>
+                  </pic:spPr>
+                </pic:pic>
+              </a:graphicData>
+            </a:graphic>
+          </wp:inline>
+        </w:drawing>
+      </w:r>
+      <w:r>
+        <w:t xml:space="preserve"> </w:t>
+      </w:r>
+      <w:r>
+        <w:sym w:font="Wingdings" w:char="F0E0"/>
+      </w:r>
+      <w:r>
+        <w:t xml:space="preserve"> before filtering</w:t>
+      </w:r>
+    </w:p>
+    <w:p>
+      <w:r>
+        <w:drawing>
+          <wp:inline distT="0" distB="0" distL="0" distR="0" wp14:anchorId="45435B25" wp14:editId="18AF9951">
+            <wp:extent cx="5731510" cy="813435"/>
+            <wp:effectExtent l="0" t="0" r="0" b="0"/>
+            <wp:docPr id="927945646" name="Picture 1"/>
+            <wp:cNvGraphicFramePr>
+              <a:graphicFrameLocks xmlns:a="http://schemas.openxmlformats.org/drawingml/2006/main" noChangeAspect="1"/>
+            </wp:cNvGraphicFramePr>
+            <a:graphic xmlns:a="http://schemas.openxmlformats.org/drawingml/2006/main">
+              <a:graphicData uri="http://schemas.openxmlformats.org/drawingml/2006/picture">
+                <pic:pic xmlns:pic="http://schemas.openxmlformats.org/drawingml/2006/picture">
+                  <pic:nvPicPr>
+                    <pic:cNvPr id="927945646" name=""/>
+                    <pic:cNvPicPr/>
+                  </pic:nvPicPr>
+                  <pic:blipFill>
+                    <a:blip r:embed="rId37"/>
+                    <a:stretch>
+                      <a:fillRect/>
+                    </a:stretch>
+                  </pic:blipFill>
+                  <pic:spPr>
+                    <a:xfrm>
+                      <a:off x="0" y="0"/>
+                      <a:ext cx="5731510" cy="813435"/>
+                    </a:xfrm>
+                    <a:prstGeom prst="rect">
+                      <a:avLst/>
+                    </a:prstGeom>
+                  </pic:spPr>
+                </pic:pic>
+              </a:graphicData>
+            </a:graphic>
+          </wp:inline>
+        </w:drawing>
+      </w:r>
+      <w:r>
+        <w:t xml:space="preserve"> </w:t>
+      </w:r>
+      <w:r>
+        <w:sym w:font="Wingdings" w:char="F0E0"/>
+      </w:r>
+      <w:r>
+        <w:t xml:space="preserve"> after filtering</w:t>
+      </w:r>
+    </w:p>
+    <w:p>
+      <w:pPr>
+        <w:ind w:left="1080"/>
+      </w:pPr>
     </w:p>
     <w:p/>
     <w:p/>
@@ -7471,7 +8336,7 @@
         <w:rFonts w:ascii="Aptos" w:eastAsiaTheme="minorHAnsi" w:hAnsi="Aptos" w:cstheme="minorBidi" w:hint="default"/>
       </w:rPr>
     </w:lvl>
-    <w:lvl w:ilvl="1" w:tplc="08090003" w:tentative="1">
+    <w:lvl w:ilvl="1" w:tplc="08090003">
       <w:start w:val="1"/>
       <w:numFmt w:val="bullet"/>
       <w:lvlText w:val="o"/>
@@ -7483,7 +8348,7 @@
         <w:rFonts w:ascii="Courier New" w:hAnsi="Courier New" w:cs="Courier New" w:hint="default"/>
       </w:rPr>
     </w:lvl>
-    <w:lvl w:ilvl="2" w:tplc="08090005" w:tentative="1">
+    <w:lvl w:ilvl="2" w:tplc="08090005">
       <w:start w:val="1"/>
       <w:numFmt w:val="bullet"/>
       <w:lvlText w:val=""/>
@@ -11482,6 +12347,24 @@
       <w:spacing w:after="0" w:line="240" w:lineRule="auto"/>
     </w:pPr>
   </w:style>
+  <w:style w:type="character" w:customStyle="1" w:styleId="apple-converted-space">
+    <w:name w:val="apple-converted-space"/>
+    <w:basedOn w:val="DefaultParagraphFont"/>
+    <w:rsid w:val="003F412D"/>
+  </w:style>
+  <w:style w:type="character" w:styleId="HTMLCode">
+    <w:name w:val="HTML Code"/>
+    <w:basedOn w:val="DefaultParagraphFont"/>
+    <w:uiPriority w:val="99"/>
+    <w:semiHidden/>
+    <w:unhideWhenUsed/>
+    <w:rsid w:val="003F412D"/>
+    <w:rPr>
+      <w:rFonts w:ascii="Courier New" w:eastAsia="Times New Roman" w:hAnsi="Courier New" w:cs="Courier New"/>
+      <w:sz w:val="20"/>
+      <w:szCs w:val="20"/>
+    </w:rPr>
+  </w:style>
 </w:styles>
 </file>
 

</xml_diff>

<commit_message>
ADDING TODAY'S WORK - 10.09.2026
</commit_message>
<xml_diff>
--- a/viva/questions/viva_questions_DRAFT_1.docx
+++ b/viva/questions/viva_questions_DRAFT_1.docx
@@ -1679,14 +1679,12 @@
         </w:rPr>
         <w:t xml:space="preserve">The primary HBEC dataset provides more evidence for allergen-exposed effects on EV miRNA cargo, which is relatively </w:t>
       </w:r>
-      <w:proofErr w:type="spellStart"/>
-      <w:r>
-        <w:rPr>
-          <w:b/>
-        </w:rPr>
-        <w:t>undertstudied</w:t>
-      </w:r>
-      <w:proofErr w:type="spellEnd"/>
+      <w:r>
+        <w:rPr>
+          <w:b/>
+        </w:rPr>
+        <w:t>understudied</w:t>
+      </w:r>
       <w:r>
         <w:rPr>
           <w:b/>
@@ -2250,18 +2248,7 @@
           <w:szCs w:val="26"/>
           <w:shd w:val="clear" w:color="auto" w:fill="FFFFFF"/>
         </w:rPr>
-        <w:t>, not just the significant ones.</w:t>
-      </w:r>
-      <w:r>
-        <w:rPr>
-          <w:rFonts w:ascii="Roboto" w:hAnsi="Roboto"/>
-          <w:b/>
-          <w:bCs/>
-          <w:sz w:val="26"/>
-          <w:szCs w:val="26"/>
-          <w:shd w:val="clear" w:color="auto" w:fill="FFFFFF"/>
-        </w:rPr>
-        <w:t>”</w:t>
+        <w:t>, not just the significant ones.”</w:t>
       </w:r>
       <w:r>
         <w:rPr>
@@ -2500,6 +2487,77 @@
         <w:t>Then used a quasi-likelihood F test to fit the statistical model.</w:t>
       </w:r>
     </w:p>
+    <w:p>
+      <w:pPr>
+        <w:pStyle w:val="ListParagraph"/>
+        <w:numPr>
+          <w:ilvl w:val="0"/>
+          <w:numId w:val="17"/>
+        </w:numPr>
+        <w:rPr>
+          <w:b/>
+          <w:bCs/>
+        </w:rPr>
+      </w:pPr>
+      <w:r>
+        <w:rPr>
+          <w:b/>
+          <w:bCs/>
+        </w:rPr>
+        <w:t>D</w:t>
+      </w:r>
+      <w:r>
+        <w:rPr>
+          <w:b/>
+          <w:bCs/>
+        </w:rPr>
+        <w:t>ES</w:t>
+      </w:r>
+      <w:r>
+        <w:rPr>
+          <w:b/>
+          <w:bCs/>
+        </w:rPr>
+        <w:t>eq2</w:t>
+      </w:r>
+      <w:r>
+        <w:rPr>
+          <w:b/>
+          <w:bCs/>
+        </w:rPr>
+        <w:t xml:space="preserve"> uses a different normalisation method therefore it would have been interesting to compare my DE results to deseq2, but I never completed this because</w:t>
+      </w:r>
+      <w:r>
+        <w:rPr>
+          <w:b/>
+          <w:bCs/>
+        </w:rPr>
+        <w:t xml:space="preserve"> </w:t>
+      </w:r>
+      <w:r>
+        <w:rPr>
+          <w:b/>
+          <w:bCs/>
+        </w:rPr>
+        <w:t xml:space="preserve">pathway analysis took </w:t>
+      </w:r>
+      <w:proofErr w:type="gramStart"/>
+      <w:r>
+        <w:rPr>
+          <w:b/>
+          <w:bCs/>
+        </w:rPr>
+        <w:t>the majority of</w:t>
+      </w:r>
+      <w:proofErr w:type="gramEnd"/>
+      <w:r>
+        <w:rPr>
+          <w:b/>
+          <w:bCs/>
+        </w:rPr>
+        <w:t xml:space="preserve"> my focus and time.</w:t>
+      </w:r>
+    </w:p>
     <w:p/>
     <w:p>
       <w:pPr>
@@ -2526,6 +2584,7 @@
         <w:rPr>
           <w:b/>
         </w:rPr>
+        <w:lastRenderedPageBreak/>
         <w:t>Firstly, through PCA analysis separation. This assessed both between conditions and between replicates.</w:t>
       </w:r>
       <w:r>
@@ -2547,7 +2606,6 @@
         <w:rPr>
           <w:b/>
         </w:rPr>
-        <w:lastRenderedPageBreak/>
         <w:t>Secondly, through miRNA expression between replicates for the 27 DE miRNAs in the primary HBEC dataset.</w:t>
       </w:r>
       <w:r>
@@ -2910,6 +2968,7 @@
         <w:rPr>
           <w:b/>
         </w:rPr>
+        <w:lastRenderedPageBreak/>
         <w:t>Because filtering removed many miRNAs that it considered to be noise, but these might have been real expressed miRNAs (only 58 out of 263 miRNAs were retained) and this will have altered the statistical model.</w:t>
       </w:r>
     </w:p>
@@ -2924,7 +2983,6 @@
         <w:ind w:left="360"/>
       </w:pPr>
       <w:r>
-        <w:lastRenderedPageBreak/>
         <w:t>Question - Why do the same pathways appear in both upregulated and downregulated DE miRNAs for target gene-level enrichment?</w:t>
       </w:r>
     </w:p>
@@ -3211,7 +3269,21 @@
           <w:b/>
           <w:bCs/>
         </w:rPr>
-        <w:t xml:space="preserve">Fc receptors are found on immune cells and binding with these receptors can trigger immune cascades and lead to “hypersensitivity reactions”. </w:t>
+        <w:t xml:space="preserve">Fc receptors are found on immune cells </w:t>
+      </w:r>
+      <w:r>
+        <w:rPr>
+          <w:b/>
+          <w:bCs/>
+        </w:rPr>
+        <w:t xml:space="preserve">and bind with antibodies, </w:t>
+      </w:r>
+      <w:r>
+        <w:rPr>
+          <w:b/>
+          <w:bCs/>
+        </w:rPr>
+        <w:t xml:space="preserve">and binding with these receptors can trigger immune cascades and lead to “hypersensitivity reactions”. </w:t>
       </w:r>
       <w:hyperlink r:id="rId21" w:history="1">
         <w:r>
@@ -3259,9 +3331,56 @@
       <w:pPr>
         <w:pStyle w:val="ListParagraph"/>
         <w:numPr>
-          <w:ilvl w:val="0"/>
+          <w:ilvl w:val="1"/>
           <w:numId w:val="23"/>
         </w:numPr>
+        <w:rPr>
+          <w:b/>
+          <w:bCs/>
+        </w:rPr>
+      </w:pPr>
+      <w:r>
+        <w:rPr>
+          <w:b/>
+          <w:bCs/>
+        </w:rPr>
+        <w:lastRenderedPageBreak/>
+        <w:t xml:space="preserve">Fc receptors in immune responses </w:t>
+      </w:r>
+      <w:hyperlink r:id="rId23" w:history="1">
+        <w:r>
+          <w:rPr>
+            <w:rStyle w:val="Hyperlink"/>
+            <w:b/>
+            <w:bCs/>
+          </w:rPr>
+          <w:t>https://pmc.ncbi.nlm.nih.gov/articles/PMC</w:t>
+        </w:r>
+        <w:r>
+          <w:rPr>
+            <w:rStyle w:val="Hyperlink"/>
+            <w:b/>
+            <w:bCs/>
+          </w:rPr>
+          <w:t>7</w:t>
+        </w:r>
+        <w:r>
+          <w:rPr>
+            <w:rStyle w:val="Hyperlink"/>
+            <w:b/>
+            <w:bCs/>
+          </w:rPr>
+          <w:t>157464/</w:t>
+        </w:r>
+      </w:hyperlink>
+    </w:p>
+    <w:p>
+      <w:pPr>
+        <w:pStyle w:val="ListParagraph"/>
+        <w:numPr>
+          <w:ilvl w:val="0"/>
+          <w:numId w:val="23"/>
+        </w:numPr>
       </w:pPr>
       <w:r>
         <w:rPr>
@@ -3277,7 +3396,7 @@
         </w:rPr>
         <w:t xml:space="preserve">Browne et al., 2025 </w:t>
       </w:r>
-      <w:hyperlink r:id="rId23" w:history="1">
+      <w:hyperlink r:id="rId24" w:history="1">
         <w:r>
           <w:rPr>
             <w:rStyle w:val="Hyperlink"/>
@@ -3328,7 +3447,7 @@
         </w:rPr>
         <w:t xml:space="preserve">Interleukin source that discusses all interleukins: </w:t>
       </w:r>
-      <w:hyperlink r:id="rId24" w:history="1">
+      <w:hyperlink r:id="rId25" w:history="1">
         <w:r>
           <w:rPr>
             <w:rStyle w:val="Hyperlink"/>
@@ -3599,46 +3718,85 @@
       <w:pPr>
         <w:pStyle w:val="ListParagraph"/>
         <w:numPr>
-          <w:ilvl w:val="0"/>
-          <w:numId w:val="24"/>
-        </w:numPr>
-        <w:rPr>
-          <w:b/>
-          <w:bCs/>
-        </w:rPr>
-      </w:pPr>
-      <w:r>
-        <w:rPr>
-          <w:b/>
-          <w:bCs/>
-        </w:rPr>
-        <w:t>RNA-</w:t>
-      </w:r>
-      <w:proofErr w:type="spellStart"/>
-      <w:r>
-        <w:rPr>
-          <w:b/>
-          <w:bCs/>
-        </w:rPr>
-        <w:t>seq</w:t>
-      </w:r>
-      <w:proofErr w:type="spellEnd"/>
-      <w:r>
-        <w:rPr>
-          <w:b/>
-          <w:bCs/>
-        </w:rPr>
-        <w:t xml:space="preserve"> is less specific and is prone to errors (e.g., false base calls etc.), whereas PCR is very specific.</w:t>
-      </w:r>
-    </w:p>
-    <w:p>
-      <w:pPr>
-        <w:pStyle w:val="ListParagraph"/>
-        <w:numPr>
           <w:ilvl w:val="1"/>
           <w:numId w:val="24"/>
         </w:numPr>
       </w:pPr>
+      <w:proofErr w:type="spellStart"/>
+      <w:r>
+        <w:rPr>
+          <w:bCs/>
+        </w:rPr>
+        <w:t>Tamirna</w:t>
+      </w:r>
+      <w:proofErr w:type="spellEnd"/>
+      <w:r>
+        <w:rPr>
+          <w:bCs/>
+        </w:rPr>
+        <w:t xml:space="preserve"> used RT-qPCR</w:t>
+      </w:r>
+      <w:r>
+        <w:rPr>
+          <w:b/>
+        </w:rPr>
+        <w:t xml:space="preserve"> </w:t>
+      </w:r>
+      <w:hyperlink r:id="rId26" w:history="1">
+        <w:r>
+          <w:rPr>
+            <w:rStyle w:val="Hyperlink"/>
+            <w:b/>
+          </w:rPr>
+          <w:t>https://www.mdpi.com/1422-0067/23/3/1226</w:t>
+        </w:r>
+      </w:hyperlink>
+    </w:p>
+    <w:p>
+      <w:pPr>
+        <w:pStyle w:val="ListParagraph"/>
+        <w:numPr>
+          <w:ilvl w:val="0"/>
+          <w:numId w:val="24"/>
+        </w:numPr>
+        <w:rPr>
+          <w:b/>
+          <w:bCs/>
+        </w:rPr>
+      </w:pPr>
+      <w:r>
+        <w:rPr>
+          <w:b/>
+          <w:bCs/>
+        </w:rPr>
+        <w:lastRenderedPageBreak/>
+        <w:t>RNA-</w:t>
+      </w:r>
+      <w:proofErr w:type="spellStart"/>
+      <w:r>
+        <w:rPr>
+          <w:b/>
+          <w:bCs/>
+        </w:rPr>
+        <w:t>seq</w:t>
+      </w:r>
+      <w:proofErr w:type="spellEnd"/>
+      <w:r>
+        <w:rPr>
+          <w:b/>
+          <w:bCs/>
+        </w:rPr>
+        <w:t xml:space="preserve"> is less specific and is prone to errors (e.g., false base calls etc.), whereas PCR is very specific.</w:t>
+      </w:r>
+    </w:p>
+    <w:p>
+      <w:pPr>
+        <w:pStyle w:val="ListParagraph"/>
+        <w:numPr>
+          <w:ilvl w:val="1"/>
+          <w:numId w:val="24"/>
+        </w:numPr>
+      </w:pPr>
       <w:r>
         <w:t>“</w:t>
       </w:r>
@@ -3659,7 +3817,7 @@
       <w:r>
         <w:t xml:space="preserve"> </w:t>
       </w:r>
-      <w:hyperlink r:id="rId25" w:history="1">
+      <w:hyperlink r:id="rId27" w:history="1">
         <w:r>
           <w:rPr>
             <w:rStyle w:val="Hyperlink"/>
@@ -3703,165 +3861,189 @@
         <w:rPr>
           <w:b/>
         </w:rPr>
+        <w:t>More samples / donors to verify that the results didn’t occur due to technical artefacts.</w:t>
+      </w:r>
+    </w:p>
+    <w:p>
+      <w:pPr>
+        <w:pStyle w:val="ListParagraph"/>
+        <w:numPr>
+          <w:ilvl w:val="0"/>
+          <w:numId w:val="25"/>
+        </w:numPr>
+      </w:pPr>
+      <w:r>
+        <w:rPr>
+          <w:b/>
+        </w:rPr>
+        <w:t>Looking at interim doses between 2 and 24 to observe any dose-dependent trends.</w:t>
+      </w:r>
+    </w:p>
+    <w:p>
+      <w:pPr>
+        <w:pStyle w:val="ListParagraph"/>
+        <w:numPr>
+          <w:ilvl w:val="0"/>
+          <w:numId w:val="25"/>
+        </w:numPr>
+      </w:pPr>
+      <w:r>
+        <w:rPr>
+          <w:b/>
+        </w:rPr>
+        <w:t>Would also be good to test different types of RNA but this would require not applying a max trim length otherwise this would omit longer RNAs.</w:t>
+      </w:r>
+    </w:p>
+    <w:p/>
+    <w:p>
+      <w:pPr>
+        <w:pStyle w:val="ListParagraph"/>
+        <w:numPr>
+          <w:ilvl w:val="0"/>
+          <w:numId w:val="2"/>
+        </w:numPr>
+        <w:ind w:left="360"/>
+      </w:pPr>
+      <w:r>
+        <w:t>Question - You say very low levels of miRNA were detected – what would be an acceptable level of miRNA for this experiment and how would you suggest it be extracted?</w:t>
+      </w:r>
+    </w:p>
+    <w:p>
+      <w:pPr>
+        <w:pStyle w:val="ListParagraph"/>
+        <w:numPr>
+          <w:ilvl w:val="0"/>
+          <w:numId w:val="26"/>
+        </w:numPr>
+      </w:pPr>
+      <w:r>
+        <w:rPr>
+          <w:b/>
+        </w:rPr>
+        <w:t>This is something I have struggled to find. Not many papers state clearly how much miRNA they extracted and submitted for analysis.</w:t>
+      </w:r>
+    </w:p>
+    <w:p>
+      <w:pPr>
+        <w:pStyle w:val="ListParagraph"/>
+        <w:numPr>
+          <w:ilvl w:val="0"/>
+          <w:numId w:val="26"/>
+        </w:numPr>
+      </w:pPr>
+      <w:r>
+        <w:rPr>
+          <w:b/>
+        </w:rPr>
+        <w:t>I doubt it is a one-size-fits-all answer, but 2,500 and 44,000 average reads seem very low when you compare it to RNA-seq.</w:t>
+      </w:r>
+    </w:p>
+    <w:p>
+      <w:pPr>
+        <w:pStyle w:val="ListParagraph"/>
+        <w:numPr>
+          <w:ilvl w:val="0"/>
+          <w:numId w:val="26"/>
+        </w:numPr>
+      </w:pPr>
+      <w:r>
+        <w:rPr>
+          <w:b/>
+        </w:rPr>
+        <w:t xml:space="preserve">I would want to test other available published datasets to compare how much miRNA they were able to extract from extracellular vesicles. </w:t>
+      </w:r>
+    </w:p>
+    <w:p>
+      <w:pPr>
+        <w:pStyle w:val="ListParagraph"/>
+        <w:numPr>
+          <w:ilvl w:val="1"/>
+          <w:numId w:val="26"/>
+        </w:numPr>
+        <w:rPr>
+          <w:bCs/>
+        </w:rPr>
+      </w:pPr>
+      <w:r>
+        <w:rPr>
+          <w:bCs/>
+        </w:rPr>
+        <w:t>You could</w:t>
+      </w:r>
+      <w:r>
+        <w:rPr>
+          <w:bCs/>
+        </w:rPr>
+        <w:t xml:space="preserve"> then take random subsets of increasing sizes to see what differences this has on the DE miRNAs (but it would be easier to just consult an expert).</w:t>
+      </w:r>
+    </w:p>
+    <w:p>
+      <w:pPr>
+        <w:pStyle w:val="ListParagraph"/>
+        <w:numPr>
+          <w:ilvl w:val="0"/>
+          <w:numId w:val="26"/>
+        </w:numPr>
+      </w:pPr>
+      <w:r>
+        <w:rPr>
+          <w:b/>
+        </w:rPr>
+        <w:t>I am aware that EV production varies between cell types, with Calu-3 cells known to release fewer than primary cells, and physiological state.</w:t>
+      </w:r>
+    </w:p>
+    <w:p>
+      <w:pPr>
+        <w:pStyle w:val="ListParagraph"/>
+        <w:numPr>
+          <w:ilvl w:val="0"/>
+          <w:numId w:val="26"/>
+        </w:numPr>
+      </w:pPr>
+      <w:r>
+        <w:rPr>
+          <w:b/>
+        </w:rPr>
+        <w:t>I would be interested to see what TAmiRNA thought, and what they typically see, because it may be that the lab failed to ask the right question for TAmiRNA to flag it up or that it wasn’t an issue.</w:t>
+      </w:r>
+    </w:p>
+    <w:p/>
+    <w:p>
+      <w:pPr>
+        <w:pStyle w:val="ListParagraph"/>
+        <w:numPr>
+          <w:ilvl w:val="0"/>
+          <w:numId w:val="2"/>
+        </w:numPr>
+        <w:ind w:left="360"/>
+      </w:pPr>
+      <w:r>
+        <w:t>Question - You say that pathway enrichment analysis was not suitable for the Calu-3 dataset as there was insufficient levels of differential expression</w:t>
+      </w:r>
+      <w:r>
+        <w:rPr>
+          <w:b/>
+        </w:rPr>
+        <w:t>.</w:t>
+      </w:r>
+      <w:r>
+        <w:t xml:space="preserve"> How much differential expression would be enough?</w:t>
+      </w:r>
+    </w:p>
+    <w:p>
+      <w:pPr>
+        <w:pStyle w:val="ListParagraph"/>
+        <w:numPr>
+          <w:ilvl w:val="0"/>
+          <w:numId w:val="27"/>
+        </w:numPr>
+      </w:pPr>
+      <w:r>
+        <w:rPr>
+          <w:b/>
+          <w:bCs/>
+        </w:rPr>
         <w:lastRenderedPageBreak/>
-        <w:t>More samples / donors to verify that the results didn’t occur due to technical artefacts.</w:t>
-      </w:r>
-    </w:p>
-    <w:p>
-      <w:pPr>
-        <w:pStyle w:val="ListParagraph"/>
-        <w:numPr>
-          <w:ilvl w:val="0"/>
-          <w:numId w:val="25"/>
-        </w:numPr>
-      </w:pPr>
-      <w:r>
-        <w:rPr>
-          <w:b/>
-        </w:rPr>
-        <w:t>Looking at interim doses between 2 and 24 to observe any dose-dependent trends.</w:t>
-      </w:r>
-    </w:p>
-    <w:p>
-      <w:pPr>
-        <w:pStyle w:val="ListParagraph"/>
-        <w:numPr>
-          <w:ilvl w:val="0"/>
-          <w:numId w:val="25"/>
-        </w:numPr>
-      </w:pPr>
-      <w:r>
-        <w:rPr>
-          <w:b/>
-        </w:rPr>
-        <w:t>Would also be good to test different types of RNA but this would require not applying a max trim length otherwise this would omit longer RNAs.</w:t>
-      </w:r>
-    </w:p>
-    <w:p/>
-    <w:p>
-      <w:pPr>
-        <w:pStyle w:val="ListParagraph"/>
-        <w:numPr>
-          <w:ilvl w:val="0"/>
-          <w:numId w:val="2"/>
-        </w:numPr>
-        <w:ind w:left="360"/>
-      </w:pPr>
-      <w:r>
-        <w:t>Question - You say very low levels of miRNA were detected – what would be an acceptable level of miRNA for this experiment and how would you suggest it be extracted?</w:t>
-      </w:r>
-    </w:p>
-    <w:p>
-      <w:pPr>
-        <w:pStyle w:val="ListParagraph"/>
-        <w:numPr>
-          <w:ilvl w:val="0"/>
-          <w:numId w:val="26"/>
-        </w:numPr>
-      </w:pPr>
-      <w:r>
-        <w:rPr>
-          <w:b/>
-        </w:rPr>
-        <w:t>This is something I have struggled to find. Not many papers state clearly how much miRNA they extracted and submitted for analysis.</w:t>
-      </w:r>
-    </w:p>
-    <w:p>
-      <w:pPr>
-        <w:pStyle w:val="ListParagraph"/>
-        <w:numPr>
-          <w:ilvl w:val="0"/>
-          <w:numId w:val="26"/>
-        </w:numPr>
-      </w:pPr>
-      <w:r>
-        <w:rPr>
-          <w:b/>
-        </w:rPr>
-        <w:t>I doubt it is a one-size-fits-all answer, but 2,500 and 44,000 average reads seem very low when you compare it to RNA-seq.</w:t>
-      </w:r>
-    </w:p>
-    <w:p>
-      <w:pPr>
-        <w:pStyle w:val="ListParagraph"/>
-        <w:numPr>
-          <w:ilvl w:val="0"/>
-          <w:numId w:val="26"/>
-        </w:numPr>
-      </w:pPr>
-      <w:r>
-        <w:rPr>
-          <w:b/>
-        </w:rPr>
-        <w:t xml:space="preserve">I would want to test other available published datasets to compare how much miRNA they were able to extract from extracellular vesicles. </w:t>
-      </w:r>
-    </w:p>
-    <w:p>
-      <w:pPr>
-        <w:pStyle w:val="ListParagraph"/>
-        <w:numPr>
-          <w:ilvl w:val="0"/>
-          <w:numId w:val="26"/>
-        </w:numPr>
-      </w:pPr>
-      <w:r>
-        <w:rPr>
-          <w:b/>
-        </w:rPr>
-        <w:t>I am aware that EV production varies between cell types, with Calu-3 cells known to release fewer than primary cells, and physiological state.</w:t>
-      </w:r>
-    </w:p>
-    <w:p>
-      <w:pPr>
-        <w:pStyle w:val="ListParagraph"/>
-        <w:numPr>
-          <w:ilvl w:val="0"/>
-          <w:numId w:val="26"/>
-        </w:numPr>
-      </w:pPr>
-      <w:r>
-        <w:rPr>
-          <w:b/>
-        </w:rPr>
-        <w:t>I would be interested to see what TAmiRNA thought, and what they typically see, because it may be that the lab failed to ask the right question for TAmiRNA to flag it up or that it wasn’t an issue.</w:t>
-      </w:r>
-    </w:p>
-    <w:p/>
-    <w:p>
-      <w:pPr>
-        <w:pStyle w:val="ListParagraph"/>
-        <w:numPr>
-          <w:ilvl w:val="0"/>
-          <w:numId w:val="2"/>
-        </w:numPr>
-        <w:ind w:left="360"/>
-      </w:pPr>
-      <w:r>
-        <w:t>Question - You say that pathway enrichment analysis was not suitable for the Calu-3 dataset as there was insufficient levels of differential expression</w:t>
-      </w:r>
-      <w:r>
-        <w:rPr>
-          <w:b/>
-        </w:rPr>
-        <w:t>.</w:t>
-      </w:r>
-      <w:r>
-        <w:t xml:space="preserve"> How much differential expression would be enough?</w:t>
-      </w:r>
-    </w:p>
-    <w:p>
-      <w:pPr>
-        <w:pStyle w:val="ListParagraph"/>
-        <w:numPr>
-          <w:ilvl w:val="0"/>
-          <w:numId w:val="27"/>
-        </w:numPr>
-      </w:pPr>
-      <w:r>
-        <w:rPr>
-          <w:b/>
-          <w:bCs/>
-        </w:rPr>
         <w:t>I have not found a clear threshold for this but &gt;10 seems like a sensible amount.</w:t>
       </w:r>
     </w:p>
@@ -3957,193 +4139,193 @@
         <w:rPr>
           <w:b/>
         </w:rPr>
+        <w:t>More research is required to verify this result in the Calu-3 dataset as it was underpowered.</w:t>
+      </w:r>
+    </w:p>
+    <w:p>
+      <w:pPr>
+        <w:pStyle w:val="ListParagraph"/>
+        <w:numPr>
+          <w:ilvl w:val="0"/>
+          <w:numId w:val="28"/>
+        </w:numPr>
+      </w:pPr>
+      <w:r>
+        <w:rPr>
+          <w:b/>
+        </w:rPr>
+        <w:t>This should be tested in more samples / donors and with additional cell types and allergens.</w:t>
+      </w:r>
+    </w:p>
+    <w:p>
+      <w:pPr>
+        <w:pStyle w:val="ListParagraph"/>
+        <w:numPr>
+          <w:ilvl w:val="0"/>
+          <w:numId w:val="28"/>
+        </w:numPr>
+      </w:pPr>
+      <w:r>
+        <w:rPr>
+          <w:b/>
+        </w:rPr>
+        <w:t>Can look for research implicating it in other allergen exposure studies.</w:t>
+      </w:r>
+    </w:p>
+    <w:p/>
+    <w:p>
+      <w:pPr>
+        <w:pStyle w:val="ListParagraph"/>
+        <w:numPr>
+          <w:ilvl w:val="0"/>
+          <w:numId w:val="2"/>
+        </w:numPr>
+        <w:ind w:left="360"/>
+      </w:pPr>
+      <w:r>
+        <w:t>Question - Why was miR-125b classed as a potential candidate for further research?</w:t>
+      </w:r>
+    </w:p>
+    <w:p>
+      <w:pPr>
+        <w:pStyle w:val="ListParagraph"/>
+        <w:numPr>
+          <w:ilvl w:val="0"/>
+          <w:numId w:val="29"/>
+        </w:numPr>
+        <w:rPr>
+          <w:b/>
+          <w:bCs/>
+        </w:rPr>
+      </w:pPr>
+      <w:r>
+        <w:rPr>
+          <w:b/>
+          <w:bCs/>
+        </w:rPr>
+        <w:t xml:space="preserve">Because miR-125b-5p was detected in both the dose 24 primary HBEC condition and the Calu-3 Can f 1 condition, it may be a common response </w:t>
+      </w:r>
+      <w:r>
+        <w:rPr>
+          <w:b/>
+          <w:bCs/>
+        </w:rPr>
+        <w:t>miRNA</w:t>
+      </w:r>
+      <w:r>
+        <w:rPr>
+          <w:b/>
+          <w:bCs/>
+        </w:rPr>
+        <w:t xml:space="preserve"> between allergens.</w:t>
+      </w:r>
+    </w:p>
+    <w:p/>
+    <w:p>
+      <w:pPr>
+        <w:pStyle w:val="ListParagraph"/>
+        <w:numPr>
+          <w:ilvl w:val="0"/>
+          <w:numId w:val="2"/>
+        </w:numPr>
+        <w:ind w:left="360"/>
+      </w:pPr>
+      <w:r>
+        <w:t>Question - What is the significance of being able to handle spike in controls?</w:t>
+      </w:r>
+    </w:p>
+    <w:p>
+      <w:pPr>
+        <w:pStyle w:val="ListParagraph"/>
+        <w:numPr>
+          <w:ilvl w:val="0"/>
+          <w:numId w:val="29"/>
+        </w:numPr>
+      </w:pPr>
+      <w:r>
+        <w:rPr>
+          <w:b/>
+        </w:rPr>
+        <w:t>TAmiRNA used spike-in controls, and this may have accounted for some differences between my results and theirs.</w:t>
+      </w:r>
+    </w:p>
+    <w:p>
+      <w:pPr>
+        <w:pStyle w:val="ListParagraph"/>
+        <w:numPr>
+          <w:ilvl w:val="0"/>
+          <w:numId w:val="29"/>
+        </w:numPr>
+      </w:pPr>
+      <w:r>
+        <w:rPr>
+          <w:b/>
+        </w:rPr>
+        <w:t>It allows the absolute quantification of miRNA abundance therefore it can verify the expression of lowly expressed miRNAs.</w:t>
+      </w:r>
+    </w:p>
+    <w:p>
+      <w:pPr>
+        <w:pStyle w:val="ListParagraph"/>
+        <w:numPr>
+          <w:ilvl w:val="0"/>
+          <w:numId w:val="29"/>
+        </w:numPr>
+      </w:pPr>
+      <w:r>
+        <w:rPr>
+          <w:b/>
+        </w:rPr>
+        <w:t>This is helpful as I found that many of the miRNAs that were classed as most differentially expressed had very low expression levels.</w:t>
+      </w:r>
+    </w:p>
+    <w:p>
+      <w:pPr>
+        <w:pStyle w:val="ListParagraph"/>
+        <w:numPr>
+          <w:ilvl w:val="0"/>
+          <w:numId w:val="29"/>
+        </w:numPr>
+      </w:pPr>
+      <w:r>
+        <w:rPr>
+          <w:b/>
+        </w:rPr>
+        <w:t>These may have then had lots of target genes which could have skewed pathway enrichment analysis</w:t>
+      </w:r>
+    </w:p>
+    <w:p/>
+    <w:p>
+      <w:pPr>
+        <w:pStyle w:val="ListParagraph"/>
+        <w:numPr>
+          <w:ilvl w:val="0"/>
+          <w:numId w:val="2"/>
+        </w:numPr>
+        <w:ind w:left="360"/>
+      </w:pPr>
+      <w:r>
+        <w:t xml:space="preserve">Question - Did you try network-based enrichment? </w:t>
+      </w:r>
+    </w:p>
+    <w:p>
+      <w:pPr>
+        <w:pStyle w:val="ListParagraph"/>
+        <w:numPr>
+          <w:ilvl w:val="0"/>
+          <w:numId w:val="30"/>
+        </w:numPr>
+        <w:rPr>
+          <w:b/>
+          <w:bCs/>
+        </w:rPr>
+      </w:pPr>
+      <w:r>
+        <w:rPr>
+          <w:b/>
+          <w:bCs/>
+        </w:rPr>
         <w:lastRenderedPageBreak/>
-        <w:t>More research is required to verify this result in the Calu-3 dataset as it was underpowered.</w:t>
-      </w:r>
-    </w:p>
-    <w:p>
-      <w:pPr>
-        <w:pStyle w:val="ListParagraph"/>
-        <w:numPr>
-          <w:ilvl w:val="0"/>
-          <w:numId w:val="28"/>
-        </w:numPr>
-      </w:pPr>
-      <w:r>
-        <w:rPr>
-          <w:b/>
-        </w:rPr>
-        <w:t>This should be tested in more samples / donors and with additional cell types and allergens.</w:t>
-      </w:r>
-    </w:p>
-    <w:p>
-      <w:pPr>
-        <w:pStyle w:val="ListParagraph"/>
-        <w:numPr>
-          <w:ilvl w:val="0"/>
-          <w:numId w:val="28"/>
-        </w:numPr>
-      </w:pPr>
-      <w:r>
-        <w:rPr>
-          <w:b/>
-        </w:rPr>
-        <w:t>Can look for research implicating it in other allergen exposure studies.</w:t>
-      </w:r>
-    </w:p>
-    <w:p/>
-    <w:p>
-      <w:pPr>
-        <w:pStyle w:val="ListParagraph"/>
-        <w:numPr>
-          <w:ilvl w:val="0"/>
-          <w:numId w:val="2"/>
-        </w:numPr>
-        <w:ind w:left="360"/>
-      </w:pPr>
-      <w:r>
-        <w:t>Question - Why was miR-125b classed as a potential candidate for further research?</w:t>
-      </w:r>
-    </w:p>
-    <w:p>
-      <w:pPr>
-        <w:pStyle w:val="ListParagraph"/>
-        <w:numPr>
-          <w:ilvl w:val="0"/>
-          <w:numId w:val="29"/>
-        </w:numPr>
-        <w:rPr>
-          <w:b/>
-          <w:bCs/>
-        </w:rPr>
-      </w:pPr>
-      <w:r>
-        <w:rPr>
-          <w:b/>
-          <w:bCs/>
-        </w:rPr>
-        <w:t xml:space="preserve">Because miR-125b-5p was detected in both the dose 24 primary HBEC condition and the Calu-3 Can f 1 condition, it may be a common response </w:t>
-      </w:r>
-      <w:r>
-        <w:rPr>
-          <w:b/>
-          <w:bCs/>
-        </w:rPr>
-        <w:t>miRNA</w:t>
-      </w:r>
-      <w:r>
-        <w:rPr>
-          <w:b/>
-          <w:bCs/>
-        </w:rPr>
-        <w:t xml:space="preserve"> between allergens.</w:t>
-      </w:r>
-    </w:p>
-    <w:p/>
-    <w:p>
-      <w:pPr>
-        <w:pStyle w:val="ListParagraph"/>
-        <w:numPr>
-          <w:ilvl w:val="0"/>
-          <w:numId w:val="2"/>
-        </w:numPr>
-        <w:ind w:left="360"/>
-      </w:pPr>
-      <w:r>
-        <w:t>Question - What is the significance of being able to handle spike in controls?</w:t>
-      </w:r>
-    </w:p>
-    <w:p>
-      <w:pPr>
-        <w:pStyle w:val="ListParagraph"/>
-        <w:numPr>
-          <w:ilvl w:val="0"/>
-          <w:numId w:val="29"/>
-        </w:numPr>
-      </w:pPr>
-      <w:r>
-        <w:rPr>
-          <w:b/>
-        </w:rPr>
-        <w:t>TAmiRNA used spike-in controls, and this may have accounted for some differences between my results and theirs.</w:t>
-      </w:r>
-    </w:p>
-    <w:p>
-      <w:pPr>
-        <w:pStyle w:val="ListParagraph"/>
-        <w:numPr>
-          <w:ilvl w:val="0"/>
-          <w:numId w:val="29"/>
-        </w:numPr>
-      </w:pPr>
-      <w:r>
-        <w:rPr>
-          <w:b/>
-        </w:rPr>
-        <w:t>It allows the absolute quantification of miRNA abundance therefore it can verify the expression of lowly expressed miRNAs.</w:t>
-      </w:r>
-    </w:p>
-    <w:p>
-      <w:pPr>
-        <w:pStyle w:val="ListParagraph"/>
-        <w:numPr>
-          <w:ilvl w:val="0"/>
-          <w:numId w:val="29"/>
-        </w:numPr>
-      </w:pPr>
-      <w:r>
-        <w:rPr>
-          <w:b/>
-        </w:rPr>
-        <w:t>This is helpful as I found that many of the miRNAs that were classed as most differentially expressed had very low expression levels.</w:t>
-      </w:r>
-    </w:p>
-    <w:p>
-      <w:pPr>
-        <w:pStyle w:val="ListParagraph"/>
-        <w:numPr>
-          <w:ilvl w:val="0"/>
-          <w:numId w:val="29"/>
-        </w:numPr>
-      </w:pPr>
-      <w:r>
-        <w:rPr>
-          <w:b/>
-        </w:rPr>
-        <w:t>These may have then had lots of target genes which could have skewed pathway enrichment analysis</w:t>
-      </w:r>
-    </w:p>
-    <w:p/>
-    <w:p>
-      <w:pPr>
-        <w:pStyle w:val="ListParagraph"/>
-        <w:numPr>
-          <w:ilvl w:val="0"/>
-          <w:numId w:val="2"/>
-        </w:numPr>
-        <w:ind w:left="360"/>
-      </w:pPr>
-      <w:r>
-        <w:t xml:space="preserve">Question - Did you try network-based enrichment? </w:t>
-      </w:r>
-    </w:p>
-    <w:p>
-      <w:pPr>
-        <w:pStyle w:val="ListParagraph"/>
-        <w:numPr>
-          <w:ilvl w:val="0"/>
-          <w:numId w:val="30"/>
-        </w:numPr>
-        <w:rPr>
-          <w:b/>
-          <w:bCs/>
-        </w:rPr>
-      </w:pPr>
-      <w:r>
-        <w:rPr>
-          <w:b/>
-          <w:bCs/>
-        </w:rPr>
         <w:t xml:space="preserve">Network-based enrichment is where </w:t>
       </w:r>
       <w:r>
@@ -4247,13 +4429,12 @@
           <w:b/>
           <w:bCs/>
         </w:rPr>
-        <w:lastRenderedPageBreak/>
         <w:t>The pathways were also very complex</w:t>
       </w:r>
       <w:r>
         <w:t xml:space="preserve">: </w:t>
       </w:r>
-      <w:hyperlink r:id="rId26" w:history="1">
+      <w:hyperlink r:id="rId28" w:history="1">
         <w:r>
           <w:rPr>
             <w:rStyle w:val="Hyperlink"/>
@@ -4270,7 +4451,7 @@
           <w:numId w:val="30"/>
         </w:numPr>
       </w:pPr>
-      <w:hyperlink r:id="rId27" w:history="1">
+      <w:hyperlink r:id="rId29" w:history="1">
         <w:r>
           <w:rPr>
             <w:rStyle w:val="Hyperlink"/>
@@ -4445,6 +4626,7 @@
         <w:rPr>
           <w:b/>
         </w:rPr>
+        <w:lastRenderedPageBreak/>
         <w:t>Lots more research has been conducted into gene-pathway relationships</w:t>
       </w:r>
       <w:r>
@@ -4575,204 +4757,204 @@
           <w:b/>
           <w:bCs/>
         </w:rPr>
+        <w:t xml:space="preserve">Difficult to find disease states – </w:t>
+      </w:r>
+      <w:r>
+        <w:t xml:space="preserve">QIAGEN IPA have disease </w:t>
+      </w:r>
+      <w:r>
+        <w:t>filters,</w:t>
+      </w:r>
+      <w:r>
+        <w:t xml:space="preserve"> but it was difficult to establish and acquire these datasets.</w:t>
+      </w:r>
+    </w:p>
+    <w:p>
+      <w:pPr>
+        <w:pStyle w:val="ListParagraph"/>
+        <w:numPr>
+          <w:ilvl w:val="0"/>
+          <w:numId w:val="32"/>
+        </w:numPr>
+        <w:rPr>
+          <w:b/>
+          <w:bCs/>
+        </w:rPr>
+      </w:pPr>
+      <w:r>
+        <w:rPr>
+          <w:b/>
+          <w:bCs/>
+        </w:rPr>
+        <w:t xml:space="preserve">Manual curation – </w:t>
+      </w:r>
+      <w:r>
+        <w:t>A distinct property of commercial platforms is that they provide manually curated databases by experts.</w:t>
+      </w:r>
+    </w:p>
+    <w:p/>
+    <w:p>
+      <w:pPr>
+        <w:pStyle w:val="ListParagraph"/>
+        <w:numPr>
+          <w:ilvl w:val="0"/>
+          <w:numId w:val="2"/>
+        </w:numPr>
+        <w:ind w:left="360"/>
+      </w:pPr>
+      <w:r>
+        <w:t xml:space="preserve">Question – Why was it a strength to develop the workflow using a dataset with sufficient differential expression? </w:t>
+      </w:r>
+    </w:p>
+    <w:p>
+      <w:pPr>
+        <w:pStyle w:val="ListParagraph"/>
+        <w:numPr>
+          <w:ilvl w:val="0"/>
+          <w:numId w:val="33"/>
+        </w:numPr>
+      </w:pPr>
+      <w:r>
+        <w:rPr>
+          <w:b/>
+        </w:rPr>
+        <w:t>Because, as mentioned in the presentation, pathway enrichment analysis techniques require sufficient differential expression to be statistically reliable.</w:t>
+      </w:r>
+    </w:p>
+    <w:p>
+      <w:pPr>
+        <w:pStyle w:val="ListParagraph"/>
+        <w:numPr>
+          <w:ilvl w:val="0"/>
+          <w:numId w:val="33"/>
+        </w:numPr>
+      </w:pPr>
+      <w:r>
+        <w:rPr>
+          <w:b/>
+        </w:rPr>
+        <w:t xml:space="preserve">Therefore, it was lucky that the primary HBEC dataset had ~13/14 miRNAs </w:t>
+      </w:r>
+      <w:r>
+        <w:rPr>
+          <w:b/>
+        </w:rPr>
+        <w:t>in each upregulated and downregulated set.</w:t>
+      </w:r>
+    </w:p>
+    <w:p>
+      <w:pPr>
+        <w:pStyle w:val="ListParagraph"/>
+        <w:numPr>
+          <w:ilvl w:val="0"/>
+          <w:numId w:val="33"/>
+        </w:numPr>
+      </w:pPr>
+      <w:r>
+        <w:rPr>
+          <w:b/>
+        </w:rPr>
+        <w:t>The alternative method would have been to use an established dataset from a similar study</w:t>
+      </w:r>
+      <w:r>
+        <w:rPr>
+          <w:b/>
+        </w:rPr>
+        <w:t>,</w:t>
+      </w:r>
+      <w:r>
+        <w:rPr>
+          <w:b/>
+        </w:rPr>
+        <w:t xml:space="preserve"> but this is always more difficult because you can’t really ask the authors questions, whereas I could talk to the author of the primary HBEC study about their experiment and process.</w:t>
+      </w:r>
+    </w:p>
+    <w:p/>
+    <w:p>
+      <w:pPr>
+        <w:pStyle w:val="ListParagraph"/>
+        <w:numPr>
+          <w:ilvl w:val="0"/>
+          <w:numId w:val="2"/>
+        </w:numPr>
+        <w:ind w:left="360"/>
+      </w:pPr>
+      <w:r>
+        <w:t>Question – Why was it a strength to use experimentally validated target interactions?</w:t>
+      </w:r>
+    </w:p>
+    <w:p>
+      <w:pPr>
+        <w:pStyle w:val="ListParagraph"/>
+        <w:numPr>
+          <w:ilvl w:val="0"/>
+          <w:numId w:val="34"/>
+        </w:numPr>
+        <w:rPr>
+          <w:b/>
+          <w:bCs/>
+        </w:rPr>
+      </w:pPr>
+      <w:r>
+        <w:rPr>
+          <w:b/>
+          <w:bCs/>
+        </w:rPr>
+        <w:t>A lot of other studies use pred</w:t>
+      </w:r>
+      <w:r>
+        <w:rPr>
+          <w:b/>
+          <w:bCs/>
+        </w:rPr>
+        <w:t xml:space="preserve">icted targets which are less reliable and can lead to false positive associations. </w:t>
+      </w:r>
+    </w:p>
+    <w:p>
+      <w:pPr>
+        <w:pStyle w:val="ListParagraph"/>
+        <w:numPr>
+          <w:ilvl w:val="0"/>
+          <w:numId w:val="34"/>
+        </w:numPr>
+        <w:rPr>
+          <w:b/>
+          <w:bCs/>
+        </w:rPr>
+      </w:pPr>
+      <w:r>
+        <w:rPr>
+          <w:b/>
+          <w:bCs/>
+        </w:rPr>
+        <w:t xml:space="preserve">I found that I had too many target genes anyway therefore to use predicted targets as well would have </w:t>
+      </w:r>
+      <w:r>
+        <w:rPr>
+          <w:b/>
+          <w:bCs/>
+        </w:rPr>
+        <w:t>an even more complex pathway analysis.</w:t>
+      </w:r>
+    </w:p>
+    <w:p>
+      <w:pPr>
+        <w:pStyle w:val="ListParagraph"/>
+        <w:numPr>
+          <w:ilvl w:val="0"/>
+          <w:numId w:val="34"/>
+        </w:numPr>
+        <w:rPr>
+          <w:b/>
+          <w:bCs/>
+        </w:rPr>
+      </w:pPr>
+      <w:r>
+        <w:rPr>
+          <w:b/>
+          <w:bCs/>
+        </w:rPr>
         <w:lastRenderedPageBreak/>
-        <w:t xml:space="preserve">Difficult to find disease states – </w:t>
-      </w:r>
-      <w:r>
-        <w:t xml:space="preserve">QIAGEN IPA have disease </w:t>
-      </w:r>
-      <w:r>
-        <w:t>filters,</w:t>
-      </w:r>
-      <w:r>
-        <w:t xml:space="preserve"> but it was difficult to establish and acquire these datasets.</w:t>
-      </w:r>
-    </w:p>
-    <w:p>
-      <w:pPr>
-        <w:pStyle w:val="ListParagraph"/>
-        <w:numPr>
-          <w:ilvl w:val="0"/>
-          <w:numId w:val="32"/>
-        </w:numPr>
-        <w:rPr>
-          <w:b/>
-          <w:bCs/>
-        </w:rPr>
-      </w:pPr>
-      <w:r>
-        <w:rPr>
-          <w:b/>
-          <w:bCs/>
-        </w:rPr>
-        <w:t xml:space="preserve">Manual curation – </w:t>
-      </w:r>
-      <w:r>
-        <w:t>A distinct property of commercial platforms is that they provide manually curated databases by experts.</w:t>
-      </w:r>
-    </w:p>
-    <w:p/>
-    <w:p>
-      <w:pPr>
-        <w:pStyle w:val="ListParagraph"/>
-        <w:numPr>
-          <w:ilvl w:val="0"/>
-          <w:numId w:val="2"/>
-        </w:numPr>
-        <w:ind w:left="360"/>
-      </w:pPr>
-      <w:r>
-        <w:t xml:space="preserve">Question – Why was it a strength to develop the workflow using a dataset with sufficient differential expression? </w:t>
-      </w:r>
-    </w:p>
-    <w:p>
-      <w:pPr>
-        <w:pStyle w:val="ListParagraph"/>
-        <w:numPr>
-          <w:ilvl w:val="0"/>
-          <w:numId w:val="33"/>
-        </w:numPr>
-      </w:pPr>
-      <w:r>
-        <w:rPr>
-          <w:b/>
-        </w:rPr>
-        <w:t>Because, as mentioned in the presentation, pathway enrichment analysis techniques require sufficient differential expression to be statistically reliable.</w:t>
-      </w:r>
-    </w:p>
-    <w:p>
-      <w:pPr>
-        <w:pStyle w:val="ListParagraph"/>
-        <w:numPr>
-          <w:ilvl w:val="0"/>
-          <w:numId w:val="33"/>
-        </w:numPr>
-      </w:pPr>
-      <w:r>
-        <w:rPr>
-          <w:b/>
-        </w:rPr>
-        <w:t xml:space="preserve">Therefore, it was lucky that the primary HBEC dataset had ~13/14 miRNAs </w:t>
-      </w:r>
-      <w:r>
-        <w:rPr>
-          <w:b/>
-        </w:rPr>
-        <w:t>in each upregulated and downregulated set.</w:t>
-      </w:r>
-    </w:p>
-    <w:p>
-      <w:pPr>
-        <w:pStyle w:val="ListParagraph"/>
-        <w:numPr>
-          <w:ilvl w:val="0"/>
-          <w:numId w:val="33"/>
-        </w:numPr>
-      </w:pPr>
-      <w:r>
-        <w:rPr>
-          <w:b/>
-        </w:rPr>
-        <w:t>The alternative method would have been to use an established dataset from a similar study</w:t>
-      </w:r>
-      <w:r>
-        <w:rPr>
-          <w:b/>
-        </w:rPr>
-        <w:t>,</w:t>
-      </w:r>
-      <w:r>
-        <w:rPr>
-          <w:b/>
-        </w:rPr>
-        <w:t xml:space="preserve"> but this is always more difficult because you can’t really ask the authors questions, whereas I could talk to the author of the primary HBEC study about their experiment and process.</w:t>
-      </w:r>
-    </w:p>
-    <w:p/>
-    <w:p>
-      <w:pPr>
-        <w:pStyle w:val="ListParagraph"/>
-        <w:numPr>
-          <w:ilvl w:val="0"/>
-          <w:numId w:val="2"/>
-        </w:numPr>
-        <w:ind w:left="360"/>
-      </w:pPr>
-      <w:r>
-        <w:t>Question – Why was it a strength to use experimentally validated target interactions?</w:t>
-      </w:r>
-    </w:p>
-    <w:p>
-      <w:pPr>
-        <w:pStyle w:val="ListParagraph"/>
-        <w:numPr>
-          <w:ilvl w:val="0"/>
-          <w:numId w:val="34"/>
-        </w:numPr>
-        <w:rPr>
-          <w:b/>
-          <w:bCs/>
-        </w:rPr>
-      </w:pPr>
-      <w:r>
-        <w:rPr>
-          <w:b/>
-          <w:bCs/>
-        </w:rPr>
-        <w:t>A lot of other studies use pred</w:t>
-      </w:r>
-      <w:r>
-        <w:rPr>
-          <w:b/>
-          <w:bCs/>
-        </w:rPr>
-        <w:t xml:space="preserve">icted targets which are less reliable and can lead to false positive associations. </w:t>
-      </w:r>
-    </w:p>
-    <w:p>
-      <w:pPr>
-        <w:pStyle w:val="ListParagraph"/>
-        <w:numPr>
-          <w:ilvl w:val="0"/>
-          <w:numId w:val="34"/>
-        </w:numPr>
-        <w:rPr>
-          <w:b/>
-          <w:bCs/>
-        </w:rPr>
-      </w:pPr>
-      <w:r>
-        <w:rPr>
-          <w:b/>
-          <w:bCs/>
-        </w:rPr>
-        <w:t xml:space="preserve">I found that I had too many target genes anyway therefore to use predicted targets as well would have </w:t>
-      </w:r>
-      <w:r>
-        <w:rPr>
-          <w:b/>
-          <w:bCs/>
-        </w:rPr>
-        <w:t>an even more complex pathway analysis.</w:t>
-      </w:r>
-    </w:p>
-    <w:p>
-      <w:pPr>
-        <w:pStyle w:val="ListParagraph"/>
-        <w:numPr>
-          <w:ilvl w:val="0"/>
-          <w:numId w:val="34"/>
-        </w:numPr>
-        <w:rPr>
-          <w:b/>
-          <w:bCs/>
-        </w:rPr>
-      </w:pPr>
-      <w:r>
-        <w:rPr>
-          <w:b/>
-          <w:bCs/>
-        </w:rPr>
         <w:t>However, there are lots of real associations that have not yet been demonstrated experimentally therefore to exclude predicted targets can lead to missing real results. This is the trade-off.</w:t>
       </w:r>
     </w:p>
@@ -5063,7 +5245,15 @@
           <w:b/>
           <w:bCs/>
         </w:rPr>
-        <w:t>Because well characterised miRNAs typically have more target genes and pathway analysis methods such as ORA rely on observing whether more target genes appear than a random set of genes of the same size. Therefore, more target genes = more chance of being associated with a pathway.</w:t>
+        <w:t xml:space="preserve">Because well characterised miRNAs typically have more target genes and pathway analysis methods such as ORA rely on observing whether more </w:t>
+      </w:r>
+      <w:r>
+        <w:rPr>
+          <w:b/>
+          <w:bCs/>
+        </w:rPr>
+        <w:lastRenderedPageBreak/>
+        <w:t>target genes appear than a random set of genes of the same size. Therefore, more target genes = more chance of being associated with a pathway.</w:t>
       </w:r>
     </w:p>
     <w:p>
@@ -5119,7 +5309,7 @@
                     <pic:cNvPicPr/>
                   </pic:nvPicPr>
                   <pic:blipFill>
-                    <a:blip r:embed="rId28"/>
+                    <a:blip r:embed="rId30"/>
                     <a:stretch>
                       <a:fillRect/>
                     </a:stretch>
@@ -5151,7 +5341,6 @@
         <w:ind w:left="360"/>
       </w:pPr>
       <w:r>
-        <w:lastRenderedPageBreak/>
         <w:t xml:space="preserve">Question </w:t>
       </w:r>
       <w:r>
@@ -5297,6 +5486,7 @@
           <w:b/>
           <w:bCs/>
         </w:rPr>
+        <w:lastRenderedPageBreak/>
         <w:t>For this, I would not apply a maximum read length during trimming then map the reads to databases of other RNA species. This would hopefully reduce the proportion of ‘unknown’ reads.</w:t>
       </w:r>
     </w:p>
@@ -5455,7 +5645,6 @@
         </w:numPr>
       </w:pPr>
       <w:r>
-        <w:lastRenderedPageBreak/>
         <w:t>Retain only genes expressed in airway cells</w:t>
       </w:r>
     </w:p>
@@ -5657,7 +5846,7 @@
       <w:r>
         <w:t xml:space="preserve">Using miRNAs as biomarkers for allergic rhinitis (nose reacts to allergens) </w:t>
       </w:r>
-      <w:hyperlink r:id="rId29" w:history="1">
+      <w:hyperlink r:id="rId31" w:history="1">
         <w:r>
           <w:rPr>
             <w:rStyle w:val="Hyperlink"/>
@@ -5719,7 +5908,7 @@
       <w:r>
         <w:t xml:space="preserve">More research needs to be done to investigate sex effects. This paper suggests miRNAs may be involved in explaining the “higher susceptibility of females to asthma” </w:t>
       </w:r>
-      <w:hyperlink r:id="rId30" w:history="1">
+      <w:hyperlink r:id="rId32" w:history="1">
         <w:r>
           <w:rPr>
             <w:rStyle w:val="Hyperlink"/>
@@ -5757,7 +5946,7 @@
       <w:r>
         <w:t xml:space="preserve">WB’s literature review: </w:t>
       </w:r>
-      <w:hyperlink r:id="rId31" w:history="1">
+      <w:hyperlink r:id="rId33" w:history="1">
         <w:r>
           <w:rPr>
             <w:rStyle w:val="Hyperlink"/>
@@ -5782,7 +5971,6 @@
         <w:pStyle w:val="Heading2"/>
       </w:pPr>
       <w:r>
-        <w:lastRenderedPageBreak/>
         <w:t>Mistakes in manuscript</w:t>
       </w:r>
     </w:p>
@@ -6147,7 +6335,7 @@
       <w:r>
         <w:t xml:space="preserve">Mimics and inhibitors were used in previous studies </w:t>
       </w:r>
-      <w:hyperlink r:id="rId32" w:history="1">
+      <w:hyperlink r:id="rId34" w:history="1">
         <w:r>
           <w:rPr>
             <w:rStyle w:val="Hyperlink"/>
@@ -6193,7 +6381,7 @@
       <w:r>
         <w:t xml:space="preserve">Anticorrelated, integrated matched miRNA-mRNA data </w:t>
       </w:r>
-      <w:hyperlink r:id="rId33" w:history="1">
+      <w:hyperlink r:id="rId35" w:history="1">
         <w:r>
           <w:rPr>
             <w:rStyle w:val="Hyperlink"/>
@@ -6259,7 +6447,9 @@
         <w:ind w:left="720"/>
       </w:pPr>
       <w:r>
-        <w:lastRenderedPageBreak/>
+        <w:rPr>
+          <w:noProof/>
+        </w:rPr>
         <w:drawing>
           <wp:inline distT="0" distB="0" distL="0" distR="0" wp14:anchorId="7830F8BA" wp14:editId="09C2FAA0">
             <wp:extent cx="2444435" cy="2061493"/>
@@ -6276,7 +6466,7 @@
                     <pic:cNvPicPr/>
                   </pic:nvPicPr>
                   <pic:blipFill>
-                    <a:blip r:embed="rId34"/>
+                    <a:blip r:embed="rId36"/>
                     <a:stretch>
                       <a:fillRect/>
                     </a:stretch>
@@ -6324,6 +6514,9 @@
         <w:ind w:left="1080"/>
       </w:pPr>
       <w:r>
+        <w:rPr>
+          <w:noProof/>
+        </w:rPr>
         <w:drawing>
           <wp:inline distT="0" distB="0" distL="0" distR="0" wp14:anchorId="181573C4" wp14:editId="3F01C9F5">
             <wp:extent cx="2217779" cy="1870346"/>
@@ -6340,7 +6533,7 @@
                     <pic:cNvPicPr/>
                   </pic:nvPicPr>
                   <pic:blipFill>
-                    <a:blip r:embed="rId35"/>
+                    <a:blip r:embed="rId37"/>
                     <a:stretch>
                       <a:fillRect/>
                     </a:stretch>
@@ -6420,11 +6613,31 @@
       <w:r>
         <w:t xml:space="preserve"> interactions.</w:t>
       </w:r>
-    </w:p>
-    <w:p>
-      <w:r>
+      <w:r>
+        <w:t xml:space="preserve"> There were approx. </w:t>
+      </w:r>
+      <w:r>
+        <w:rPr>
+          <w:b/>
+          <w:bCs/>
+        </w:rPr>
+        <w:t xml:space="preserve">10k </w:t>
+      </w:r>
+      <w:r>
+        <w:t>t</w:t>
+      </w:r>
+      <w:r>
+        <w:t>argets initially identified for this in R.</w:t>
+      </w:r>
+    </w:p>
+    <w:p>
+      <w:r>
+        <w:rPr>
+          <w:noProof/>
+        </w:rPr>
+        <w:lastRenderedPageBreak/>
         <w:drawing>
-          <wp:inline distT="0" distB="0" distL="0" distR="0" wp14:anchorId="04F8DAAD" wp14:editId="51F928E5">
+          <wp:inline distT="0" distB="0" distL="0" distR="0" wp14:anchorId="44674F8B" wp14:editId="4A635379">
             <wp:extent cx="5731510" cy="813435"/>
             <wp:effectExtent l="0" t="0" r="0" b="0"/>
             <wp:docPr id="572577123" name="Picture 1"/>
@@ -6439,7 +6652,7 @@
                     <pic:cNvPicPr/>
                   </pic:nvPicPr>
                   <pic:blipFill>
-                    <a:blip r:embed="rId36"/>
+                    <a:blip r:embed="rId38"/>
                     <a:stretch>
                       <a:fillRect/>
                     </a:stretch>
@@ -6471,8 +6684,11 @@
     </w:p>
     <w:p>
       <w:r>
+        <w:rPr>
+          <w:noProof/>
+        </w:rPr>
         <w:drawing>
-          <wp:inline distT="0" distB="0" distL="0" distR="0" wp14:anchorId="45435B25" wp14:editId="18AF9951">
+          <wp:inline distT="0" distB="0" distL="0" distR="0" wp14:anchorId="5F8629D6" wp14:editId="38FFF1A0">
             <wp:extent cx="5731510" cy="813435"/>
             <wp:effectExtent l="0" t="0" r="0" b="0"/>
             <wp:docPr id="927945646" name="Picture 1"/>
@@ -6487,7 +6703,7 @@
                     <pic:cNvPicPr/>
                   </pic:nvPicPr>
                   <pic:blipFill>
-                    <a:blip r:embed="rId37"/>
+                    <a:blip r:embed="rId39"/>
                     <a:stretch>
                       <a:fillRect/>
                     </a:stretch>
@@ -6515,6 +6731,40 @@
       </w:r>
       <w:r>
         <w:t xml:space="preserve"> after filtering</w:t>
+      </w:r>
+    </w:p>
+    <w:p>
+      <w:pPr>
+        <w:pStyle w:val="ListParagraph"/>
+        <w:numPr>
+          <w:ilvl w:val="0"/>
+          <w:numId w:val="3"/>
+        </w:numPr>
+      </w:pPr>
+      <w:r>
+        <w:t xml:space="preserve">Threshold of </w:t>
+      </w:r>
+      <w:r>
+        <w:t>|</w:t>
+      </w:r>
+      <w:proofErr w:type="spellStart"/>
+      <w:r>
+        <w:t>logFC</w:t>
+      </w:r>
+      <w:proofErr w:type="spellEnd"/>
+      <w:r>
+        <w:t>|</w:t>
+      </w:r>
+      <w:r>
+        <w:t xml:space="preserve"> &gt; 1 was applied as miRNA expression is known to not change much and still have big effects which may be supported that most DE miRNAs had a </w:t>
+      </w:r>
+      <w:proofErr w:type="spellStart"/>
+      <w:r>
+        <w:t>logFC</w:t>
+      </w:r>
+      <w:proofErr w:type="spellEnd"/>
+      <w:r>
+        <w:t xml:space="preserve"> change of less than 2.5 in the MA plot. I found some papers using 1-1.5 as their threshold, and I wanted to apply a threshold. This only excluded one miRNA that was just below 1.</w:t>
       </w:r>
     </w:p>
     <w:p>
@@ -8788,7 +9038,7 @@
         <w:rFonts w:ascii="Symbol" w:hAnsi="Symbol" w:hint="default"/>
       </w:rPr>
     </w:lvl>
-    <w:lvl w:ilvl="1" w:tplc="08090003" w:tentative="1">
+    <w:lvl w:ilvl="1" w:tplc="08090003">
       <w:start w:val="1"/>
       <w:numFmt w:val="bullet"/>
       <w:lvlText w:val="o"/>

</xml_diff>